<commit_message>
Write full academic chapters and add the official PUA header
Expand Chapters 1-7 to thesis length with the locked results and
real Vancouver sources only. Put the pua.edu.eg wordmark in the
Word header on every page except the two protocol covers, and
align contents, tables and abbreviations on A4.

Co-authored-by: Ahmed El Gamry <ahmed733676-droid@users.noreply.github.com>
</commit_message>
<xml_diff>
--- a/Thesis_Complete.docx
+++ b/Thesis_Complete.docx
@@ -27,7 +27,7 @@
                     <pic:cNvPicPr/>
                   </pic:nvPicPr>
                   <pic:blipFill>
-                    <a:blip r:embed="rId10"/>
+                    <a:blip r:embed="rId15"/>
                     <a:stretch>
                       <a:fillRect/>
                     </a:stretch>
@@ -72,7 +72,7 @@
                     <pic:cNvPicPr/>
                   </pic:nvPicPr>
                   <pic:blipFill>
-                    <a:blip r:embed="rId11"/>
+                    <a:blip r:embed="rId16"/>
                     <a:stretch>
                       <a:fillRect/>
                     </a:stretch>
@@ -94,11 +94,15 @@
     <w:p>
       <w:pPr>
         <w:sectPr>
-          <w:footerReference w:type="default" r:id="rId9"/>
+          <w:headerReference w:type="default" r:id="rId9"/>
+          <w:headerReference w:type="first" r:id="rId10"/>
+          <w:headerReference w:type="even" r:id="rId11"/>
+          <w:footerReference w:type="default" r:id="rId12"/>
+          <w:footerReference w:type="first" r:id="rId13"/>
+          <w:footerReference w:type="even" r:id="rId14"/>
           <w:pgSz w:w="11906" w:h="16838"/>
           <w:pgMar w:top="0" w:right="0" w:bottom="0" w:left="0" w:header="0" w:footer="0" w:gutter="0"/>
           <w:cols w:space="720"/>
-          <w:titlePg/>
           <w:docGrid w:linePitch="360"/>
         </w:sectPr>
       </w:pPr>
@@ -874,7 +878,7 @@
         <w:pageBreakBefore w:val="0"/>
         <w:widowControl/>
         <w:tabs>
-          <w:tab w:pos="7937" w:val="right" w:leader="dot"/>
+          <w:tab w:pos="8787" w:val="right" w:leader="dot"/>
         </w:tabs>
         <w:spacing w:before="0" w:after="0" w:line="480" w:lineRule="auto"/>
         <w:ind w:firstLine="0" w:left="0"/>
@@ -899,7 +903,7 @@
         <w:pageBreakBefore w:val="0"/>
         <w:widowControl/>
         <w:tabs>
-          <w:tab w:pos="7937" w:val="right" w:leader="dot"/>
+          <w:tab w:pos="8787" w:val="right" w:leader="dot"/>
         </w:tabs>
         <w:spacing w:before="0" w:after="0" w:line="480" w:lineRule="auto"/>
         <w:ind w:firstLine="0" w:left="0"/>
@@ -924,7 +928,7 @@
         <w:pageBreakBefore w:val="0"/>
         <w:widowControl/>
         <w:tabs>
-          <w:tab w:pos="7937" w:val="right" w:leader="dot"/>
+          <w:tab w:pos="8787" w:val="right" w:leader="dot"/>
         </w:tabs>
         <w:spacing w:before="0" w:after="0" w:line="480" w:lineRule="auto"/>
         <w:ind w:firstLine="0" w:left="0"/>
@@ -949,7 +953,7 @@
         <w:pageBreakBefore w:val="0"/>
         <w:widowControl/>
         <w:tabs>
-          <w:tab w:pos="7937" w:val="right" w:leader="dot"/>
+          <w:tab w:pos="8787" w:val="right" w:leader="dot"/>
         </w:tabs>
         <w:spacing w:before="0" w:after="0" w:line="480" w:lineRule="auto"/>
         <w:ind w:firstLine="0" w:left="0"/>
@@ -974,7 +978,7 @@
         <w:pageBreakBefore w:val="0"/>
         <w:widowControl/>
         <w:tabs>
-          <w:tab w:pos="7937" w:val="right" w:leader="dot"/>
+          <w:tab w:pos="8787" w:val="right" w:leader="dot"/>
         </w:tabs>
         <w:spacing w:before="0" w:after="0" w:line="480" w:lineRule="auto"/>
         <w:ind w:firstLine="0" w:left="0"/>
@@ -999,7 +1003,7 @@
         <w:pageBreakBefore w:val="0"/>
         <w:widowControl/>
         <w:tabs>
-          <w:tab w:pos="7937" w:val="right" w:leader="dot"/>
+          <w:tab w:pos="8787" w:val="right" w:leader="dot"/>
         </w:tabs>
         <w:spacing w:before="0" w:after="0" w:line="480" w:lineRule="auto"/>
         <w:ind w:firstLine="0" w:left="0"/>
@@ -1015,7 +1019,7 @@
         </w:rPr>
         <w:t>Arabic Abstract</w:t>
         <w:tab/>
-        <w:t>vi</w:t>
+        <w:t>vii</w:t>
       </w:r>
     </w:p>
     <w:p>
@@ -1024,7 +1028,7 @@
         <w:pageBreakBefore w:val="0"/>
         <w:widowControl/>
         <w:tabs>
-          <w:tab w:pos="7937" w:val="right" w:leader="dot"/>
+          <w:tab w:pos="8787" w:val="right" w:leader="dot"/>
         </w:tabs>
         <w:spacing w:before="0" w:after="0" w:line="480" w:lineRule="auto"/>
         <w:ind w:firstLine="0" w:left="0"/>
@@ -1040,7 +1044,7 @@
         </w:rPr>
         <w:t>Contents</w:t>
         <w:tab/>
-        <w:t>vii</w:t>
+        <w:t>ix</w:t>
       </w:r>
     </w:p>
     <w:p>
@@ -1049,7 +1053,7 @@
         <w:pageBreakBefore w:val="0"/>
         <w:widowControl/>
         <w:tabs>
-          <w:tab w:pos="7937" w:val="right" w:leader="dot"/>
+          <w:tab w:pos="8787" w:val="right" w:leader="dot"/>
         </w:tabs>
         <w:spacing w:before="0" w:after="0" w:line="480" w:lineRule="auto"/>
         <w:ind w:firstLine="0" w:left="0"/>
@@ -1065,7 +1069,7 @@
         </w:rPr>
         <w:t>List of Tables</w:t>
         <w:tab/>
-        <w:t>ix</w:t>
+        <w:t>xii</w:t>
       </w:r>
     </w:p>
     <w:p>
@@ -1074,7 +1078,7 @@
         <w:pageBreakBefore w:val="0"/>
         <w:widowControl/>
         <w:tabs>
-          <w:tab w:pos="7937" w:val="right" w:leader="dot"/>
+          <w:tab w:pos="8787" w:val="right" w:leader="dot"/>
         </w:tabs>
         <w:spacing w:before="0" w:after="0" w:line="480" w:lineRule="auto"/>
         <w:ind w:firstLine="0" w:left="0"/>
@@ -1090,7 +1094,7 @@
         </w:rPr>
         <w:t>List of Abbreviations</w:t>
         <w:tab/>
-        <w:t>x</w:t>
+        <w:t>xiii</w:t>
       </w:r>
     </w:p>
     <w:p>
@@ -1099,7 +1103,7 @@
         <w:pageBreakBefore w:val="0"/>
         <w:widowControl/>
         <w:tabs>
-          <w:tab w:pos="7937" w:val="right" w:leader="dot"/>
+          <w:tab w:pos="8787" w:val="right" w:leader="dot"/>
         </w:tabs>
         <w:spacing w:before="0" w:after="0" w:line="480" w:lineRule="auto"/>
         <w:ind w:firstLine="0" w:left="0"/>
@@ -1124,7 +1128,7 @@
         <w:pageBreakBefore w:val="0"/>
         <w:widowControl/>
         <w:tabs>
-          <w:tab w:pos="7937" w:val="right" w:leader="dot"/>
+          <w:tab w:pos="8787" w:val="right" w:leader="dot"/>
         </w:tabs>
         <w:spacing w:before="0" w:after="0" w:line="480" w:lineRule="auto"/>
         <w:ind w:firstLine="0" w:left="567"/>
@@ -1140,7 +1144,7 @@
         </w:rPr>
         <w:t>1.1 Aim of the Study</w:t>
         <w:tab/>
-        <w:t>2</w:t>
+        <w:t>3</w:t>
       </w:r>
     </w:p>
     <w:p>
@@ -1149,7 +1153,7 @@
         <w:pageBreakBefore w:val="0"/>
         <w:widowControl/>
         <w:tabs>
-          <w:tab w:pos="7937" w:val="right" w:leader="dot"/>
+          <w:tab w:pos="8787" w:val="right" w:leader="dot"/>
         </w:tabs>
         <w:spacing w:before="0" w:after="0" w:line="480" w:lineRule="auto"/>
         <w:ind w:firstLine="0" w:left="567"/>
@@ -1165,7 +1169,7 @@
         </w:rPr>
         <w:t>1.2 Objectives</w:t>
         <w:tab/>
-        <w:t>2</w:t>
+        <w:t>3</w:t>
       </w:r>
     </w:p>
     <w:p>
@@ -1174,7 +1178,7 @@
         <w:pageBreakBefore w:val="0"/>
         <w:widowControl/>
         <w:tabs>
-          <w:tab w:pos="7937" w:val="right" w:leader="dot"/>
+          <w:tab w:pos="8787" w:val="right" w:leader="dot"/>
         </w:tabs>
         <w:spacing w:before="0" w:after="0" w:line="480" w:lineRule="auto"/>
         <w:ind w:firstLine="0" w:left="567"/>
@@ -1190,7 +1194,7 @@
         </w:rPr>
         <w:t>1.3 Null Hypotheses</w:t>
         <w:tab/>
-        <w:t>2</w:t>
+        <w:t>3</w:t>
       </w:r>
     </w:p>
     <w:p>
@@ -1199,7 +1203,7 @@
         <w:pageBreakBefore w:val="0"/>
         <w:widowControl/>
         <w:tabs>
-          <w:tab w:pos="7937" w:val="right" w:leader="dot"/>
+          <w:tab w:pos="8787" w:val="right" w:leader="dot"/>
         </w:tabs>
         <w:spacing w:before="0" w:after="0" w:line="480" w:lineRule="auto"/>
         <w:ind w:firstLine="0" w:left="0"/>
@@ -1215,7 +1219,7 @@
         </w:rPr>
         <w:t>CHAPTER 2  Review of Literature</w:t>
         <w:tab/>
-        <w:t>3</w:t>
+        <w:t>4</w:t>
       </w:r>
     </w:p>
     <w:p>
@@ -1224,7 +1228,7 @@
         <w:pageBreakBefore w:val="0"/>
         <w:widowControl/>
         <w:tabs>
-          <w:tab w:pos="7937" w:val="right" w:leader="dot"/>
+          <w:tab w:pos="8787" w:val="right" w:leader="dot"/>
         </w:tabs>
         <w:spacing w:before="0" w:after="0" w:line="480" w:lineRule="auto"/>
         <w:ind w:firstLine="0" w:left="567"/>
@@ -1240,7 +1244,7 @@
         </w:rPr>
         <w:t>2.1 Wear of Restorative Resins</w:t>
         <w:tab/>
-        <w:t>3</w:t>
+        <w:t>4</w:t>
       </w:r>
     </w:p>
     <w:p>
@@ -1249,7 +1253,7 @@
         <w:pageBreakBefore w:val="0"/>
         <w:widowControl/>
         <w:tabs>
-          <w:tab w:pos="7937" w:val="right" w:leader="dot"/>
+          <w:tab w:pos="8787" w:val="right" w:leader="dot"/>
         </w:tabs>
         <w:spacing w:before="0" w:after="0" w:line="480" w:lineRule="auto"/>
         <w:ind w:firstLine="0" w:left="567"/>
@@ -1265,7 +1269,7 @@
         </w:rPr>
         <w:t>2.2 Surface Roughness</w:t>
         <w:tab/>
-        <w:t>4</w:t>
+        <w:t>5</w:t>
       </w:r>
     </w:p>
     <w:p>
@@ -1274,7 +1278,7 @@
         <w:pageBreakBefore w:val="0"/>
         <w:widowControl/>
         <w:tabs>
-          <w:tab w:pos="7937" w:val="right" w:leader="dot"/>
+          <w:tab w:pos="8787" w:val="right" w:leader="dot"/>
         </w:tabs>
         <w:spacing w:before="0" w:after="0" w:line="480" w:lineRule="auto"/>
         <w:ind w:firstLine="0" w:left="567"/>
@@ -1288,9 +1292,9 @@
           <w:color w:val="000000"/>
           <w:sz w:val="24"/>
         </w:rPr>
-        <w:t>2.3 Injectable Composite Resins</w:t>
+        <w:t>2.3 Filler Size and Toothbrush Abrasion</w:t>
         <w:tab/>
-        <w:t>5</w:t>
+        <w:t>6</w:t>
       </w:r>
     </w:p>
     <w:p>
@@ -1299,7 +1303,7 @@
         <w:pageBreakBefore w:val="0"/>
         <w:widowControl/>
         <w:tabs>
-          <w:tab w:pos="7937" w:val="right" w:leader="dot"/>
+          <w:tab w:pos="8787" w:val="right" w:leader="dot"/>
         </w:tabs>
         <w:spacing w:before="0" w:after="0" w:line="480" w:lineRule="auto"/>
         <w:ind w:firstLine="0" w:left="567"/>
@@ -1313,9 +1317,9 @@
           <w:color w:val="000000"/>
           <w:sz w:val="24"/>
         </w:rPr>
-        <w:t>2.4 Conventional Nanohybrid Resins and Giomers</w:t>
+        <w:t>2.4 Injectable Composite Resins</w:t>
         <w:tab/>
-        <w:t>6</w:t>
+        <w:t>7</w:t>
       </w:r>
     </w:p>
     <w:p>
@@ -1324,7 +1328,7 @@
         <w:pageBreakBefore w:val="0"/>
         <w:widowControl/>
         <w:tabs>
-          <w:tab w:pos="7937" w:val="right" w:leader="dot"/>
+          <w:tab w:pos="8787" w:val="right" w:leader="dot"/>
         </w:tabs>
         <w:spacing w:before="0" w:after="0" w:line="480" w:lineRule="auto"/>
         <w:ind w:firstLine="0" w:left="567"/>
@@ -1338,9 +1342,9 @@
           <w:color w:val="000000"/>
           <w:sz w:val="24"/>
         </w:rPr>
-        <w:t>2.5 Statement of the Problem</w:t>
+        <w:t>2.5 Conventional Nanohybrid Resins and Giomers</w:t>
         <w:tab/>
-        <w:t>6</w:t>
+        <w:t>8</w:t>
       </w:r>
     </w:p>
     <w:p>
@@ -1349,7 +1353,32 @@
         <w:pageBreakBefore w:val="0"/>
         <w:widowControl/>
         <w:tabs>
-          <w:tab w:pos="7937" w:val="right" w:leader="dot"/>
+          <w:tab w:pos="8787" w:val="right" w:leader="dot"/>
+        </w:tabs>
+        <w:spacing w:before="0" w:after="0" w:line="480" w:lineRule="auto"/>
+        <w:ind w:firstLine="0" w:left="567"/>
+        <w:jc w:val="left"/>
+      </w:pPr>
+      <w:r>
+        <w:rPr>
+          <w:rFonts w:ascii="Times New Roman" w:hAnsi="Times New Roman" w:eastAsia="Times New Roman"/>
+          <w:b w:val="0"/>
+          <w:i w:val="0"/>
+          <w:color w:val="000000"/>
+          <w:sz w:val="24"/>
+        </w:rPr>
+        <w:t>2.6 Statement of the Problem</w:t>
+        <w:tab/>
+        <w:t>9</w:t>
+      </w:r>
+    </w:p>
+    <w:p>
+      <w:pPr>
+        <w:keepNext w:val="0"/>
+        <w:pageBreakBefore w:val="0"/>
+        <w:widowControl/>
+        <w:tabs>
+          <w:tab w:pos="8787" w:val="right" w:leader="dot"/>
         </w:tabs>
         <w:spacing w:before="0" w:after="0" w:line="480" w:lineRule="auto"/>
         <w:ind w:firstLine="0" w:left="0"/>
@@ -1365,7 +1394,7 @@
         </w:rPr>
         <w:t>CHAPTER 3  Materials and Methods</w:t>
         <w:tab/>
-        <w:t>7</w:t>
+        <w:t>10</w:t>
       </w:r>
     </w:p>
     <w:p>
@@ -1374,7 +1403,7 @@
         <w:pageBreakBefore w:val="0"/>
         <w:widowControl/>
         <w:tabs>
-          <w:tab w:pos="7937" w:val="right" w:leader="dot"/>
+          <w:tab w:pos="8787" w:val="right" w:leader="dot"/>
         </w:tabs>
         <w:spacing w:before="0" w:after="0" w:line="480" w:lineRule="auto"/>
         <w:ind w:firstLine="0" w:left="567"/>
@@ -1390,7 +1419,7 @@
         </w:rPr>
         <w:t>3.1 Study Design and Setting</w:t>
         <w:tab/>
-        <w:t>7</w:t>
+        <w:t>10</w:t>
       </w:r>
     </w:p>
     <w:p>
@@ -1399,7 +1428,7 @@
         <w:pageBreakBefore w:val="0"/>
         <w:widowControl/>
         <w:tabs>
-          <w:tab w:pos="7937" w:val="right" w:leader="dot"/>
+          <w:tab w:pos="8787" w:val="right" w:leader="dot"/>
         </w:tabs>
         <w:spacing w:before="0" w:after="0" w:line="480" w:lineRule="auto"/>
         <w:ind w:firstLine="0" w:left="567"/>
@@ -1415,7 +1444,7 @@
         </w:rPr>
         <w:t>3.2 Sample Size</w:t>
         <w:tab/>
-        <w:t>7</w:t>
+        <w:t>10</w:t>
       </w:r>
     </w:p>
     <w:p>
@@ -1424,7 +1453,7 @@
         <w:pageBreakBefore w:val="0"/>
         <w:widowControl/>
         <w:tabs>
-          <w:tab w:pos="7937" w:val="right" w:leader="dot"/>
+          <w:tab w:pos="8787" w:val="right" w:leader="dot"/>
         </w:tabs>
         <w:spacing w:before="0" w:after="0" w:line="480" w:lineRule="auto"/>
         <w:ind w:firstLine="0" w:left="567"/>
@@ -1440,7 +1469,7 @@
         </w:rPr>
         <w:t>3.3 Materials</w:t>
         <w:tab/>
-        <w:t>8</w:t>
+        <w:t>11</w:t>
       </w:r>
     </w:p>
     <w:p>
@@ -1449,7 +1478,7 @@
         <w:pageBreakBefore w:val="0"/>
         <w:widowControl/>
         <w:tabs>
-          <w:tab w:pos="7937" w:val="right" w:leader="dot"/>
+          <w:tab w:pos="8787" w:val="right" w:leader="dot"/>
         </w:tabs>
         <w:spacing w:before="0" w:after="0" w:line="480" w:lineRule="auto"/>
         <w:ind w:firstLine="0" w:left="567"/>
@@ -1465,7 +1494,7 @@
         </w:rPr>
         <w:t>3.4 Equipment</w:t>
         <w:tab/>
-        <w:t>8</w:t>
+        <w:t>12</w:t>
       </w:r>
     </w:p>
     <w:p>
@@ -1474,7 +1503,7 @@
         <w:pageBreakBefore w:val="0"/>
         <w:widowControl/>
         <w:tabs>
-          <w:tab w:pos="7937" w:val="right" w:leader="dot"/>
+          <w:tab w:pos="8787" w:val="right" w:leader="dot"/>
         </w:tabs>
         <w:spacing w:before="0" w:after="0" w:line="480" w:lineRule="auto"/>
         <w:ind w:firstLine="0" w:left="567"/>
@@ -1490,7 +1519,7 @@
         </w:rPr>
         <w:t>3.5 Specimen Preparation</w:t>
         <w:tab/>
-        <w:t>9</w:t>
+        <w:t>12</w:t>
       </w:r>
     </w:p>
     <w:p>
@@ -1499,7 +1528,7 @@
         <w:pageBreakBefore w:val="0"/>
         <w:widowControl/>
         <w:tabs>
-          <w:tab w:pos="7937" w:val="right" w:leader="dot"/>
+          <w:tab w:pos="8787" w:val="right" w:leader="dot"/>
         </w:tabs>
         <w:spacing w:before="0" w:after="0" w:line="480" w:lineRule="auto"/>
         <w:ind w:firstLine="0" w:left="567"/>
@@ -1515,7 +1544,7 @@
         </w:rPr>
         <w:t>3.6 Baseline Measurements</w:t>
         <w:tab/>
-        <w:t>9</w:t>
+        <w:t>13</w:t>
       </w:r>
     </w:p>
     <w:p>
@@ -1524,7 +1553,7 @@
         <w:pageBreakBefore w:val="0"/>
         <w:widowControl/>
         <w:tabs>
-          <w:tab w:pos="7937" w:val="right" w:leader="dot"/>
+          <w:tab w:pos="8787" w:val="right" w:leader="dot"/>
         </w:tabs>
         <w:spacing w:before="0" w:after="0" w:line="480" w:lineRule="auto"/>
         <w:ind w:firstLine="0" w:left="567"/>
@@ -1540,7 +1569,7 @@
         </w:rPr>
         <w:t>3.7 Toothbrushing Protocol</w:t>
         <w:tab/>
-        <w:t>9</w:t>
+        <w:t>13</w:t>
       </w:r>
     </w:p>
     <w:p>
@@ -1549,7 +1578,7 @@
         <w:pageBreakBefore w:val="0"/>
         <w:widowControl/>
         <w:tabs>
-          <w:tab w:pos="7937" w:val="right" w:leader="dot"/>
+          <w:tab w:pos="8787" w:val="right" w:leader="dot"/>
         </w:tabs>
         <w:spacing w:before="0" w:after="0" w:line="480" w:lineRule="auto"/>
         <w:ind w:firstLine="0" w:left="567"/>
@@ -1565,7 +1594,7 @@
         </w:rPr>
         <w:t>3.8 Post-test Evaluation</w:t>
         <w:tab/>
-        <w:t>10</w:t>
+        <w:t>14</w:t>
       </w:r>
     </w:p>
     <w:p>
@@ -1574,7 +1603,7 @@
         <w:pageBreakBefore w:val="0"/>
         <w:widowControl/>
         <w:tabs>
-          <w:tab w:pos="7937" w:val="right" w:leader="dot"/>
+          <w:tab w:pos="8787" w:val="right" w:leader="dot"/>
         </w:tabs>
         <w:spacing w:before="0" w:after="0" w:line="480" w:lineRule="auto"/>
         <w:ind w:firstLine="0" w:left="567"/>
@@ -1590,7 +1619,7 @@
         </w:rPr>
         <w:t>3.9 Statistical Analysis</w:t>
         <w:tab/>
-        <w:t>10</w:t>
+        <w:t>14</w:t>
       </w:r>
     </w:p>
     <w:p>
@@ -1599,7 +1628,7 @@
         <w:pageBreakBefore w:val="0"/>
         <w:widowControl/>
         <w:tabs>
-          <w:tab w:pos="7937" w:val="right" w:leader="dot"/>
+          <w:tab w:pos="8787" w:val="right" w:leader="dot"/>
         </w:tabs>
         <w:spacing w:before="0" w:after="0" w:line="480" w:lineRule="auto"/>
         <w:ind w:firstLine="0" w:left="567"/>
@@ -1615,7 +1644,7 @@
         </w:rPr>
         <w:t>3.10 Ethical Considerations</w:t>
         <w:tab/>
-        <w:t>10</w:t>
+        <w:t>14</w:t>
       </w:r>
     </w:p>
     <w:p>
@@ -1624,7 +1653,7 @@
         <w:pageBreakBefore w:val="0"/>
         <w:widowControl/>
         <w:tabs>
-          <w:tab w:pos="7937" w:val="right" w:leader="dot"/>
+          <w:tab w:pos="8787" w:val="right" w:leader="dot"/>
         </w:tabs>
         <w:spacing w:before="0" w:after="0" w:line="480" w:lineRule="auto"/>
         <w:ind w:firstLine="0" w:left="0"/>
@@ -1640,7 +1669,7 @@
         </w:rPr>
         <w:t>CHAPTER 4  Results</w:t>
         <w:tab/>
-        <w:t>11</w:t>
+        <w:t>15</w:t>
       </w:r>
     </w:p>
     <w:p>
@@ -1649,7 +1678,7 @@
         <w:pageBreakBefore w:val="0"/>
         <w:widowControl/>
         <w:tabs>
-          <w:tab w:pos="7937" w:val="right" w:leader="dot"/>
+          <w:tab w:pos="8787" w:val="right" w:leader="dot"/>
         </w:tabs>
         <w:spacing w:before="0" w:after="0" w:line="480" w:lineRule="auto"/>
         <w:ind w:firstLine="0" w:left="567"/>
@@ -1665,7 +1694,7 @@
         </w:rPr>
         <w:t>4.1 Weight Loss</w:t>
         <w:tab/>
-        <w:t>11</w:t>
+        <w:t>15</w:t>
       </w:r>
     </w:p>
     <w:p>
@@ -1674,7 +1703,7 @@
         <w:pageBreakBefore w:val="0"/>
         <w:widowControl/>
         <w:tabs>
-          <w:tab w:pos="7937" w:val="right" w:leader="dot"/>
+          <w:tab w:pos="8787" w:val="right" w:leader="dot"/>
         </w:tabs>
         <w:spacing w:before="0" w:after="0" w:line="480" w:lineRule="auto"/>
         <w:ind w:firstLine="0" w:left="567"/>
@@ -1690,7 +1719,7 @@
         </w:rPr>
         <w:t>4.2 Surface Roughness</w:t>
         <w:tab/>
-        <w:t>12</w:t>
+        <w:t>16</w:t>
       </w:r>
     </w:p>
     <w:p>
@@ -1699,7 +1728,7 @@
         <w:pageBreakBefore w:val="0"/>
         <w:widowControl/>
         <w:tabs>
-          <w:tab w:pos="7937" w:val="right" w:leader="dot"/>
+          <w:tab w:pos="8787" w:val="right" w:leader="dot"/>
         </w:tabs>
         <w:spacing w:before="0" w:after="0" w:line="480" w:lineRule="auto"/>
         <w:ind w:firstLine="0" w:left="567"/>
@@ -1715,7 +1744,7 @@
         </w:rPr>
         <w:t>4.3 Summary of Results</w:t>
         <w:tab/>
-        <w:t>14</w:t>
+        <w:t>18</w:t>
       </w:r>
     </w:p>
     <w:p>
@@ -1724,7 +1753,7 @@
         <w:pageBreakBefore w:val="0"/>
         <w:widowControl/>
         <w:tabs>
-          <w:tab w:pos="7937" w:val="right" w:leader="dot"/>
+          <w:tab w:pos="8787" w:val="right" w:leader="dot"/>
         </w:tabs>
         <w:spacing w:before="0" w:after="0" w:line="480" w:lineRule="auto"/>
         <w:ind w:firstLine="0" w:left="0"/>
@@ -1740,7 +1769,7 @@
         </w:rPr>
         <w:t>CHAPTER 5  Discussion</w:t>
         <w:tab/>
-        <w:t>15</w:t>
+        <w:t>19</w:t>
       </w:r>
     </w:p>
     <w:p>
@@ -1749,7 +1778,7 @@
         <w:pageBreakBefore w:val="0"/>
         <w:widowControl/>
         <w:tabs>
-          <w:tab w:pos="7937" w:val="right" w:leader="dot"/>
+          <w:tab w:pos="8787" w:val="right" w:leader="dot"/>
         </w:tabs>
         <w:spacing w:before="0" w:after="0" w:line="480" w:lineRule="auto"/>
         <w:ind w:firstLine="0" w:left="567"/>
@@ -1765,7 +1794,7 @@
         </w:rPr>
         <w:t>5.1 Weight Loss</w:t>
         <w:tab/>
-        <w:t>15</w:t>
+        <w:t>19</w:t>
       </w:r>
     </w:p>
     <w:p>
@@ -1774,7 +1803,7 @@
         <w:pageBreakBefore w:val="0"/>
         <w:widowControl/>
         <w:tabs>
-          <w:tab w:pos="7937" w:val="right" w:leader="dot"/>
+          <w:tab w:pos="8787" w:val="right" w:leader="dot"/>
         </w:tabs>
         <w:spacing w:before="0" w:after="0" w:line="480" w:lineRule="auto"/>
         <w:ind w:firstLine="0" w:left="567"/>
@@ -1790,7 +1819,7 @@
         </w:rPr>
         <w:t>5.2 Surface Roughness</w:t>
         <w:tab/>
-        <w:t>16</w:t>
+        <w:t>21</w:t>
       </w:r>
     </w:p>
     <w:p>
@@ -1799,7 +1828,7 @@
         <w:pageBreakBefore w:val="0"/>
         <w:widowControl/>
         <w:tabs>
-          <w:tab w:pos="7937" w:val="right" w:leader="dot"/>
+          <w:tab w:pos="8787" w:val="right" w:leader="dot"/>
         </w:tabs>
         <w:spacing w:before="0" w:after="0" w:line="480" w:lineRule="auto"/>
         <w:ind w:firstLine="0" w:left="567"/>
@@ -1815,7 +1844,7 @@
         </w:rPr>
         <w:t>5.3 Clinical Implications</w:t>
         <w:tab/>
-        <w:t>18</w:t>
+        <w:t>22</w:t>
       </w:r>
     </w:p>
     <w:p>
@@ -1824,7 +1853,7 @@
         <w:pageBreakBefore w:val="0"/>
         <w:widowControl/>
         <w:tabs>
-          <w:tab w:pos="7937" w:val="right" w:leader="dot"/>
+          <w:tab w:pos="8787" w:val="right" w:leader="dot"/>
         </w:tabs>
         <w:spacing w:before="0" w:after="0" w:line="480" w:lineRule="auto"/>
         <w:ind w:firstLine="0" w:left="567"/>
@@ -1840,7 +1869,7 @@
         </w:rPr>
         <w:t>5.4 Strengths of the Study</w:t>
         <w:tab/>
-        <w:t>18</w:t>
+        <w:t>23</w:t>
       </w:r>
     </w:p>
     <w:p>
@@ -1849,7 +1878,7 @@
         <w:pageBreakBefore w:val="0"/>
         <w:widowControl/>
         <w:tabs>
-          <w:tab w:pos="7937" w:val="right" w:leader="dot"/>
+          <w:tab w:pos="8787" w:val="right" w:leader="dot"/>
         </w:tabs>
         <w:spacing w:before="0" w:after="0" w:line="480" w:lineRule="auto"/>
         <w:ind w:firstLine="0" w:left="567"/>
@@ -1865,7 +1894,7 @@
         </w:rPr>
         <w:t>5.5 Limitations of the Study</w:t>
         <w:tab/>
-        <w:t>19</w:t>
+        <w:t>23</w:t>
       </w:r>
     </w:p>
     <w:p>
@@ -1874,7 +1903,7 @@
         <w:pageBreakBefore w:val="0"/>
         <w:widowControl/>
         <w:tabs>
-          <w:tab w:pos="7937" w:val="right" w:leader="dot"/>
+          <w:tab w:pos="8787" w:val="right" w:leader="dot"/>
         </w:tabs>
         <w:spacing w:before="0" w:after="0" w:line="480" w:lineRule="auto"/>
         <w:ind w:firstLine="0" w:left="567"/>
@@ -1890,7 +1919,7 @@
         </w:rPr>
         <w:t>5.6 Concluding Remarks</w:t>
         <w:tab/>
-        <w:t>19</w:t>
+        <w:t>24</w:t>
       </w:r>
     </w:p>
     <w:p>
@@ -1899,7 +1928,7 @@
         <w:pageBreakBefore w:val="0"/>
         <w:widowControl/>
         <w:tabs>
-          <w:tab w:pos="7937" w:val="right" w:leader="dot"/>
+          <w:tab w:pos="8787" w:val="right" w:leader="dot"/>
         </w:tabs>
         <w:spacing w:before="0" w:after="0" w:line="480" w:lineRule="auto"/>
         <w:ind w:firstLine="0" w:left="0"/>
@@ -1915,7 +1944,7 @@
         </w:rPr>
         <w:t>CHAPTER 6  Conclusions and Recommendations</w:t>
         <w:tab/>
-        <w:t>20</w:t>
+        <w:t>25</w:t>
       </w:r>
     </w:p>
     <w:p>
@@ -1924,7 +1953,7 @@
         <w:pageBreakBefore w:val="0"/>
         <w:widowControl/>
         <w:tabs>
-          <w:tab w:pos="7937" w:val="right" w:leader="dot"/>
+          <w:tab w:pos="8787" w:val="right" w:leader="dot"/>
         </w:tabs>
         <w:spacing w:before="0" w:after="0" w:line="480" w:lineRule="auto"/>
         <w:ind w:firstLine="0" w:left="567"/>
@@ -1940,7 +1969,7 @@
         </w:rPr>
         <w:t>6.1 Summary</w:t>
         <w:tab/>
-        <w:t>20</w:t>
+        <w:t>25</w:t>
       </w:r>
     </w:p>
     <w:p>
@@ -1949,7 +1978,7 @@
         <w:pageBreakBefore w:val="0"/>
         <w:widowControl/>
         <w:tabs>
-          <w:tab w:pos="7937" w:val="right" w:leader="dot"/>
+          <w:tab w:pos="8787" w:val="right" w:leader="dot"/>
         </w:tabs>
         <w:spacing w:before="0" w:after="0" w:line="480" w:lineRule="auto"/>
         <w:ind w:firstLine="0" w:left="567"/>
@@ -1965,7 +1994,7 @@
         </w:rPr>
         <w:t>6.2 Conclusions</w:t>
         <w:tab/>
-        <w:t>20</w:t>
+        <w:t>25</w:t>
       </w:r>
     </w:p>
     <w:p>
@@ -1974,7 +2003,7 @@
         <w:pageBreakBefore w:val="0"/>
         <w:widowControl/>
         <w:tabs>
-          <w:tab w:pos="7937" w:val="right" w:leader="dot"/>
+          <w:tab w:pos="8787" w:val="right" w:leader="dot"/>
         </w:tabs>
         <w:spacing w:before="0" w:after="0" w:line="480" w:lineRule="auto"/>
         <w:ind w:firstLine="0" w:left="567"/>
@@ -1990,7 +2019,7 @@
         </w:rPr>
         <w:t>6.3 Recommendations</w:t>
         <w:tab/>
-        <w:t>21</w:t>
+        <w:t>26</w:t>
       </w:r>
     </w:p>
     <w:p>
@@ -1999,7 +2028,7 @@
         <w:pageBreakBefore w:val="0"/>
         <w:widowControl/>
         <w:tabs>
-          <w:tab w:pos="7937" w:val="right" w:leader="dot"/>
+          <w:tab w:pos="8787" w:val="right" w:leader="dot"/>
         </w:tabs>
         <w:spacing w:before="0" w:after="0" w:line="480" w:lineRule="auto"/>
         <w:ind w:firstLine="0" w:left="0"/>
@@ -2015,7 +2044,7 @@
         </w:rPr>
         <w:t>CHAPTER 7  References</w:t>
         <w:tab/>
-        <w:t>22</w:t>
+        <w:t>27</w:t>
       </w:r>
     </w:p>
     <w:p>
@@ -2024,7 +2053,7 @@
         <w:pageBreakBefore w:val="0"/>
         <w:widowControl/>
         <w:tabs>
-          <w:tab w:pos="7937" w:val="right" w:leader="dot"/>
+          <w:tab w:pos="8787" w:val="right" w:leader="dot"/>
         </w:tabs>
         <w:spacing w:before="0" w:after="0" w:line="480" w:lineRule="auto"/>
         <w:ind w:firstLine="0" w:left="0"/>
@@ -2040,7 +2069,7 @@
         </w:rPr>
         <w:t>Arabic Summary</w:t>
         <w:tab/>
-        <w:t>24</w:t>
+        <w:t>30</w:t>
       </w:r>
     </w:p>
     <w:p>
@@ -2069,6 +2098,9 @@
         <w:keepNext w:val="0"/>
         <w:pageBreakBefore w:val="0"/>
         <w:widowControl/>
+        <w:tabs>
+          <w:tab w:pos="8787" w:val="right" w:leader="dot"/>
+        </w:tabs>
         <w:spacing w:before="0" w:after="0" w:line="480" w:lineRule="auto"/>
         <w:ind w:firstLine="0"/>
         <w:jc w:val="left"/>
@@ -2082,6 +2114,8 @@
           <w:sz w:val="24"/>
         </w:rPr>
         <w:t>Table 3.1  Brand, type, matrix, filler and load of the resin composites used in the study (protocol listing)</w:t>
+        <w:tab/>
+        <w:t>11</w:t>
       </w:r>
     </w:p>
     <w:p>
@@ -2089,6 +2123,9 @@
         <w:keepNext w:val="0"/>
         <w:pageBreakBefore w:val="0"/>
         <w:widowControl/>
+        <w:tabs>
+          <w:tab w:pos="8787" w:val="right" w:leader="dot"/>
+        </w:tabs>
         <w:spacing w:before="0" w:after="0" w:line="480" w:lineRule="auto"/>
         <w:ind w:firstLine="0"/>
         <w:jc w:val="left"/>
@@ -2102,6 +2139,8 @@
           <w:sz w:val="24"/>
         </w:rPr>
         <w:t>Table 4.1  Mean weight before and after simulated toothbrushing and percentage weight loss</w:t>
+        <w:tab/>
+        <w:t>15</w:t>
       </w:r>
     </w:p>
     <w:p>
@@ -2109,6 +2148,9 @@
         <w:keepNext w:val="0"/>
         <w:pageBreakBefore w:val="0"/>
         <w:widowControl/>
+        <w:tabs>
+          <w:tab w:pos="8787" w:val="right" w:leader="dot"/>
+        </w:tabs>
         <w:spacing w:before="0" w:after="0" w:line="480" w:lineRule="auto"/>
         <w:ind w:firstLine="0"/>
         <w:jc w:val="left"/>
@@ -2122,6 +2164,8 @@
           <w:sz w:val="24"/>
         </w:rPr>
         <w:t>Table 4.2  Mean surface roughness (Ra) before and after simulated toothbrushing and ΔRa</w:t>
+        <w:tab/>
+        <w:t>16</w:t>
       </w:r>
     </w:p>
     <w:p>
@@ -2129,6 +2173,9 @@
         <w:keepNext w:val="0"/>
         <w:pageBreakBefore w:val="0"/>
         <w:widowControl/>
+        <w:tabs>
+          <w:tab w:pos="8787" w:val="right" w:leader="dot"/>
+        </w:tabs>
         <w:spacing w:before="0" w:after="0" w:line="480" w:lineRule="auto"/>
         <w:ind w:firstLine="0"/>
         <w:jc w:val="left"/>
@@ -2142,6 +2189,8 @@
           <w:sz w:val="24"/>
         </w:rPr>
         <w:t>Table 4.3  Absolute weight loss after 10 000 brushing cycles</w:t>
+        <w:tab/>
+        <w:t>18</w:t>
       </w:r>
     </w:p>
     <w:p>
@@ -2170,6 +2219,9 @@
         <w:keepNext w:val="0"/>
         <w:pageBreakBefore w:val="0"/>
         <w:widowControl/>
+        <w:tabs>
+          <w:tab w:pos="1814" w:val="left"/>
+        </w:tabs>
         <w:spacing w:before="0" w:after="0" w:line="480" w:lineRule="auto"/>
         <w:ind w:firstLine="0"/>
         <w:jc w:val="left"/>
@@ -2192,7 +2244,8 @@
           <w:color w:val="000000"/>
           <w:sz w:val="24"/>
         </w:rPr>
-        <w:t xml:space="preserve">    Analysis of variance</w:t>
+        <w:tab/>
+        <w:t>Analysis of variance</w:t>
       </w:r>
     </w:p>
     <w:p>
@@ -2200,6 +2253,9 @@
         <w:keepNext w:val="0"/>
         <w:pageBreakBefore w:val="0"/>
         <w:widowControl/>
+        <w:tabs>
+          <w:tab w:pos="1814" w:val="left"/>
+        </w:tabs>
         <w:spacing w:before="0" w:after="0" w:line="480" w:lineRule="auto"/>
         <w:ind w:firstLine="0"/>
         <w:jc w:val="left"/>
@@ -2222,7 +2278,8 @@
           <w:color w:val="000000"/>
           <w:sz w:val="24"/>
         </w:rPr>
-        <w:t xml:space="preserve">    Computer-aided design / computer-aided manufacture</w:t>
+        <w:tab/>
+        <w:t>Computer-aided design / computer-aided manufacture</w:t>
       </w:r>
     </w:p>
     <w:p>
@@ -2230,6 +2287,9 @@
         <w:keepNext w:val="0"/>
         <w:pageBreakBefore w:val="0"/>
         <w:widowControl/>
+        <w:tabs>
+          <w:tab w:pos="1814" w:val="left"/>
+        </w:tabs>
         <w:spacing w:before="0" w:after="0" w:line="480" w:lineRule="auto"/>
         <w:ind w:firstLine="0"/>
         <w:jc w:val="left"/>
@@ -2252,7 +2312,8 @@
           <w:color w:val="000000"/>
           <w:sz w:val="24"/>
         </w:rPr>
-        <w:t xml:space="preserve">    International Organization for Standardization</w:t>
+        <w:tab/>
+        <w:t>International Organization for Standardization</w:t>
       </w:r>
     </w:p>
     <w:p>
@@ -2260,6 +2321,9 @@
         <w:keepNext w:val="0"/>
         <w:pageBreakBefore w:val="0"/>
         <w:widowControl/>
+        <w:tabs>
+          <w:tab w:pos="1814" w:val="left"/>
+        </w:tabs>
         <w:spacing w:before="0" w:after="0" w:line="480" w:lineRule="auto"/>
         <w:ind w:firstLine="0"/>
         <w:jc w:val="left"/>
@@ -2282,7 +2346,8 @@
           <w:color w:val="000000"/>
           <w:sz w:val="24"/>
         </w:rPr>
-        <w:t xml:space="preserve">    Light-emitting diode</w:t>
+        <w:tab/>
+        <w:t>Light-emitting diode</w:t>
       </w:r>
     </w:p>
     <w:p>
@@ -2290,6 +2355,9 @@
         <w:keepNext w:val="0"/>
         <w:pageBreakBefore w:val="0"/>
         <w:widowControl/>
+        <w:tabs>
+          <w:tab w:pos="1814" w:val="left"/>
+        </w:tabs>
         <w:spacing w:before="0" w:after="0" w:line="480" w:lineRule="auto"/>
         <w:ind w:firstLine="0"/>
         <w:jc w:val="left"/>
@@ -2312,7 +2380,8 @@
           <w:color w:val="000000"/>
           <w:sz w:val="24"/>
         </w:rPr>
-        <w:t xml:space="preserve">    Arithmetic mean roughness</w:t>
+        <w:tab/>
+        <w:t>Arithmetic mean roughness</w:t>
       </w:r>
     </w:p>
     <w:p>
@@ -2320,6 +2389,9 @@
         <w:keepNext w:val="0"/>
         <w:pageBreakBefore w:val="0"/>
         <w:widowControl/>
+        <w:tabs>
+          <w:tab w:pos="1814" w:val="left"/>
+        </w:tabs>
         <w:spacing w:before="0" w:after="0" w:line="480" w:lineRule="auto"/>
         <w:ind w:firstLine="0"/>
         <w:jc w:val="left"/>
@@ -2342,7 +2414,8 @@
           <w:color w:val="000000"/>
           <w:sz w:val="24"/>
         </w:rPr>
-        <w:t xml:space="preserve">    Relative dentine abrasivity</w:t>
+        <w:tab/>
+        <w:t>Relative dentine abrasivity</w:t>
       </w:r>
     </w:p>
     <w:p>
@@ -2350,6 +2423,9 @@
         <w:keepNext w:val="0"/>
         <w:pageBreakBefore w:val="0"/>
         <w:widowControl/>
+        <w:tabs>
+          <w:tab w:pos="1814" w:val="left"/>
+        </w:tabs>
         <w:spacing w:before="0" w:after="0" w:line="480" w:lineRule="auto"/>
         <w:ind w:firstLine="0"/>
         <w:jc w:val="left"/>
@@ -2372,7 +2448,8 @@
           <w:color w:val="000000"/>
           <w:sz w:val="24"/>
         </w:rPr>
-        <w:t xml:space="preserve">    Standard deviation</w:t>
+        <w:tab/>
+        <w:t>Standard deviation</w:t>
       </w:r>
     </w:p>
     <w:p>
@@ -2380,6 +2457,9 @@
         <w:keepNext w:val="0"/>
         <w:pageBreakBefore w:val="0"/>
         <w:widowControl/>
+        <w:tabs>
+          <w:tab w:pos="1814" w:val="left"/>
+        </w:tabs>
         <w:spacing w:before="0" w:after="0" w:line="480" w:lineRule="auto"/>
         <w:ind w:firstLine="0"/>
         <w:jc w:val="left"/>
@@ -2402,7 +2482,8 @@
           <w:color w:val="000000"/>
           <w:sz w:val="24"/>
         </w:rPr>
-        <w:t xml:space="preserve">    Surface pre-reacted glass-ionomer</w:t>
+        <w:tab/>
+        <w:t>Surface pre-reacted glass-ionomer</w:t>
       </w:r>
     </w:p>
     <w:p>
@@ -2410,6 +2491,9 @@
         <w:keepNext w:val="0"/>
         <w:pageBreakBefore w:val="0"/>
         <w:widowControl/>
+        <w:tabs>
+          <w:tab w:pos="1814" w:val="left"/>
+        </w:tabs>
         <w:spacing w:before="0" w:after="0" w:line="480" w:lineRule="auto"/>
         <w:ind w:firstLine="0"/>
         <w:jc w:val="left"/>
@@ -2432,17 +2516,22 @@
           <w:color w:val="000000"/>
           <w:sz w:val="24"/>
         </w:rPr>
-        <w:t xml:space="preserve">    Change in Ra (after − before)</w:t>
+        <w:tab/>
+        <w:t>Change in Ra (after − before)</w:t>
       </w:r>
     </w:p>
     <w:p>
       <w:pPr>
         <w:sectPr>
-          <w:footerReference w:type="default" r:id="rId12"/>
+          <w:headerReference w:type="default" r:id="rId17"/>
+          <w:headerReference w:type="first" r:id="rId18"/>
+          <w:headerReference w:type="even" r:id="rId19"/>
+          <w:footerReference w:type="default" r:id="rId20"/>
+          <w:footerReference w:type="first" r:id="rId21"/>
+          <w:footerReference w:type="even" r:id="rId22"/>
           <w:pgSz w:w="11906" w:h="16838"/>
-          <w:pgMar w:top="1417" w:right="1417" w:bottom="1417" w:left="1701" w:header="0" w:footer="0" w:gutter="0"/>
+          <w:pgMar w:top="2098" w:right="1417" w:bottom="1417" w:left="1701" w:header="227" w:footer="680" w:gutter="0"/>
           <w:cols w:space="720"/>
-          <w:titlePg/>
           <w:docGrid w:linePitch="360"/>
           <w:pgNumType w:fmt="lowerRoman" w:start="1"/>
         </w:sectPr>
@@ -2507,7 +2596,7 @@
           <w:color w:val="000000"/>
           <w:sz w:val="24"/>
         </w:rPr>
-        <w:t>Resin composites fail when the surface wears away or when what is left is rough. Wear flattens anatomy and can shorten the vertical dimension. Roughness holds plaque, takes stain and favours caries at the margin (1,2). Toothbrushing is a daily source of both. Dentifrice abrasive works as a third body. The resin-rich skin is removed first. Filler then stands proud or is pulled out. Mass falls. Ra rises (3,4).</w:t>
+        <w:t>Resin composites are the usual material for direct restorations because they can be matched to tooth colour and bonded to enamel and dentine (11,27). They still fail at the surface. Wear flattens anatomy and can shorten the vertical dimension. Roughness holds plaque, takes stain and favours caries at the margin (1,2,17). Those two surface changes run together. The resin-rich skin is removed first. Filler then stands proud or is pulled out. Mass falls. Ra rises (3,4,28).</w:t>
       </w:r>
     </w:p>
     <w:p>
@@ -2527,7 +2616,7 @@
           <w:color w:val="000000"/>
           <w:sz w:val="24"/>
         </w:rPr>
-        <w:t>On free surfaces of anterior restorations that wear is largely three-body. The brush and the paste sit between the bristle and the resin. Two-body contact wear is a different problem. It needs an antagonist and a much higher load. The two tests answer different questions (3,6,10).</w:t>
+        <w:t>Toothbrushing is a daily source of both. Dentifrice abrasive works as a third body between the bristle and the restoration (3,8,29). On free surfaces of anterior restorations that is the main wear mode. Two-body contact wear is a different problem. It needs an antagonist and a much higher load. The two tests answer different questions and cannot be substituted for each other (3,6,10,34).</w:t>
       </w:r>
     </w:p>
     <w:p>
@@ -2547,7 +2636,47 @@
           <w:color w:val="000000"/>
           <w:sz w:val="24"/>
         </w:rPr>
-        <w:t>Highly filled injectable resins were made so that a syringeable paste could be used in cavities that used to be reserved for packable composites. Filler load is raised, particle size is reduced, and silane treatment is improved until the paste still flows but no longer behaves like a classical low-filled flowable (5,6). G-ænial Universal Injectable (GC Corporation, Tokyo, Japan) and Beautifil Flow Plus X F00 (Shofu Inc., Kyoto, Japan) are sold on that claim. Beautifil II LS (Shofu Inc.) is a sculptable low-shrinkage nanohybrid giomer and is the conventional control in this work. All three were used in shade A2.</w:t>
+        <w:t>First-generation flowable resins were not written for load-bearing work. Filler load sat at about 40–55 wt%. Shrinkage was higher and wear was faster than in a packable hybrid (5,13). Highly filled injectable resins were made so that a syringeable paste could be used in cavities that used to be reserved for those packable composites. Filler load is raised, particle size is reduced, and silane treatment is improved until the paste still flows but no longer behaves like a classical low-filled flowable (5,6,20). Manufacturers now sell them for posterior as well as anterior use.</w:t>
+      </w:r>
+    </w:p>
+    <w:p>
+      <w:pPr>
+        <w:keepNext w:val="0"/>
+        <w:pageBreakBefore w:val="0"/>
+        <w:widowControl/>
+        <w:spacing w:before="0" w:after="0" w:line="480" w:lineRule="auto"/>
+        <w:ind w:firstLine="720"/>
+        <w:jc w:val="both"/>
+      </w:pPr>
+      <w:r>
+        <w:rPr>
+          <w:rFonts w:ascii="Times New Roman" w:hAnsi="Times New Roman" w:eastAsia="Times New Roman"/>
+          <w:b w:val="0"/>
+          <w:i w:val="0"/>
+          <w:color w:val="000000"/>
+          <w:sz w:val="24"/>
+        </w:rPr>
+        <w:t>G-ænial Universal Injectable (GC Corporation, Tokyo, Japan) and Beautifil Flow Plus X F00 (Shofu Inc., Kyoto, Japan) are two such pastes. Beautifil II LS (Shofu Inc.) is a sculptable low-shrinkage nanohybrid giomer and is the conventional control in this work. All three were used in shade A2. The approved protocol listed their filler volume as 50 %, 47 % and 68 % respectively.</w:t>
+      </w:r>
+    </w:p>
+    <w:p>
+      <w:pPr>
+        <w:keepNext w:val="0"/>
+        <w:pageBreakBefore w:val="0"/>
+        <w:widowControl/>
+        <w:spacing w:before="0" w:after="0" w:line="480" w:lineRule="auto"/>
+        <w:ind w:firstLine="720"/>
+        <w:jc w:val="both"/>
+      </w:pPr>
+      <w:r>
+        <w:rPr>
+          <w:rFonts w:ascii="Times New Roman" w:hAnsi="Times New Roman" w:eastAsia="Times New Roman"/>
+          <w:b w:val="0"/>
+          <w:i w:val="0"/>
+          <w:color w:val="000000"/>
+          <w:sz w:val="24"/>
+        </w:rPr>
+        <w:t>Two of the three pastes are giomers. Beautifil Flow Plus X F00 and Beautifil II LS contain surface pre-reacted glass-ionomer (S-PRG) filler. That glass can release fluoride and other ions, and the same ion exchange can roughen the surface in acid (19,21). The present test does not measure ion release. G-ænial Universal Injectable is not a giomer. It is a highly filled dimethacrylate paste with ultrafine barium glass and silica (6,18). The comparison is therefore one injectable giomer and one injectable nanofill against a packable giomer nanohybrid, not three products of the same chemistry.</w:t>
       </w:r>
     </w:p>
     <w:p>
@@ -2587,7 +2716,27 @@
           <w:color w:val="000000"/>
           <w:sz w:val="24"/>
         </w:rPr>
-        <w:t>An Ra of 0.2 µm is the usual threshold above which plaque retention rises (1). Surfaces smoother than that do not keep less plaque in a way that matters clinically. A restoration rougher than about 0.5 µm can be felt by the tongue (2). Those two numbers are the clinical frame for the roughness results.</w:t>
+        <w:t>An Ra of 0.2 µm is the usual threshold above which plaque retention rises (1,17). Surfaces smoother than that do not keep less plaque in a way that matters clinically. A restoration rougher than about 0.5 µm can be felt by the tongue (2). Those two numbers are the clinical frame for the roughness results.</w:t>
+      </w:r>
+    </w:p>
+    <w:p>
+      <w:pPr>
+        <w:keepNext w:val="0"/>
+        <w:pageBreakBefore w:val="0"/>
+        <w:widowControl/>
+        <w:spacing w:before="0" w:after="0" w:line="480" w:lineRule="auto"/>
+        <w:ind w:firstLine="720"/>
+        <w:jc w:val="both"/>
+      </w:pPr>
+      <w:r>
+        <w:rPr>
+          <w:rFonts w:ascii="Times New Roman" w:hAnsi="Times New Roman" w:eastAsia="Times New Roman"/>
+          <w:b w:val="0"/>
+          <w:i w:val="0"/>
+          <w:color w:val="000000"/>
+          <w:sz w:val="24"/>
+        </w:rPr>
+        <w:t>Wear resistance of a composite is governed by filler volume, size, shape and coupling, by the resin and by the degree of conversion (11,12,26). Hydrolytic softening of the matrix can add to that loss after water storage (25,33). A laboratory ranking after a defined slurry and cycle count is useful. It is not a clinical lifetime (10,34). The question here is narrower: after one conventional laboratory year of toothbrushing, do the two injectables lose more mass, or finish rougher, than Beautifil II LS?</w:t>
       </w:r>
     </w:p>
     <w:p>
@@ -2853,7 +3002,7 @@
           <w:color w:val="000000"/>
           <w:sz w:val="24"/>
         </w:rPr>
-        <w:t>Wear is progressive loss of substance from two surfaces in relative motion (9). In the mouth the process is mixed. Attrition is two-body contact. Abrasion at non-contact sites is usually three-body, with food or toothpaste as the loose agent. Corrosion and fatigue run beside both (9,10). Laboratory ranking is useful. It is not a clinical lifetime.</w:t>
+        <w:t>Wear is progressive loss of substance from two surfaces in relative motion (9). In the mouth the process is mixed. Attrition is two-body contact at sites that meet. Abrasion at non-contact sites is usually three-body, with food or toothpaste as the loose agent. Corrosion and fatigue run beside both (9,10). Laboratory ranking is useful. It is not a clinical lifetime (10,34).</w:t>
       </w:r>
     </w:p>
     <w:p>
@@ -2873,7 +3022,7 @@
           <w:color w:val="000000"/>
           <w:sz w:val="24"/>
         </w:rPr>
-        <w:t>Filler volume, size, shape, inter-particle spacing, the resin, the degree of conversion and the silane layer all matter (11,12). Condon and Ferracane varied those three factors in an oral-wear simulator. Wear rose once filler volume fell below 48 vol%. It rose in a straight line as the fraction of silane-treated filler was cut. Degree of cure moved wear in the expected direction; the step was smaller (12). Smaller particles and a tighter, well-coupled filler bed protect the matrix. Classical flowables, filled at about 40–55 wt%, wear faster than packable hybrids for that reason (5,13). Raising filler load and cutting particle size was the route to the newer injectables. G-ænial Universal Injectable is listed at 50 vol%. That sits just above Condon’s 48 vol% step. Beautifil II LS is listed at 83 wt%.</w:t>
+        <w:t>Filler volume, size, shape, inter-particle spacing, the resin, the degree of conversion and the silane layer all matter (11,12,26). Condon and Ferracane varied cure, filler level and silane treatment in an oral-wear simulator. Wear rose once filler volume fell below 48 vol%. It rose in a straight line as the fraction of silane-treated filler was cut. Degree of cure moved wear in the expected direction; the step was smaller (12). Smaller particles and a tighter, well-coupled filler bed protect the matrix. Classical flowables, filled at about 40–55 wt%, wear faster than packable hybrids for that reason (5,13). Raising filler load and cutting particle size was the route to the newer injectables. G-ænial Universal Injectable is listed at 50 vol% in the approved protocol. That sits just above Condon’s 48 vol% step. Beautifil II LS is listed at 68 vol% in the same table.</w:t>
       </w:r>
     </w:p>
     <w:p>
@@ -2893,7 +3042,7 @@
           <w:color w:val="000000"/>
           <w:sz w:val="24"/>
         </w:rPr>
-        <w:t>Toothbrushing tests follow ISO/TR 14569-1. The brush load should lie between 0.5 N and 2.5 N. The slurry is made from a dentifrice that meets ISO 11609 (3,14). Ten thousand strokes are widely treated as one year if a patient makes about fifteen strokes a surface, twice a day (7,8). The conversion is an estimate. It is still the figure most toothbrushing papers use.</w:t>
+        <w:t>Water storage softens the resin and can loosen the silane layer. Ferracane reviewed hygroscopic and hydrolytic effects in dental polymer networks (25). Söderholm and co-workers showed hydrolytic degradation of the filler–matrix interface in earlier composites (33). A 24 h soak at 37 °C, as used here, is a short water challenge. It is not a long ageing study.</w:t>
       </w:r>
     </w:p>
     <w:p>
@@ -2913,7 +3062,27 @@
           <w:color w:val="000000"/>
           <w:sz w:val="24"/>
         </w:rPr>
-        <w:t>Wear may be read as volume, profile depth or mass. Gravimetric loss is simple and repeatable if the balance is fine enough and the specimen is dry. It does not describe the shape of the worn surface. Volume from a scan does. The two numbers answer different questions (10,15).</w:t>
+        <w:t>Toothbrushing tests follow ISO/TR 14569-1. The brush load should lie between 0.5 N and 2.5 N. The slurry is made from a dentifrice that meets ISO 11609 (3,14). Ten thousand strokes are widely treated as one year if a patient makes about fifteen strokes a surface, twice a day (7,8). The conversion is an estimate. It is still the figure most toothbrushing papers use. Heintze later set out how a wear simulator should be qualified if the ranking is to be compared across laboratories (34).</w:t>
+      </w:r>
+    </w:p>
+    <w:p>
+      <w:pPr>
+        <w:keepNext w:val="0"/>
+        <w:pageBreakBefore w:val="0"/>
+        <w:widowControl/>
+        <w:spacing w:before="0" w:after="0" w:line="480" w:lineRule="auto"/>
+        <w:ind w:firstLine="720"/>
+        <w:jc w:val="both"/>
+      </w:pPr>
+      <w:r>
+        <w:rPr>
+          <w:rFonts w:ascii="Times New Roman" w:hAnsi="Times New Roman" w:eastAsia="Times New Roman"/>
+          <w:b w:val="0"/>
+          <w:i w:val="0"/>
+          <w:color w:val="000000"/>
+          <w:sz w:val="24"/>
+        </w:rPr>
+        <w:t>Wear may be read as volume, profile depth or mass. Gravimetric loss is simple and repeatable if the balance is fine enough and the specimen is dry. It does not describe the shape of the worn surface. Volume from a scan does. Heintze compared mass, profile depth and scanned volume and showed that the three methods do not tell the same story (15). Lambrechts reviewed the range of laboratory wear machines and warned against reading any one of them as a clinical year (10). The two numbers answer different questions.</w:t>
       </w:r>
     </w:p>
     <w:p>
@@ -2954,7 +3123,27 @@
           <w:color w:val="000000"/>
           <w:sz w:val="24"/>
         </w:rPr>
-        <w:t>Ra is the mean absolute deviation of the profile from the centre line. It is the parameter almost every dental paper reports. Contact stylus profilometry remains a standard method. Optical methods add a map but are not required to rank Ra (4,16).</w:t>
+        <w:t>Ra is the arithmetic mean of the absolute deviations of the profile from the centre line. It is the parameter defined for the profile method in ISO 4287 and the one almost every dental paper reports (16). Areal parameters are set out in ISO 25178-2 (23). They need an optical or scanning map. They are not required to rank Ra after toothbrushing.</w:t>
+      </w:r>
+    </w:p>
+    <w:p>
+      <w:pPr>
+        <w:keepNext w:val="0"/>
+        <w:pageBreakBefore w:val="0"/>
+        <w:widowControl/>
+        <w:spacing w:before="0" w:after="0" w:line="480" w:lineRule="auto"/>
+        <w:ind w:firstLine="720"/>
+        <w:jc w:val="both"/>
+      </w:pPr>
+      <w:r>
+        <w:rPr>
+          <w:rFonts w:ascii="Times New Roman" w:hAnsi="Times New Roman" w:eastAsia="Times New Roman"/>
+          <w:b w:val="0"/>
+          <w:i w:val="0"/>
+          <w:color w:val="000000"/>
+          <w:sz w:val="24"/>
+        </w:rPr>
+        <w:t>Contact stylus profilometry remains a standard method. Kakaboura and co-workers compared profilometry, scanning electron microscopy, atomic force microscopy and gloss on the same composite surfaces. The methods agreed on rank more often than on the absolute number (31). Optical methods add a map. They are not required to rank Ra (4,16,31).</w:t>
       </w:r>
     </w:p>
     <w:p>
@@ -2994,7 +3183,7 @@
           <w:color w:val="000000"/>
           <w:sz w:val="24"/>
         </w:rPr>
-        <w:t>Toothbrushing raises Ra. Heintze and co-workers showed that the rise depends on material, time and load (4). Nanofilled resins, with small particles that wear with the matrix, usually stay smoother than nanohybrids, in which larger fillers are uncovered or lost (8,18). The toothpaste matters. A higher relative dentine abrasivity cuts gloss faster and leaves a rougher track (8).</w:t>
+        <w:t>Toothbrushing raises Ra. Heintze and co-workers showed that the rise depends on material, time and load (4). Turssi and colleagues tracked resin-based materials during brushing and recorded a progressive rise in roughness (30). Nanofilled resins, with small particles that wear with the matrix, usually stay smoother than nanohybrids, in which larger fillers are uncovered or lost (8,18,28,35). The toothpaste matters. A higher relative dentine abrasivity cuts gloss faster and leaves a rougher track (8,29). da Costa and Ferracane’s group showed that dentifrice type changes both Ra and gloss of the same composite (29). Monteiro and Spohr reached the same conclusion with a different set of pastes (8).</w:t>
       </w:r>
     </w:p>
     <w:p>
@@ -3015,7 +3204,7 @@
           <w:color w:val="000000"/>
           <w:sz w:val="24"/>
         </w:rPr>
-        <w:t>2.3 Injectable Composite Resins</w:t>
+        <w:t>2.3 Filler Size and Toothbrush Abrasion</w:t>
       </w:r>
     </w:p>
     <w:p>
@@ -3035,7 +3224,108 @@
           <w:color w:val="000000"/>
           <w:sz w:val="24"/>
         </w:rPr>
-        <w:t>Early flowables were not intended for occlusal load (13). The current injectables are a different paste. G-ænial Universal Injectable is filled to about 69 wt% (50 vol%) with ultrafine barium glass and silica, mean size about 150 nm, in a UDMA / Bis-MEPP / TEGDMA matrix (6,18). Beautifil Flow Plus X F00 is a zero-flow giomer injectable with nano S-PRG filler (19). It is not the same product as Beautifil Flow Plus F00 used in several earlier papers (6).</w:t>
+        <w:t>Cavalcante, Masouras, Watts, Pimenta and Silikas brushed model composites whose fillers ran from 100 nm to 1000 nm. After 20 000 strokes, larger fillers left a higher Ra and a lower gloss. Colour change was small and was not tied to filler size (28). That is the geometry argument in a single experiment.</w:t>
+      </w:r>
+    </w:p>
+    <w:p>
+      <w:pPr>
+        <w:keepNext w:val="0"/>
+        <w:pageBreakBefore w:val="0"/>
+        <w:widowControl/>
+        <w:spacing w:before="0" w:after="0" w:line="480" w:lineRule="auto"/>
+        <w:ind w:firstLine="720"/>
+        <w:jc w:val="both"/>
+      </w:pPr>
+      <w:r>
+        <w:rPr>
+          <w:rFonts w:ascii="Times New Roman" w:hAnsi="Times New Roman" w:eastAsia="Times New Roman"/>
+          <w:b w:val="0"/>
+          <w:i w:val="0"/>
+          <w:color w:val="000000"/>
+          <w:sz w:val="24"/>
+        </w:rPr>
+        <w:t>Moraes and co-workers brushed packable, microhybrid, nanohybrid and microfilled resins. Wear and roughness were material-dependent. The microfilled paste behaved differently from the hybrids (32). de Oliveira and colleagues later compared nanofilled and microhybrid resins after 100 000 strokes. Nanofilled materials generally wore less and stayed smoother, though not every product followed the mean (36). Senawongse and Pongprueksa polished and then brushed nanofill and nanohybrid pastes. After brushing the nanofill stayed smoother (35). Suzuki and Finger’s group used a calcium-carbonate slurry for 50 000 cycles. Wear depth rose almost in a straight line with cycle count. Surface texture on SEM showed uniform abrasion of a nanofill and matrix loss around larger glass in two nanohybrids (37).</w:t>
+      </w:r>
+    </w:p>
+    <w:p>
+      <w:pPr>
+        <w:keepNext w:val="0"/>
+        <w:pageBreakBefore w:val="0"/>
+        <w:widowControl/>
+        <w:spacing w:before="0" w:after="0" w:line="480" w:lineRule="auto"/>
+        <w:ind w:firstLine="720"/>
+        <w:jc w:val="both"/>
+      </w:pPr>
+      <w:r>
+        <w:rPr>
+          <w:rFonts w:ascii="Times New Roman" w:hAnsi="Times New Roman" w:eastAsia="Times New Roman"/>
+          <w:b w:val="0"/>
+          <w:i w:val="0"/>
+          <w:color w:val="000000"/>
+          <w:sz w:val="24"/>
+        </w:rPr>
+        <w:t>Taken together, those papers support a simple rule. When the filler is small and well coupled, the surface wears evenly. When larger glass or pre-polymerised particles sit in a softer matrix, the matrix goes first and Ra rises (4,28,35,37).</w:t>
+      </w:r>
+    </w:p>
+    <w:p>
+      <w:pPr>
+        <w:pStyle w:val="Heading2"/>
+        <w:keepNext/>
+        <w:pageBreakBefore w:val="0"/>
+        <w:widowControl/>
+        <w:spacing w:before="360" w:after="120" w:line="480" w:lineRule="auto"/>
+        <w:ind w:firstLine="0"/>
+        <w:jc w:val="left"/>
+      </w:pPr>
+      <w:r>
+        <w:rPr>
+          <w:rFonts w:ascii="Times New Roman" w:hAnsi="Times New Roman" w:eastAsia="Times New Roman"/>
+          <w:b/>
+          <w:i w:val="0"/>
+          <w:color w:val="000000"/>
+          <w:sz w:val="24"/>
+        </w:rPr>
+        <w:t>2.4 Injectable Composite Resins</w:t>
+      </w:r>
+    </w:p>
+    <w:p>
+      <w:pPr>
+        <w:keepNext w:val="0"/>
+        <w:pageBreakBefore w:val="0"/>
+        <w:widowControl/>
+        <w:spacing w:before="0" w:after="0" w:line="480" w:lineRule="auto"/>
+        <w:ind w:firstLine="720"/>
+        <w:jc w:val="both"/>
+      </w:pPr>
+      <w:r>
+        <w:rPr>
+          <w:rFonts w:ascii="Times New Roman" w:hAnsi="Times New Roman" w:eastAsia="Times New Roman"/>
+          <w:b w:val="0"/>
+          <w:i w:val="0"/>
+          <w:color w:val="000000"/>
+          <w:sz w:val="24"/>
+        </w:rPr>
+        <w:t>Early flowables were not intended for occlusal load (5,13). Baroudi and Rodrigues reviewed that generation and kept them for lining, small repairs and conservative boxes (13). The current injectables are a different paste. G-ænial Universal Injectable is filled to about 69 wt% (50 vol%) with ultrafine barium glass and silica, mean size about 150 nm, in a UDMA / Bis-MEPP / TEGDMA matrix (6,18). Beautifil Flow Plus X F00 is a zero-flow giomer injectable with multifunctional glass and nano S-PRG filler (19). The protocol lists 47 vol%. It is not the same product as Beautifil Flow Plus F00 used in several earlier papers (6).</w:t>
+      </w:r>
+    </w:p>
+    <w:p>
+      <w:pPr>
+        <w:keepNext w:val="0"/>
+        <w:pageBreakBefore w:val="0"/>
+        <w:widowControl/>
+        <w:spacing w:before="0" w:after="0" w:line="480" w:lineRule="auto"/>
+        <w:ind w:firstLine="720"/>
+        <w:jc w:val="both"/>
+      </w:pPr>
+      <w:r>
+        <w:rPr>
+          <w:rFonts w:ascii="Times New Roman" w:hAnsi="Times New Roman" w:eastAsia="Times New Roman"/>
+          <w:b w:val="0"/>
+          <w:i w:val="0"/>
+          <w:color w:val="000000"/>
+          <w:sz w:val="24"/>
+        </w:rPr>
+        <w:t>Ilie and Hickel surveyed mechanical behaviour across commercial composites and showed wide scatter inside each marketing class (26,27). A label such as “injectable” or “nanohybrid” does not fix wear or Ra. The filler bed does.</w:t>
       </w:r>
     </w:p>
     <w:p>
@@ -3116,7 +3406,7 @@
           <w:color w:val="000000"/>
           <w:sz w:val="24"/>
         </w:rPr>
-        <w:t>2.4 Conventional Nanohybrid Resins and Giomers</w:t>
+        <w:t>2.5 Conventional Nanohybrid Resins and Giomers</w:t>
       </w:r>
     </w:p>
     <w:p>
@@ -3136,7 +3426,7 @@
           <w:color w:val="000000"/>
           <w:sz w:val="24"/>
         </w:rPr>
-        <w:t>Nanohybrid pastes mix nano-sized particles with larger submicron or micron fillers. Total inorganic load commonly exceeds 70–80 wt% (11). Beautifil II LS is such a paste. Filler load is 83 wt%. The resin uses an SRS monomer aimed at low shrinkage. The filler includes S-PRG glass (19). S-PRG releases ions, including fluoride. The same ion exchange can roughen the surface in acid (21). Larger and irregular fillers, once the matrix is brushed off, leave a higher Ra than a uniform nano-filled injectable (18). An eight-year clinical series of a giomer paste (Beautifil with a self-etch primer) showed acceptable retention and little secondary caries in the teeth that were still available for recall (22). That is clinical behaviour of an earlier giomer, not toothbrush Ra of Beautifil II LS. It only shows that S-PRG pastes have been used as definitive restoratives for years.</w:t>
+        <w:t>Nanohybrid pastes mix nano-sized particles with larger submicron or micron fillers. Total inorganic load commonly exceeds 70–80 wt% or, in volume terms, sits well above the 48 vol% step that Condon described (11,12). Beautifil II LS is such a paste. The approved protocol lists 68 vol%. The resin uses Bis-GMA, UDMA, Bis-EMA, PEGMA and TEGDMA. The filler includes multifunctional glass and S-PRG (19). S-PRG releases ions, including fluoride. The same ion exchange can roughen the surface in acid (21). Larger and irregular fillers, once the matrix is brushed off, leave a higher Ra than a uniform nano-filled injectable (18,28,35).</w:t>
       </w:r>
     </w:p>
     <w:p>
@@ -3156,7 +3446,47 @@
           <w:color w:val="000000"/>
           <w:sz w:val="24"/>
         </w:rPr>
-        <w:t>Packable nanohybrids remain the clinical reference for posterior direct work. They are harder to adapt in a narrow box and more likely to trap voids. The injectable products were written to close that handling gap without giving up wear resistance. Whether they do so under toothbrush abrasion is the question of this thesis.</w:t>
+        <w:t>An eight-year clinical series of a giomer paste (Beautifil with a self-etch primer) showed acceptable retention and little secondary caries in the teeth that were still available for recall (22). That is clinical behaviour of an earlier giomer, not toothbrush Ra of Beautifil II LS. It only shows that S-PRG pastes have been used as definitive restoratives for years.</w:t>
+      </w:r>
+    </w:p>
+    <w:p>
+      <w:pPr>
+        <w:keepNext w:val="0"/>
+        <w:pageBreakBefore w:val="0"/>
+        <w:widowControl/>
+        <w:spacing w:before="0" w:after="0" w:line="480" w:lineRule="auto"/>
+        <w:ind w:firstLine="720"/>
+        <w:jc w:val="both"/>
+      </w:pPr>
+      <w:r>
+        <w:rPr>
+          <w:rFonts w:ascii="Times New Roman" w:hAnsi="Times New Roman" w:eastAsia="Times New Roman"/>
+          <w:b w:val="0"/>
+          <w:i w:val="0"/>
+          <w:color w:val="000000"/>
+          <w:sz w:val="24"/>
+        </w:rPr>
+        <w:t>Packable nanohybrids remain the clinical reference for posterior direct work (11,27). They are harder to adapt in a narrow box and more likely to trap voids. The injectable products were written to close that handling gap without giving up wear resistance. Whether they do so under toothbrush abrasion is the question of this thesis.</w:t>
+      </w:r>
+    </w:p>
+    <w:p>
+      <w:pPr>
+        <w:keepNext w:val="0"/>
+        <w:pageBreakBefore w:val="0"/>
+        <w:widowControl/>
+        <w:spacing w:before="0" w:after="0" w:line="480" w:lineRule="auto"/>
+        <w:ind w:firstLine="720"/>
+        <w:jc w:val="both"/>
+      </w:pPr>
+      <w:r>
+        <w:rPr>
+          <w:rFonts w:ascii="Times New Roman" w:hAnsi="Times New Roman" w:eastAsia="Times New Roman"/>
+          <w:b w:val="0"/>
+          <w:i w:val="0"/>
+          <w:color w:val="000000"/>
+          <w:sz w:val="24"/>
+        </w:rPr>
+        <w:t>ISO 4049 sets requirements for polymer-based restorative materials. It is the product standard, not a roughness standard (24). Roughness parameters remain those of ISO 4287 and, for maps, ISO 25178-2 (16,23).</w:t>
       </w:r>
     </w:p>
     <w:p>
@@ -3177,7 +3507,7 @@
           <w:color w:val="000000"/>
           <w:sz w:val="24"/>
         </w:rPr>
-        <w:t>2.5 Statement of the Problem</w:t>
+        <w:t>2.6 Statement of the Problem</w:t>
       </w:r>
     </w:p>
     <w:p>
@@ -3280,7 +3610,27 @@
           <w:color w:val="000000"/>
           <w:sz w:val="24"/>
         </w:rPr>
-        <w:t>The study was an in-vitro comparison of three resin composites. Disc preparation was done in the laboratory of the Faculty of Dentistry, Pharos University in Alexandria. The toothbrushing run and the measurements were done in the Conservative Dentistry laboratory of the Faculty of Dentistry, Alexandria University.</w:t>
+        <w:t>The study was an in-vitro comparison of three resin composites. No patient, extracted tooth or identifiable tissue was used. Disc preparation was done in the laboratory of the Faculty of Dentistry, Pharos University in Alexandria. The toothbrushing run and the measurements were done in the Conservative Dentistry laboratory of the Faculty of Dentistry, Alexandria University.</w:t>
+      </w:r>
+    </w:p>
+    <w:p>
+      <w:pPr>
+        <w:keepNext w:val="0"/>
+        <w:pageBreakBefore w:val="0"/>
+        <w:widowControl/>
+        <w:spacing w:before="0" w:after="0" w:line="480" w:lineRule="auto"/>
+        <w:ind w:firstLine="720"/>
+        <w:jc w:val="both"/>
+      </w:pPr>
+      <w:r>
+        <w:rPr>
+          <w:rFonts w:ascii="Times New Roman" w:hAnsi="Times New Roman" w:eastAsia="Times New Roman"/>
+          <w:b w:val="0"/>
+          <w:i w:val="0"/>
+          <w:color w:val="000000"/>
+          <w:sz w:val="24"/>
+        </w:rPr>
+        <w:t>The design follows the approved protocol of 3 February 2025. Wear is three-body toothbrush abrasion after ISO/TR 14569-1, not two-body antagonist wear (3,34). The materials fall under ISO 4049 as polymer-based restoratives (24). Roughness is reported as Ra after ISO 4287 (16).</w:t>
       </w:r>
     </w:p>
     <w:p>
@@ -3321,7 +3671,7 @@
           <w:color w:val="000000"/>
           <w:sz w:val="24"/>
         </w:rPr>
-        <w:t>Thirty-six discs were prepared, 10 mm in diameter and 1 mm thick. The discs were allocated at random to three groups of twelve.</w:t>
+        <w:t>Thirty-six discs were prepared, 10 mm in diameter and 1 mm thick. The discs were allocated at random to three groups of twelve. Disc geometry is that of the approved protocol. It is a flat face for profilometry and a known volume for weighing. It is not a Class II box.</w:t>
       </w:r>
     </w:p>
     <w:p>
@@ -3619,14 +3969,14 @@
       <w:tblPr>
         <w:tblW w:type="auto" w:w="0"/>
         <w:jc w:val="center"/>
-        <w:tblLayout w:type="autofit"/>
+        <w:tblLayout w:type="fixed"/>
         <w:tblLook w:firstColumn="1" w:firstRow="1" w:lastColumn="0" w:lastRow="0" w:noHBand="0" w:noVBand="1" w:val="04A0"/>
       </w:tblPr>
       <w:tblGrid>
-        <w:gridCol w:w="2197"/>
-        <w:gridCol w:w="2197"/>
-        <w:gridCol w:w="2197"/>
-        <w:gridCol w:w="2197"/>
+        <w:gridCol w:w="2988"/>
+        <w:gridCol w:w="1933"/>
+        <w:gridCol w:w="1933"/>
+        <w:gridCol w:w="1933"/>
       </w:tblGrid>
       <w:tr>
         <w:tc>
@@ -4362,7 +4712,7 @@
           <w:color w:val="000000"/>
           <w:sz w:val="24"/>
         </w:rPr>
-        <w:t>Thirty-six discs were packed, one increment each, in a CAD/CAM-milled Teflon mould, 10 mm in diameter and 1 mm deep. A Mylar strip and a transparent microscope slide were placed over the paste so that the face was flat and free of air. The light tip was held against the slide. Each disc was cured for 20 s at 800 mW/cm². Three further 20 s exposures were given from different directions so that the disc was polymerised through its thickness. Flash was trimmed with a no. 12 scalpel blade (Suzhou Kyuan Medical Co., Jiangsu, China).</w:t>
+        <w:t>Thirty-six discs were packed, one increment each, in a CAD/CAM-milled Teflon mould, 10 mm in diameter and 1 mm deep. A Mylar strip and a transparent microscope slide were placed over the paste so that the face was flat and free of air. The light tip was held against the slide. Each disc was cured for 20 s at 800 mW/cm². Three further 20 s exposures were given from different directions so that the disc was polymerised through its thickness. Flash was trimmed with a no. 12 scalpel blade (Suzhou Kyuan Medical Co., Jiangsu, China). No graded polish sequence was used. The test face is the as-cured, strip-finished surface.</w:t>
       </w:r>
     </w:p>
     <w:p>
@@ -4382,7 +4732,7 @@
           <w:color w:val="000000"/>
           <w:sz w:val="24"/>
         </w:rPr>
-        <w:t>After removal from the mould the diameter of each disc was checked with the digital caliper. The discs were stored in distilled water in a closed glass container at 37 °C for 24 h. Before each weighing or roughness run a disc was taken out and dried with a sterile disposable sponge.</w:t>
+        <w:t>After removal from the mould the diameter of each disc was checked with the digital caliper. The discs were stored in distilled water in a closed glass container at 37 °C for 24 h. That interval is the usual short water soak before a laboratory mechanical test (24,25). Before each weighing or roughness run a disc was taken out and dried with a sterile disposable sponge. The same drying habit was used at baseline and after brushing so that retained water would not be read as mass.</w:t>
       </w:r>
     </w:p>
     <w:p>
@@ -4423,7 +4773,7 @@
           <w:color w:val="000000"/>
           <w:sz w:val="24"/>
         </w:rPr>
-        <w:t>Each dried disc was weighed on the RADWAG AS 220-R2. The recorded masses run to 0.0001 g; the balance therefore read to 0.1 mg.</w:t>
+        <w:t>Each dried disc was weighed on the RADWAG AS 220-R2. The recorded masses run to 0.0001 g; the balance therefore read to 0.1 mg. Gravimetric loss is the wear outcome named in the protocol (3,15).</w:t>
       </w:r>
     </w:p>
     <w:p>
@@ -4443,7 +4793,7 @@
           <w:color w:val="000000"/>
           <w:sz w:val="24"/>
         </w:rPr>
-        <w:t>Ra was measured on the test face with the MarSurf PS10. Five traces were taken at different sites on each disc. The value used for analysis was the mean of those five traces.</w:t>
+        <w:t>Ra was measured on the test face with the MarSurf PS10. Five traces were taken at different sites on each disc. The value used for analysis was the mean of those five traces. Ra is the profile parameter of ISO 4287 (16). Five traces reduce the chance that a single scratch sets the disc value. They do not produce an areal map (23,31).</w:t>
       </w:r>
     </w:p>
     <w:p>
@@ -4671,6 +5021,26 @@
     </w:p>
     <w:p>
       <w:pPr>
+        <w:keepNext w:val="0"/>
+        <w:pageBreakBefore w:val="0"/>
+        <w:widowControl/>
+        <w:spacing w:before="0" w:after="0" w:line="480" w:lineRule="auto"/>
+        <w:ind w:firstLine="720"/>
+        <w:jc w:val="both"/>
+      </w:pPr>
+      <w:r>
+        <w:rPr>
+          <w:rFonts w:ascii="Times New Roman" w:hAnsi="Times New Roman" w:eastAsia="Times New Roman"/>
+          <w:b w:val="0"/>
+          <w:i w:val="0"/>
+          <w:color w:val="000000"/>
+          <w:sz w:val="24"/>
+        </w:rPr>
+        <w:t>Percentage loss was treated as a parametric outcome. Ra after brushing was not. The locked analysis used those two tests. They are not interchangeable. A later check of normality on the raw sheet would belong in an appendix if that sheet is released. It is not invented here.</w:t>
+      </w:r>
+    </w:p>
+    <w:p>
+      <w:pPr>
         <w:pStyle w:val="Heading2"/>
         <w:keepNext/>
         <w:pageBreakBefore w:val="0"/>
@@ -4789,7 +5159,7 @@
           <w:color w:val="000000"/>
           <w:sz w:val="24"/>
         </w:rPr>
-        <w:t>The three pastes did not start at the same mass or at the same Ra. Those baseline differences are part of the result. They are not adjusted away.</w:t>
+        <w:t>The three pastes did not start at the same mass or at the same Ra. Those baseline differences are part of the result. They are not adjusted away. All thirty-six faces were strip-finished in the same mould, so the baseline Ra gap is a material difference, not a difference in grit (28,35).</w:t>
       </w:r>
     </w:p>
     <w:p>
@@ -4847,15 +5217,15 @@
       <w:tblPr>
         <w:tblW w:type="auto" w:w="0"/>
         <w:jc w:val="center"/>
-        <w:tblLayout w:type="autofit"/>
+        <w:tblLayout w:type="fixed"/>
         <w:tblLook w:firstColumn="1" w:firstRow="1" w:lastColumn="0" w:lastRow="0" w:noHBand="0" w:noVBand="1" w:val="04A0"/>
       </w:tblPr>
       <w:tblGrid>
-        <w:gridCol w:w="1758"/>
-        <w:gridCol w:w="1758"/>
-        <w:gridCol w:w="1758"/>
-        <w:gridCol w:w="1758"/>
-        <w:gridCol w:w="1758"/>
+        <w:gridCol w:w="2988"/>
+        <w:gridCol w:w="1450"/>
+        <w:gridCol w:w="1450"/>
+        <w:gridCol w:w="1450"/>
+        <w:gridCol w:w="1450"/>
       </w:tblGrid>
       <w:tr>
         <w:tc>
@@ -4920,7 +5290,18 @@
                 <w:color w:val="000000"/>
                 <w:sz w:val="18"/>
               </w:rPr>
-              <w:t>Weight before (g) Mean ± SD</w:t>
+              <w:t>Weight before (g)</w:t>
+              <w:br/>
+            </w:r>
+            <w:r>
+              <w:rPr>
+                <w:rFonts w:ascii="Times New Roman" w:hAnsi="Times New Roman" w:eastAsia="Times New Roman"/>
+                <w:b/>
+                <w:i w:val="0"/>
+                <w:color w:val="000000"/>
+                <w:sz w:val="18"/>
+              </w:rPr>
+              <w:t>Mean ± SD</w:t>
             </w:r>
           </w:p>
         </w:tc>
@@ -4953,7 +5334,18 @@
                 <w:color w:val="000000"/>
                 <w:sz w:val="18"/>
               </w:rPr>
-              <w:t>Weight after (g) Mean ± SD</w:t>
+              <w:t>Weight after (g)</w:t>
+              <w:br/>
+            </w:r>
+            <w:r>
+              <w:rPr>
+                <w:rFonts w:ascii="Times New Roman" w:hAnsi="Times New Roman" w:eastAsia="Times New Roman"/>
+                <w:b/>
+                <w:i w:val="0"/>
+                <w:color w:val="000000"/>
+                <w:sz w:val="18"/>
+              </w:rPr>
+              <w:t>Mean ± SD</w:t>
             </w:r>
           </w:p>
         </w:tc>
@@ -4986,7 +5378,18 @@
                 <w:color w:val="000000"/>
                 <w:sz w:val="18"/>
               </w:rPr>
-              <w:t>Weight loss (%) Mean ± SD</w:t>
+              <w:t>Weight loss (%)</w:t>
+              <w:br/>
+            </w:r>
+            <w:r>
+              <w:rPr>
+                <w:rFonts w:ascii="Times New Roman" w:hAnsi="Times New Roman" w:eastAsia="Times New Roman"/>
+                <w:b/>
+                <w:i w:val="0"/>
+                <w:color w:val="000000"/>
+                <w:sz w:val="18"/>
+              </w:rPr>
+              <w:t>Mean ± SD</w:t>
             </w:r>
           </w:p>
         </w:tc>
@@ -5694,15 +6097,15 @@
       <w:tblPr>
         <w:tblW w:type="auto" w:w="0"/>
         <w:jc w:val="center"/>
-        <w:tblLayout w:type="autofit"/>
+        <w:tblLayout w:type="fixed"/>
         <w:tblLook w:firstColumn="1" w:firstRow="1" w:lastColumn="0" w:lastRow="0" w:noHBand="0" w:noVBand="1" w:val="04A0"/>
       </w:tblPr>
       <w:tblGrid>
-        <w:gridCol w:w="1758"/>
-        <w:gridCol w:w="1758"/>
-        <w:gridCol w:w="1758"/>
-        <w:gridCol w:w="1758"/>
-        <w:gridCol w:w="1758"/>
+        <w:gridCol w:w="2988"/>
+        <w:gridCol w:w="1450"/>
+        <w:gridCol w:w="1450"/>
+        <w:gridCol w:w="1450"/>
+        <w:gridCol w:w="1450"/>
       </w:tblGrid>
       <w:tr>
         <w:tc>
@@ -5767,7 +6170,18 @@
                 <w:color w:val="000000"/>
                 <w:sz w:val="18"/>
               </w:rPr>
-              <w:t>Ra before (µm) Mean ± SD</w:t>
+              <w:t>Ra before (µm)</w:t>
+              <w:br/>
+            </w:r>
+            <w:r>
+              <w:rPr>
+                <w:rFonts w:ascii="Times New Roman" w:hAnsi="Times New Roman" w:eastAsia="Times New Roman"/>
+                <w:b/>
+                <w:i w:val="0"/>
+                <w:color w:val="000000"/>
+                <w:sz w:val="18"/>
+              </w:rPr>
+              <w:t>Mean ± SD</w:t>
             </w:r>
           </w:p>
         </w:tc>
@@ -5800,7 +6214,18 @@
                 <w:color w:val="000000"/>
                 <w:sz w:val="18"/>
               </w:rPr>
-              <w:t>Ra after (µm) Mean ± SD</w:t>
+              <w:t>Ra after (µm)</w:t>
+              <w:br/>
+            </w:r>
+            <w:r>
+              <w:rPr>
+                <w:rFonts w:ascii="Times New Roman" w:hAnsi="Times New Roman" w:eastAsia="Times New Roman"/>
+                <w:b/>
+                <w:i w:val="0"/>
+                <w:color w:val="000000"/>
+                <w:sz w:val="18"/>
+              </w:rPr>
+              <w:t>Mean ± SD</w:t>
             </w:r>
           </w:p>
         </w:tc>
@@ -5833,7 +6258,18 @@
                 <w:color w:val="000000"/>
                 <w:sz w:val="18"/>
               </w:rPr>
-              <w:t>ΔRa (µm) Mean ± SD</w:t>
+              <w:t>ΔRa (µm)</w:t>
+              <w:br/>
+            </w:r>
+            <w:r>
+              <w:rPr>
+                <w:rFonts w:ascii="Times New Roman" w:hAnsi="Times New Roman" w:eastAsia="Times New Roman"/>
+                <w:b/>
+                <w:i w:val="0"/>
+                <w:color w:val="000000"/>
+                <w:sz w:val="18"/>
+              </w:rPr>
+              <w:t>Mean ± SD</w:t>
             </w:r>
           </w:p>
         </w:tc>
@@ -6443,6 +6879,26 @@
           <w:color w:val="000000"/>
           <w:sz w:val="24"/>
         </w:rPr>
+        <w:t>From the same locked means, Ra rose by a factor of about 2.7 in Beautifil Flow Plus X F00 (0.038 µm to 0.104 µm), about 1.9 in G-ænial Universal Injectable (0.054 µm to 0.100 µm) and about 1.6 in Beautifil II LS (0.119 µm to 0.194 µm). The nanohybrid started higher, so its relative rise is smaller even though its absolute ΔRa is the largest.</w:t>
+      </w:r>
+    </w:p>
+    <w:p>
+      <w:pPr>
+        <w:keepNext w:val="0"/>
+        <w:pageBreakBefore w:val="0"/>
+        <w:widowControl/>
+        <w:spacing w:before="0" w:after="0" w:line="480" w:lineRule="auto"/>
+        <w:ind w:firstLine="720"/>
+        <w:jc w:val="both"/>
+      </w:pPr>
+      <w:r>
+        <w:rPr>
+          <w:rFonts w:ascii="Times New Roman" w:hAnsi="Times New Roman" w:eastAsia="Times New Roman"/>
+          <w:b w:val="0"/>
+          <w:i w:val="0"/>
+          <w:color w:val="000000"/>
+          <w:sz w:val="24"/>
+        </w:rPr>
         <w:t>The Kruskal–Wallis test on Ra after brushing was significant (p &lt; 0.001). The second null hypothesis is rejected. Pairwise tests separated Beautifil II LS from each injectable. They did not separate the two injectables.</w:t>
       </w:r>
     </w:p>
@@ -6540,13 +6996,13 @@
       <w:tblPr>
         <w:tblW w:type="auto" w:w="0"/>
         <w:jc w:val="center"/>
-        <w:tblLayout w:type="autofit"/>
+        <w:tblLayout w:type="fixed"/>
         <w:tblLook w:firstColumn="1" w:firstRow="1" w:lastColumn="0" w:lastRow="0" w:noHBand="0" w:noVBand="1" w:val="04A0"/>
       </w:tblPr>
       <w:tblGrid>
-        <w:gridCol w:w="2929"/>
-        <w:gridCol w:w="2929"/>
-        <w:gridCol w:w="2929"/>
+        <w:gridCol w:w="3515"/>
+        <w:gridCol w:w="2636"/>
+        <w:gridCol w:w="2636"/>
       </w:tblGrid>
       <w:tr>
         <w:tc>
@@ -6611,7 +7067,18 @@
                 <w:color w:val="000000"/>
                 <w:sz w:val="18"/>
               </w:rPr>
-              <w:t>Absolute weight loss (mg) Mean ± SD</w:t>
+              <w:t>Absolute weight loss (mg)</w:t>
+              <w:br/>
+            </w:r>
+            <w:r>
+              <w:rPr>
+                <w:rFonts w:ascii="Times New Roman" w:hAnsi="Times New Roman" w:eastAsia="Times New Roman"/>
+                <w:b/>
+                <w:i w:val="0"/>
+                <w:color w:val="000000"/>
+                <w:sz w:val="18"/>
+              </w:rPr>
+              <w:t>Mean ± SD</w:t>
             </w:r>
           </w:p>
         </w:tc>
@@ -7175,6 +7642,26 @@
           <w:color w:val="000000"/>
           <w:sz w:val="24"/>
         </w:rPr>
+        <w:t>Condon and Ferracane placed a wear step at 48 vol% in an oral-wear simulator (12). The protocol lists Beautifil Flow Plus X F00 at 47 vol% and G-ænial Universal Injectable at 50 vol%. Those two sit on either side of that step. Beautifil II LS sits well above it. The present mass result did not follow that step. The test is toothbrush slurry, not their simulator, and the filler chemistry is not their experimental series. The volume figures are still the right frame for why a 68 vol% paste was expected to lose less, and why that expectation was not confirmed on percentage loss.</w:t>
+      </w:r>
+    </w:p>
+    <w:p>
+      <w:pPr>
+        <w:keepNext w:val="0"/>
+        <w:pageBreakBefore w:val="0"/>
+        <w:widowControl/>
+        <w:spacing w:before="0" w:after="0" w:line="480" w:lineRule="auto"/>
+        <w:ind w:firstLine="720"/>
+        <w:jc w:val="both"/>
+      </w:pPr>
+      <w:r>
+        <w:rPr>
+          <w:rFonts w:ascii="Times New Roman" w:hAnsi="Times New Roman" w:eastAsia="Times New Roman"/>
+          <w:b w:val="0"/>
+          <w:i w:val="0"/>
+          <w:color w:val="000000"/>
+          <w:sz w:val="24"/>
+        </w:rPr>
         <w:t>The slurry was a single paste, Colgate Total, RDA 70, mixed 250 g to 1 L after ISO/TR 14569-1 (3,14). That is a moderate abrasive, not a high-RDA whitening paste. Monteiro and Spohr showed that a higher RDA cuts gloss faster and leaves a rougher track (8). A harsher dentifrice might have opened a gap in mass that this paste did not. The present ranking is for this slurry only.</w:t>
       </w:r>
     </w:p>
@@ -7296,7 +7783,27 @@
           <w:color w:val="000000"/>
           <w:sz w:val="24"/>
         </w:rPr>
-        <w:t>That pattern fits filler geometry. A nanofilled injectable with barium glass and silica at 50 vol% wears more evenly (6,18). A nanohybrid with larger S-PRG and glass particles loses matrix first. The large fillers stand up or leave pits (4,18). Hasan, Eltoukhy and Zaghloul saw the same order after simulated brushing: G-ænial Universal Injectable smoother than a nanohybrid; two nanofilled resins not different from each other (18). Heintze et al. had already shown that hybrid and microhybrid pastes roughen more with load and time than microfilled resins (4).</w:t>
+        <w:t>That pattern fits filler geometry. A nanofilled injectable with barium glass and silica at 50 vol% wears more evenly (6,18,28). A nanohybrid with larger S-PRG and glass particles loses matrix first. The large fillers stand up or leave pits (4,18,37). Cavalcante et al. showed the same size effect on model pastes after 20 000 strokes (28). Senawongse and Pongprueksa, and Suzuki and Finger’s group, saw a smoother nanofill than nanohybrid after brushing (35,37). Hasan, Eltoukhy and Zaghloul saw the same order with G-ænial Universal Injectable against a nanohybrid (18). Heintze et al. had already shown that hybrid and microhybrid pastes roughen more with load and time than microfilled resins (4).</w:t>
+      </w:r>
+    </w:p>
+    <w:p>
+      <w:pPr>
+        <w:keepNext w:val="0"/>
+        <w:pageBreakBefore w:val="0"/>
+        <w:widowControl/>
+        <w:spacing w:before="0" w:after="0" w:line="480" w:lineRule="auto"/>
+        <w:ind w:firstLine="720"/>
+        <w:jc w:val="both"/>
+      </w:pPr>
+      <w:r>
+        <w:rPr>
+          <w:rFonts w:ascii="Times New Roman" w:hAnsi="Times New Roman" w:eastAsia="Times New Roman"/>
+          <w:b w:val="0"/>
+          <w:i w:val="0"/>
+          <w:color w:val="000000"/>
+          <w:sz w:val="24"/>
+        </w:rPr>
+        <w:t>The slurry here was RDA 70. da Costa and Monteiro both showed that a harsher dentifrice raises Ra further on the same composite (8,29). The present ranking is for this paste.</w:t>
       </w:r>
     </w:p>
     <w:p>
@@ -7336,7 +7843,7 @@
           <w:color w:val="000000"/>
           <w:sz w:val="24"/>
         </w:rPr>
-        <w:t>Five traces a disc on the MarSurf PS10 is a standard contact-stylus habit. It is not a map of the whole face. A local pit can be missed. Optical methods would have given that map (4,16). They were not used.</w:t>
+        <w:t>Five traces a disc on the MarSurf PS10 is a standard contact-stylus habit after ISO 4287 (16). It is not a map of the whole face. A local pit can be missed. Optical methods, or AFM, would have given that map (23,31). They were not used. Kakaboura showed that rank order usually survives a change of method even when the micrometre values do not (31).</w:t>
       </w:r>
     </w:p>
     <w:p>
@@ -8277,7 +8784,7 @@
           <w:color w:val="000000"/>
           <w:sz w:val="24"/>
         </w:rPr>
-        <w:t>16. International Organization for Standardization. ISO 4049:2019. Dentistry — Polymer-based restorative materials. Geneva: ISO; 2019.</w:t>
+        <w:t>16. International Organization for Standardization. ISO 4287:1997. Geometrical Product Specifications (GPS) — Surface texture: Profile method — Terms, definitions and surface texture parameters. Geneva: ISO; 1997.</w:t>
       </w:r>
     </w:p>
     <w:p>
@@ -8398,6 +8905,306 @@
           <w:sz w:val="24"/>
         </w:rPr>
         <w:t>22. Gordan VV, Mondragon E, Watson RE, Garvan C, Mjör IA. A clinical evaluation of a self-etching primer and a giomer restorative material: results at eight years. J Am Dent Assoc. 2007;138(5):621-627.</w:t>
+      </w:r>
+    </w:p>
+    <w:p>
+      <w:pPr>
+        <w:keepNext w:val="0"/>
+        <w:pageBreakBefore w:val="0"/>
+        <w:widowControl/>
+        <w:spacing w:before="0" w:after="120" w:line="240" w:lineRule="auto"/>
+        <w:ind w:left="425" w:hanging="425"/>
+        <w:jc w:val="both"/>
+      </w:pPr>
+      <w:r>
+        <w:rPr>
+          <w:rFonts w:ascii="Times New Roman" w:hAnsi="Times New Roman" w:eastAsia="Times New Roman"/>
+          <w:b w:val="0"/>
+          <w:i w:val="0"/>
+          <w:color w:val="000000"/>
+          <w:sz w:val="24"/>
+        </w:rPr>
+        <w:t>23. International Organization for Standardization. ISO 25178-2:2012. Geometrical product specifications (GPS) — Surface texture: Areal — Part 2: Terms, definitions and surface texture parameters. Geneva: ISO; 2012.</w:t>
+      </w:r>
+    </w:p>
+    <w:p>
+      <w:pPr>
+        <w:keepNext w:val="0"/>
+        <w:pageBreakBefore w:val="0"/>
+        <w:widowControl/>
+        <w:spacing w:before="0" w:after="120" w:line="240" w:lineRule="auto"/>
+        <w:ind w:left="425" w:hanging="425"/>
+        <w:jc w:val="both"/>
+      </w:pPr>
+      <w:r>
+        <w:rPr>
+          <w:rFonts w:ascii="Times New Roman" w:hAnsi="Times New Roman" w:eastAsia="Times New Roman"/>
+          <w:b w:val="0"/>
+          <w:i w:val="0"/>
+          <w:color w:val="000000"/>
+          <w:sz w:val="24"/>
+        </w:rPr>
+        <w:t>24. International Organization for Standardization. ISO 4049:2019. Dentistry — Polymer-based restorative materials. Geneva: ISO; 2019.</w:t>
+      </w:r>
+    </w:p>
+    <w:p>
+      <w:pPr>
+        <w:keepNext w:val="0"/>
+        <w:pageBreakBefore w:val="0"/>
+        <w:widowControl/>
+        <w:spacing w:before="0" w:after="120" w:line="240" w:lineRule="auto"/>
+        <w:ind w:left="425" w:hanging="425"/>
+        <w:jc w:val="both"/>
+      </w:pPr>
+      <w:r>
+        <w:rPr>
+          <w:rFonts w:ascii="Times New Roman" w:hAnsi="Times New Roman" w:eastAsia="Times New Roman"/>
+          <w:b w:val="0"/>
+          <w:i w:val="0"/>
+          <w:color w:val="000000"/>
+          <w:sz w:val="24"/>
+        </w:rPr>
+        <w:t>25. Ferracane JL. Hygroscopic and hydrolytic effects in dental polymer networks. Dent Mater. 2006;22(3):211-222.</w:t>
+      </w:r>
+    </w:p>
+    <w:p>
+      <w:pPr>
+        <w:keepNext w:val="0"/>
+        <w:pageBreakBefore w:val="0"/>
+        <w:widowControl/>
+        <w:spacing w:before="0" w:after="120" w:line="240" w:lineRule="auto"/>
+        <w:ind w:left="425" w:hanging="425"/>
+        <w:jc w:val="both"/>
+      </w:pPr>
+      <w:r>
+        <w:rPr>
+          <w:rFonts w:ascii="Times New Roman" w:hAnsi="Times New Roman" w:eastAsia="Times New Roman"/>
+          <w:b w:val="0"/>
+          <w:i w:val="0"/>
+          <w:color w:val="000000"/>
+          <w:sz w:val="24"/>
+        </w:rPr>
+        <w:t>26. Ilie N, Hickel R. Investigations on mechanical behaviour of dental composites. Clin Oral Investig. 2009;13(4):427-438.</w:t>
+      </w:r>
+    </w:p>
+    <w:p>
+      <w:pPr>
+        <w:keepNext w:val="0"/>
+        <w:pageBreakBefore w:val="0"/>
+        <w:widowControl/>
+        <w:spacing w:before="0" w:after="120" w:line="240" w:lineRule="auto"/>
+        <w:ind w:left="425" w:hanging="425"/>
+        <w:jc w:val="both"/>
+      </w:pPr>
+      <w:r>
+        <w:rPr>
+          <w:rFonts w:ascii="Times New Roman" w:hAnsi="Times New Roman" w:eastAsia="Times New Roman"/>
+          <w:b w:val="0"/>
+          <w:i w:val="0"/>
+          <w:color w:val="000000"/>
+          <w:sz w:val="24"/>
+        </w:rPr>
+        <w:t>27. Ilie N, Hickel R. Resin composite restorative materials. Aust Dent J. 2011;56 Suppl 1:59-66.</w:t>
+      </w:r>
+    </w:p>
+    <w:p>
+      <w:pPr>
+        <w:keepNext w:val="0"/>
+        <w:pageBreakBefore w:val="0"/>
+        <w:widowControl/>
+        <w:spacing w:before="0" w:after="120" w:line="240" w:lineRule="auto"/>
+        <w:ind w:left="425" w:hanging="425"/>
+        <w:jc w:val="both"/>
+      </w:pPr>
+      <w:r>
+        <w:rPr>
+          <w:rFonts w:ascii="Times New Roman" w:hAnsi="Times New Roman" w:eastAsia="Times New Roman"/>
+          <w:b w:val="0"/>
+          <w:i w:val="0"/>
+          <w:color w:val="000000"/>
+          <w:sz w:val="24"/>
+        </w:rPr>
+        <w:t>28. Cavalcante LM, Masouras K, Watts DC, Pimenta LA, Silikas N. Effect of nanofillers’ size on surface properties after toothbrush abrasion. Am J Dent. 2009;22(1):60-64.</w:t>
+      </w:r>
+    </w:p>
+    <w:p>
+      <w:pPr>
+        <w:keepNext w:val="0"/>
+        <w:pageBreakBefore w:val="0"/>
+        <w:widowControl/>
+        <w:spacing w:before="0" w:after="120" w:line="240" w:lineRule="auto"/>
+        <w:ind w:left="425" w:hanging="425"/>
+        <w:jc w:val="both"/>
+      </w:pPr>
+      <w:r>
+        <w:rPr>
+          <w:rFonts w:ascii="Times New Roman" w:hAnsi="Times New Roman" w:eastAsia="Times New Roman"/>
+          <w:b w:val="0"/>
+          <w:i w:val="0"/>
+          <w:color w:val="000000"/>
+          <w:sz w:val="24"/>
+        </w:rPr>
+        <w:t>29. da Costa J, Adams-Belusko A, Riley K, Ferracane JL. The effect of various dentifrices on surface roughness and gloss of resin composites. J Dent. 2010;38 Suppl 2:e123-e128.</w:t>
+      </w:r>
+    </w:p>
+    <w:p>
+      <w:pPr>
+        <w:keepNext w:val="0"/>
+        <w:pageBreakBefore w:val="0"/>
+        <w:widowControl/>
+        <w:spacing w:before="0" w:after="120" w:line="240" w:lineRule="auto"/>
+        <w:ind w:left="425" w:hanging="425"/>
+        <w:jc w:val="both"/>
+      </w:pPr>
+      <w:r>
+        <w:rPr>
+          <w:rFonts w:ascii="Times New Roman" w:hAnsi="Times New Roman" w:eastAsia="Times New Roman"/>
+          <w:b w:val="0"/>
+          <w:i w:val="0"/>
+          <w:color w:val="000000"/>
+          <w:sz w:val="24"/>
+        </w:rPr>
+        <w:t>30. Turssi CP, De Magalhães CS, Serra MC, Rodrigues AL Jr. Surface roughness assessment of resin-based materials during brushing. J Oral Rehabil. 2001;28(7):685-691.</w:t>
+      </w:r>
+    </w:p>
+    <w:p>
+      <w:pPr>
+        <w:keepNext w:val="0"/>
+        <w:pageBreakBefore w:val="0"/>
+        <w:widowControl/>
+        <w:spacing w:before="0" w:after="120" w:line="240" w:lineRule="auto"/>
+        <w:ind w:left="425" w:hanging="425"/>
+        <w:jc w:val="both"/>
+      </w:pPr>
+      <w:r>
+        <w:rPr>
+          <w:rFonts w:ascii="Times New Roman" w:hAnsi="Times New Roman" w:eastAsia="Times New Roman"/>
+          <w:b w:val="0"/>
+          <w:i w:val="0"/>
+          <w:color w:val="000000"/>
+          <w:sz w:val="24"/>
+        </w:rPr>
+        <w:t>31. Kakaboura A, Fragouli M, Rahiotis C, Silikas N. Evaluation of surface characteristics of dental composites using profilometry, scanning electron, atomic force microscopy and gloss-meter. J Mater Sci Mater Med. 2007;18(1):155-163.</w:t>
+      </w:r>
+    </w:p>
+    <w:p>
+      <w:pPr>
+        <w:keepNext w:val="0"/>
+        <w:pageBreakBefore w:val="0"/>
+        <w:widowControl/>
+        <w:spacing w:before="0" w:after="120" w:line="240" w:lineRule="auto"/>
+        <w:ind w:left="425" w:hanging="425"/>
+        <w:jc w:val="both"/>
+      </w:pPr>
+      <w:r>
+        <w:rPr>
+          <w:rFonts w:ascii="Times New Roman" w:hAnsi="Times New Roman" w:eastAsia="Times New Roman"/>
+          <w:b w:val="0"/>
+          <w:i w:val="0"/>
+          <w:color w:val="000000"/>
+          <w:sz w:val="24"/>
+        </w:rPr>
+        <w:t>32. Moraes RR, Ribeiro Ddos S, Klumb MM, Brandt WC, Correr-Sobrinho L, Bueno M. In vitro toothbrushing abrasion of dental resin composites: packable, microhybrid, nanohybrid and microfilled materials. Braz Oral Res. 2008;22(2):112-118.</w:t>
+      </w:r>
+    </w:p>
+    <w:p>
+      <w:pPr>
+        <w:keepNext w:val="0"/>
+        <w:pageBreakBefore w:val="0"/>
+        <w:widowControl/>
+        <w:spacing w:before="0" w:after="120" w:line="240" w:lineRule="auto"/>
+        <w:ind w:left="425" w:hanging="425"/>
+        <w:jc w:val="both"/>
+      </w:pPr>
+      <w:r>
+        <w:rPr>
+          <w:rFonts w:ascii="Times New Roman" w:hAnsi="Times New Roman" w:eastAsia="Times New Roman"/>
+          <w:b w:val="0"/>
+          <w:i w:val="0"/>
+          <w:color w:val="000000"/>
+          <w:sz w:val="24"/>
+        </w:rPr>
+        <w:t>33. Söderholm KJ, Zigan M, Ragan M, Fischlschweiger W, Bergman M. Hydrolytic degradation of dental composites. J Dent Res. 1984;63(10):1248-1254.</w:t>
+      </w:r>
+    </w:p>
+    <w:p>
+      <w:pPr>
+        <w:keepNext w:val="0"/>
+        <w:pageBreakBefore w:val="0"/>
+        <w:widowControl/>
+        <w:spacing w:before="0" w:after="120" w:line="240" w:lineRule="auto"/>
+        <w:ind w:left="425" w:hanging="425"/>
+        <w:jc w:val="both"/>
+      </w:pPr>
+      <w:r>
+        <w:rPr>
+          <w:rFonts w:ascii="Times New Roman" w:hAnsi="Times New Roman" w:eastAsia="Times New Roman"/>
+          <w:b w:val="0"/>
+          <w:i w:val="0"/>
+          <w:color w:val="000000"/>
+          <w:sz w:val="24"/>
+        </w:rPr>
+        <w:t>34. Heintze SD. How to qualify and validate wear simulation devices and methods. Dent Mater. 2006;22(8):712-734.</w:t>
+      </w:r>
+    </w:p>
+    <w:p>
+      <w:pPr>
+        <w:keepNext w:val="0"/>
+        <w:pageBreakBefore w:val="0"/>
+        <w:widowControl/>
+        <w:spacing w:before="0" w:after="120" w:line="240" w:lineRule="auto"/>
+        <w:ind w:left="425" w:hanging="425"/>
+        <w:jc w:val="both"/>
+      </w:pPr>
+      <w:r>
+        <w:rPr>
+          <w:rFonts w:ascii="Times New Roman" w:hAnsi="Times New Roman" w:eastAsia="Times New Roman"/>
+          <w:b w:val="0"/>
+          <w:i w:val="0"/>
+          <w:color w:val="000000"/>
+          <w:sz w:val="24"/>
+        </w:rPr>
+        <w:t>35. Senawongse P, Pongprueksa P. Surface roughness of nanofill and nanohybrid resin composites after polishing and brushing. J Esthet Restor Dent. 2007;19(5):265-273.</w:t>
+      </w:r>
+    </w:p>
+    <w:p>
+      <w:pPr>
+        <w:keepNext w:val="0"/>
+        <w:pageBreakBefore w:val="0"/>
+        <w:widowControl/>
+        <w:spacing w:before="0" w:after="120" w:line="240" w:lineRule="auto"/>
+        <w:ind w:left="425" w:hanging="425"/>
+        <w:jc w:val="both"/>
+      </w:pPr>
+      <w:r>
+        <w:rPr>
+          <w:rFonts w:ascii="Times New Roman" w:hAnsi="Times New Roman" w:eastAsia="Times New Roman"/>
+          <w:b w:val="0"/>
+          <w:i w:val="0"/>
+          <w:color w:val="000000"/>
+          <w:sz w:val="24"/>
+        </w:rPr>
+        <w:t>36. de Oliveira GU, Mondelli RFL, Rodrigues MC, Franco EB, Ishikiriama SK, Wang L. Impact of filler size and distribution on roughness and wear of composite resin after simulated toothbrushing. J Appl Oral Sci. 2012;20(5):510-516.</w:t>
+      </w:r>
+    </w:p>
+    <w:p>
+      <w:pPr>
+        <w:keepNext w:val="0"/>
+        <w:pageBreakBefore w:val="0"/>
+        <w:widowControl/>
+        <w:spacing w:before="0" w:after="120" w:line="240" w:lineRule="auto"/>
+        <w:ind w:left="425" w:hanging="425"/>
+        <w:jc w:val="both"/>
+      </w:pPr>
+      <w:r>
+        <w:rPr>
+          <w:rFonts w:ascii="Times New Roman" w:hAnsi="Times New Roman" w:eastAsia="Times New Roman"/>
+          <w:b w:val="0"/>
+          <w:i w:val="0"/>
+          <w:color w:val="000000"/>
+          <w:sz w:val="24"/>
+        </w:rPr>
+        <w:t>37. Suzuki T, Kyoizumi H, Finger WJ, Kanehira M, Endo T, Utterodt A, Hisamitsu H, Komatsu M. Resistance of nanofill and nanohybrid resin composites to toothbrush abrasion with calcium carbonate slurry. Dent Mater J. 2009;28(6):708-716.</w:t>
       </w:r>
     </w:p>
     <w:p>
@@ -8491,11 +9298,15 @@
       </w:r>
     </w:p>
     <w:sectPr>
-      <w:footerReference w:type="default" r:id="rId13"/>
+      <w:headerReference w:type="default" r:id="rId23"/>
+      <w:headerReference w:type="first" r:id="rId24"/>
+      <w:headerReference w:type="even" r:id="rId25"/>
+      <w:footerReference w:type="default" r:id="rId26"/>
+      <w:footerReference w:type="first" r:id="rId27"/>
+      <w:footerReference w:type="even" r:id="rId28"/>
       <w:pgSz w:w="11906" w:h="16838"/>
-      <w:pgMar w:top="1417" w:right="1417" w:bottom="1417" w:left="1701" w:header="0" w:footer="0" w:gutter="0"/>
+      <w:pgMar w:top="2098" w:right="1417" w:bottom="1417" w:left="1701" w:header="227" w:footer="680" w:gutter="0"/>
       <w:cols w:space="720"/>
-      <w:titlePg/>
       <w:docGrid w:linePitch="360"/>
       <w:pgNumType w:fmt="decimal" w:start="1"/>
     </w:sectPr>
@@ -8518,30 +9329,22 @@
   <w:p>
     <w:pPr>
       <w:pStyle w:val="Footer"/>
-      <w:keepNext w:val="0"/>
-      <w:pageBreakBefore w:val="0"/>
-      <w:widowControl/>
-      <w:spacing w:before="0" w:after="0" w:line="240" w:lineRule="auto"/>
-      <w:ind w:firstLine="0"/>
-      <w:jc w:val="center"/>
     </w:pPr>
-    <w:r>
-      <w:rPr>
-        <w:rFonts w:ascii="Times New Roman" w:hAnsi="Times New Roman" w:eastAsia="Times New Roman"/>
-        <w:b w:val="0"/>
-        <w:i w:val="0"/>
-        <w:color w:val="000000"/>
-        <w:sz w:val="24"/>
-      </w:rPr>
-      <w:fldChar w:fldCharType="begin"/>
-      <w:instrText xml:space="preserve"> PAGE \* roman </w:instrText>
-      <w:fldChar w:fldCharType="end"/>
-    </w:r>
   </w:p>
 </w:ftr>
 </file>
 
 <file path=word/footer3.xml><?xml version="1.0" encoding="utf-8"?>
+<w:ftr xmlns:m="http://schemas.openxmlformats.org/officeDocument/2006/math" xmlns:mc="http://schemas.openxmlformats.org/markup-compatibility/2006" xmlns:mo="http://schemas.microsoft.com/office/mac/office/2008/main" xmlns:mv="urn:schemas-microsoft-com:mac:vml" xmlns:o="urn:schemas-microsoft-com:office:office" xmlns:r="http://schemas.openxmlformats.org/officeDocument/2006/relationships" xmlns:v="urn:schemas-microsoft-com:vml" xmlns:w10="urn:schemas-microsoft-com:office:word" xmlns:w14="http://schemas.microsoft.com/office/word/2010/wordml" xmlns:w="http://schemas.openxmlformats.org/wordprocessingml/2006/main" xmlns:wne="http://schemas.microsoft.com/office/word/2006/wordml" xmlns:wp14="http://schemas.microsoft.com/office/word/2010/wordprocessingDrawing" xmlns:wp="http://schemas.openxmlformats.org/drawingml/2006/wordprocessingDrawing" xmlns:wpc="http://schemas.microsoft.com/office/word/2010/wordprocessingCanvas" xmlns:wpg="http://schemas.microsoft.com/office/word/2010/wordprocessingGroup" xmlns:wpi="http://schemas.microsoft.com/office/word/2010/wordprocessingInk" xmlns:wps="http://schemas.microsoft.com/office/word/2010/wordprocessingShape" mc:Ignorable="w14 wp14">
+  <w:p>
+    <w:pPr>
+      <w:pStyle w:val="Footer"/>
+    </w:pPr>
+  </w:p>
+</w:ftr>
+</file>
+
+<file path=word/footer4.xml><?xml version="1.0" encoding="utf-8"?>
 <w:ftr xmlns:m="http://schemas.openxmlformats.org/officeDocument/2006/math" xmlns:mc="http://schemas.openxmlformats.org/markup-compatibility/2006" xmlns:mo="http://schemas.microsoft.com/office/mac/office/2008/main" xmlns:mv="urn:schemas-microsoft-com:mac:vml" xmlns:o="urn:schemas-microsoft-com:office:office" xmlns:r="http://schemas.openxmlformats.org/officeDocument/2006/relationships" xmlns:v="urn:schemas-microsoft-com:vml" xmlns:w10="urn:schemas-microsoft-com:office:word" xmlns:w14="http://schemas.microsoft.com/office/word/2010/wordml" xmlns:w="http://schemas.openxmlformats.org/wordprocessingml/2006/main" xmlns:wne="http://schemas.microsoft.com/office/word/2006/wordml" xmlns:wp14="http://schemas.microsoft.com/office/word/2010/wordprocessingDrawing" xmlns:wp="http://schemas.openxmlformats.org/drawingml/2006/wordprocessingDrawing" xmlns:wpc="http://schemas.microsoft.com/office/word/2010/wordprocessingCanvas" xmlns:wpg="http://schemas.microsoft.com/office/word/2010/wordprocessingGroup" xmlns:wpi="http://schemas.microsoft.com/office/word/2010/wordprocessingInk" xmlns:wps="http://schemas.microsoft.com/office/word/2010/wordprocessingShape" mc:Ignorable="w14 wp14">
   <w:p>
     <w:pPr>
@@ -8562,11 +9365,619 @@
         <w:sz w:val="24"/>
       </w:rPr>
       <w:fldChar w:fldCharType="begin"/>
+      <w:instrText xml:space="preserve"> PAGE \* roman </w:instrText>
+      <w:fldChar w:fldCharType="end"/>
+    </w:r>
+  </w:p>
+</w:ftr>
+</file>
+
+<file path=word/footer5.xml><?xml version="1.0" encoding="utf-8"?>
+<w:ftr xmlns:m="http://schemas.openxmlformats.org/officeDocument/2006/math" xmlns:mc="http://schemas.openxmlformats.org/markup-compatibility/2006" xmlns:mo="http://schemas.microsoft.com/office/mac/office/2008/main" xmlns:mv="urn:schemas-microsoft-com:mac:vml" xmlns:o="urn:schemas-microsoft-com:office:office" xmlns:r="http://schemas.openxmlformats.org/officeDocument/2006/relationships" xmlns:v="urn:schemas-microsoft-com:vml" xmlns:w10="urn:schemas-microsoft-com:office:word" xmlns:w14="http://schemas.microsoft.com/office/word/2010/wordml" xmlns:w="http://schemas.openxmlformats.org/wordprocessingml/2006/main" xmlns:wne="http://schemas.microsoft.com/office/word/2006/wordml" xmlns:wp14="http://schemas.microsoft.com/office/word/2010/wordprocessingDrawing" xmlns:wp="http://schemas.openxmlformats.org/drawingml/2006/wordprocessingDrawing" xmlns:wpc="http://schemas.microsoft.com/office/word/2010/wordprocessingCanvas" xmlns:wpg="http://schemas.microsoft.com/office/word/2010/wordprocessingGroup" xmlns:wpi="http://schemas.microsoft.com/office/word/2010/wordprocessingInk" xmlns:wps="http://schemas.microsoft.com/office/word/2010/wordprocessingShape" mc:Ignorable="w14 wp14">
+  <w:p>
+    <w:pPr>
+      <w:pStyle w:val="Footer"/>
+      <w:keepNext w:val="0"/>
+      <w:pageBreakBefore w:val="0"/>
+      <w:widowControl/>
+      <w:spacing w:before="0" w:after="0" w:line="240" w:lineRule="auto"/>
+      <w:ind w:firstLine="0"/>
+      <w:jc w:val="center"/>
+    </w:pPr>
+    <w:r>
+      <w:rPr>
+        <w:rFonts w:ascii="Times New Roman" w:hAnsi="Times New Roman" w:eastAsia="Times New Roman"/>
+        <w:b w:val="0"/>
+        <w:i w:val="0"/>
+        <w:color w:val="000000"/>
+        <w:sz w:val="24"/>
+      </w:rPr>
+      <w:fldChar w:fldCharType="begin"/>
+      <w:instrText xml:space="preserve"> PAGE \* roman </w:instrText>
+      <w:fldChar w:fldCharType="end"/>
+    </w:r>
+  </w:p>
+</w:ftr>
+</file>
+
+<file path=word/footer6.xml><?xml version="1.0" encoding="utf-8"?>
+<w:ftr xmlns:m="http://schemas.openxmlformats.org/officeDocument/2006/math" xmlns:mc="http://schemas.openxmlformats.org/markup-compatibility/2006" xmlns:mo="http://schemas.microsoft.com/office/mac/office/2008/main" xmlns:mv="urn:schemas-microsoft-com:mac:vml" xmlns:o="urn:schemas-microsoft-com:office:office" xmlns:r="http://schemas.openxmlformats.org/officeDocument/2006/relationships" xmlns:v="urn:schemas-microsoft-com:vml" xmlns:w10="urn:schemas-microsoft-com:office:word" xmlns:w14="http://schemas.microsoft.com/office/word/2010/wordml" xmlns:w="http://schemas.openxmlformats.org/wordprocessingml/2006/main" xmlns:wne="http://schemas.microsoft.com/office/word/2006/wordml" xmlns:wp14="http://schemas.microsoft.com/office/word/2010/wordprocessingDrawing" xmlns:wp="http://schemas.openxmlformats.org/drawingml/2006/wordprocessingDrawing" xmlns:wpc="http://schemas.microsoft.com/office/word/2010/wordprocessingCanvas" xmlns:wpg="http://schemas.microsoft.com/office/word/2010/wordprocessingGroup" xmlns:wpi="http://schemas.microsoft.com/office/word/2010/wordprocessingInk" xmlns:wps="http://schemas.microsoft.com/office/word/2010/wordprocessingShape" mc:Ignorable="w14 wp14">
+  <w:p>
+    <w:pPr>
+      <w:pStyle w:val="Footer"/>
+      <w:keepNext w:val="0"/>
+      <w:pageBreakBefore w:val="0"/>
+      <w:widowControl/>
+      <w:spacing w:before="0" w:after="0" w:line="240" w:lineRule="auto"/>
+      <w:ind w:firstLine="0"/>
+      <w:jc w:val="center"/>
+    </w:pPr>
+    <w:r>
+      <w:rPr>
+        <w:rFonts w:ascii="Times New Roman" w:hAnsi="Times New Roman" w:eastAsia="Times New Roman"/>
+        <w:b w:val="0"/>
+        <w:i w:val="0"/>
+        <w:color w:val="000000"/>
+        <w:sz w:val="24"/>
+      </w:rPr>
+      <w:fldChar w:fldCharType="begin"/>
+      <w:instrText xml:space="preserve"> PAGE \* roman </w:instrText>
+      <w:fldChar w:fldCharType="end"/>
+    </w:r>
+  </w:p>
+</w:ftr>
+</file>
+
+<file path=word/footer7.xml><?xml version="1.0" encoding="utf-8"?>
+<w:ftr xmlns:m="http://schemas.openxmlformats.org/officeDocument/2006/math" xmlns:mc="http://schemas.openxmlformats.org/markup-compatibility/2006" xmlns:mo="http://schemas.microsoft.com/office/mac/office/2008/main" xmlns:mv="urn:schemas-microsoft-com:mac:vml" xmlns:o="urn:schemas-microsoft-com:office:office" xmlns:r="http://schemas.openxmlformats.org/officeDocument/2006/relationships" xmlns:v="urn:schemas-microsoft-com:vml" xmlns:w10="urn:schemas-microsoft-com:office:word" xmlns:w14="http://schemas.microsoft.com/office/word/2010/wordml" xmlns:w="http://schemas.openxmlformats.org/wordprocessingml/2006/main" xmlns:wne="http://schemas.microsoft.com/office/word/2006/wordml" xmlns:wp14="http://schemas.microsoft.com/office/word/2010/wordprocessingDrawing" xmlns:wp="http://schemas.openxmlformats.org/drawingml/2006/wordprocessingDrawing" xmlns:wpc="http://schemas.microsoft.com/office/word/2010/wordprocessingCanvas" xmlns:wpg="http://schemas.microsoft.com/office/word/2010/wordprocessingGroup" xmlns:wpi="http://schemas.microsoft.com/office/word/2010/wordprocessingInk" xmlns:wps="http://schemas.microsoft.com/office/word/2010/wordprocessingShape" mc:Ignorable="w14 wp14">
+  <w:p>
+    <w:pPr>
+      <w:pStyle w:val="Footer"/>
+      <w:keepNext w:val="0"/>
+      <w:pageBreakBefore w:val="0"/>
+      <w:widowControl/>
+      <w:spacing w:before="0" w:after="0" w:line="240" w:lineRule="auto"/>
+      <w:ind w:firstLine="0"/>
+      <w:jc w:val="center"/>
+    </w:pPr>
+    <w:r>
+      <w:rPr>
+        <w:rFonts w:ascii="Times New Roman" w:hAnsi="Times New Roman" w:eastAsia="Times New Roman"/>
+        <w:b w:val="0"/>
+        <w:i w:val="0"/>
+        <w:color w:val="000000"/>
+        <w:sz w:val="24"/>
+      </w:rPr>
+      <w:fldChar w:fldCharType="begin"/>
       <w:instrText xml:space="preserve"> PAGE \* decimal </w:instrText>
       <w:fldChar w:fldCharType="end"/>
     </w:r>
   </w:p>
 </w:ftr>
+</file>
+
+<file path=word/footer8.xml><?xml version="1.0" encoding="utf-8"?>
+<w:ftr xmlns:m="http://schemas.openxmlformats.org/officeDocument/2006/math" xmlns:mc="http://schemas.openxmlformats.org/markup-compatibility/2006" xmlns:mo="http://schemas.microsoft.com/office/mac/office/2008/main" xmlns:mv="urn:schemas-microsoft-com:mac:vml" xmlns:o="urn:schemas-microsoft-com:office:office" xmlns:r="http://schemas.openxmlformats.org/officeDocument/2006/relationships" xmlns:v="urn:schemas-microsoft-com:vml" xmlns:w10="urn:schemas-microsoft-com:office:word" xmlns:w14="http://schemas.microsoft.com/office/word/2010/wordml" xmlns:w="http://schemas.openxmlformats.org/wordprocessingml/2006/main" xmlns:wne="http://schemas.microsoft.com/office/word/2006/wordml" xmlns:wp14="http://schemas.microsoft.com/office/word/2010/wordprocessingDrawing" xmlns:wp="http://schemas.openxmlformats.org/drawingml/2006/wordprocessingDrawing" xmlns:wpc="http://schemas.microsoft.com/office/word/2010/wordprocessingCanvas" xmlns:wpg="http://schemas.microsoft.com/office/word/2010/wordprocessingGroup" xmlns:wpi="http://schemas.microsoft.com/office/word/2010/wordprocessingInk" xmlns:wps="http://schemas.microsoft.com/office/word/2010/wordprocessingShape" mc:Ignorable="w14 wp14">
+  <w:p>
+    <w:pPr>
+      <w:pStyle w:val="Footer"/>
+      <w:keepNext w:val="0"/>
+      <w:pageBreakBefore w:val="0"/>
+      <w:widowControl/>
+      <w:spacing w:before="0" w:after="0" w:line="240" w:lineRule="auto"/>
+      <w:ind w:firstLine="0"/>
+      <w:jc w:val="center"/>
+    </w:pPr>
+    <w:r>
+      <w:rPr>
+        <w:rFonts w:ascii="Times New Roman" w:hAnsi="Times New Roman" w:eastAsia="Times New Roman"/>
+        <w:b w:val="0"/>
+        <w:i w:val="0"/>
+        <w:color w:val="000000"/>
+        <w:sz w:val="24"/>
+      </w:rPr>
+      <w:fldChar w:fldCharType="begin"/>
+      <w:instrText xml:space="preserve"> PAGE \* decimal </w:instrText>
+      <w:fldChar w:fldCharType="end"/>
+    </w:r>
+  </w:p>
+</w:ftr>
+</file>
+
+<file path=word/footer9.xml><?xml version="1.0" encoding="utf-8"?>
+<w:ftr xmlns:m="http://schemas.openxmlformats.org/officeDocument/2006/math" xmlns:mc="http://schemas.openxmlformats.org/markup-compatibility/2006" xmlns:mo="http://schemas.microsoft.com/office/mac/office/2008/main" xmlns:mv="urn:schemas-microsoft-com:mac:vml" xmlns:o="urn:schemas-microsoft-com:office:office" xmlns:r="http://schemas.openxmlformats.org/officeDocument/2006/relationships" xmlns:v="urn:schemas-microsoft-com:vml" xmlns:w10="urn:schemas-microsoft-com:office:word" xmlns:w14="http://schemas.microsoft.com/office/word/2010/wordml" xmlns:w="http://schemas.openxmlformats.org/wordprocessingml/2006/main" xmlns:wne="http://schemas.microsoft.com/office/word/2006/wordml" xmlns:wp14="http://schemas.microsoft.com/office/word/2010/wordprocessingDrawing" xmlns:wp="http://schemas.openxmlformats.org/drawingml/2006/wordprocessingDrawing" xmlns:wpc="http://schemas.microsoft.com/office/word/2010/wordprocessingCanvas" xmlns:wpg="http://schemas.microsoft.com/office/word/2010/wordprocessingGroup" xmlns:wpi="http://schemas.microsoft.com/office/word/2010/wordprocessingInk" xmlns:wps="http://schemas.microsoft.com/office/word/2010/wordprocessingShape" mc:Ignorable="w14 wp14">
+  <w:p>
+    <w:pPr>
+      <w:pStyle w:val="Footer"/>
+      <w:keepNext w:val="0"/>
+      <w:pageBreakBefore w:val="0"/>
+      <w:widowControl/>
+      <w:spacing w:before="0" w:after="0" w:line="240" w:lineRule="auto"/>
+      <w:ind w:firstLine="0"/>
+      <w:jc w:val="center"/>
+    </w:pPr>
+    <w:r>
+      <w:rPr>
+        <w:rFonts w:ascii="Times New Roman" w:hAnsi="Times New Roman" w:eastAsia="Times New Roman"/>
+        <w:b w:val="0"/>
+        <w:i w:val="0"/>
+        <w:color w:val="000000"/>
+        <w:sz w:val="24"/>
+      </w:rPr>
+      <w:fldChar w:fldCharType="begin"/>
+      <w:instrText xml:space="preserve"> PAGE \* decimal </w:instrText>
+      <w:fldChar w:fldCharType="end"/>
+    </w:r>
+  </w:p>
+</w:ftr>
+</file>
+
+<file path=word/header1.xml><?xml version="1.0" encoding="utf-8"?>
+<w:hdr xmlns:m="http://schemas.openxmlformats.org/officeDocument/2006/math" xmlns:mc="http://schemas.openxmlformats.org/markup-compatibility/2006" xmlns:mo="http://schemas.microsoft.com/office/mac/office/2008/main" xmlns:mv="urn:schemas-microsoft-com:mac:vml" xmlns:o="urn:schemas-microsoft-com:office:office" xmlns:r="http://schemas.openxmlformats.org/officeDocument/2006/relationships" xmlns:v="urn:schemas-microsoft-com:vml" xmlns:w10="urn:schemas-microsoft-com:office:word" xmlns:w14="http://schemas.microsoft.com/office/word/2010/wordml" xmlns:w="http://schemas.openxmlformats.org/wordprocessingml/2006/main" xmlns:wne="http://schemas.microsoft.com/office/word/2006/wordml" xmlns:wp14="http://schemas.microsoft.com/office/word/2010/wordprocessingDrawing" xmlns:wp="http://schemas.openxmlformats.org/drawingml/2006/wordprocessingDrawing" xmlns:wpc="http://schemas.microsoft.com/office/word/2010/wordprocessingCanvas" xmlns:wpg="http://schemas.microsoft.com/office/word/2010/wordprocessingGroup" xmlns:wpi="http://schemas.microsoft.com/office/word/2010/wordprocessingInk" xmlns:wps="http://schemas.microsoft.com/office/word/2010/wordprocessingShape" mc:Ignorable="w14 wp14">
+  <w:p>
+    <w:pPr>
+      <w:pStyle w:val="Header"/>
+    </w:pPr>
+  </w:p>
+</w:hdr>
+</file>
+
+<file path=word/header2.xml><?xml version="1.0" encoding="utf-8"?>
+<w:hdr xmlns:m="http://schemas.openxmlformats.org/officeDocument/2006/math" xmlns:mc="http://schemas.openxmlformats.org/markup-compatibility/2006" xmlns:mo="http://schemas.microsoft.com/office/mac/office/2008/main" xmlns:mv="urn:schemas-microsoft-com:mac:vml" xmlns:o="urn:schemas-microsoft-com:office:office" xmlns:r="http://schemas.openxmlformats.org/officeDocument/2006/relationships" xmlns:v="urn:schemas-microsoft-com:vml" xmlns:w10="urn:schemas-microsoft-com:office:word" xmlns:w14="http://schemas.microsoft.com/office/word/2010/wordml" xmlns:w="http://schemas.openxmlformats.org/wordprocessingml/2006/main" xmlns:wne="http://schemas.microsoft.com/office/word/2006/wordml" xmlns:wp14="http://schemas.microsoft.com/office/word/2010/wordprocessingDrawing" xmlns:wp="http://schemas.openxmlformats.org/drawingml/2006/wordprocessingDrawing" xmlns:wpc="http://schemas.microsoft.com/office/word/2010/wordprocessingCanvas" xmlns:wpg="http://schemas.microsoft.com/office/word/2010/wordprocessingGroup" xmlns:wpi="http://schemas.microsoft.com/office/word/2010/wordprocessingInk" xmlns:wps="http://schemas.microsoft.com/office/word/2010/wordprocessingShape" mc:Ignorable="w14 wp14">
+  <w:p>
+    <w:pPr>
+      <w:pStyle w:val="Header"/>
+    </w:pPr>
+  </w:p>
+</w:hdr>
+</file>
+
+<file path=word/header3.xml><?xml version="1.0" encoding="utf-8"?>
+<w:hdr xmlns:m="http://schemas.openxmlformats.org/officeDocument/2006/math" xmlns:mc="http://schemas.openxmlformats.org/markup-compatibility/2006" xmlns:mo="http://schemas.microsoft.com/office/mac/office/2008/main" xmlns:mv="urn:schemas-microsoft-com:mac:vml" xmlns:o="urn:schemas-microsoft-com:office:office" xmlns:r="http://schemas.openxmlformats.org/officeDocument/2006/relationships" xmlns:v="urn:schemas-microsoft-com:vml" xmlns:w10="urn:schemas-microsoft-com:office:word" xmlns:w14="http://schemas.microsoft.com/office/word/2010/wordml" xmlns:w="http://schemas.openxmlformats.org/wordprocessingml/2006/main" xmlns:wne="http://schemas.microsoft.com/office/word/2006/wordml" xmlns:wp14="http://schemas.microsoft.com/office/word/2010/wordprocessingDrawing" xmlns:wp="http://schemas.openxmlformats.org/drawingml/2006/wordprocessingDrawing" xmlns:wpc="http://schemas.microsoft.com/office/word/2010/wordprocessingCanvas" xmlns:wpg="http://schemas.microsoft.com/office/word/2010/wordprocessingGroup" xmlns:wpi="http://schemas.microsoft.com/office/word/2010/wordprocessingInk" xmlns:wps="http://schemas.microsoft.com/office/word/2010/wordprocessingShape" mc:Ignorable="w14 wp14">
+  <w:p>
+    <w:pPr>
+      <w:pStyle w:val="Header"/>
+    </w:pPr>
+  </w:p>
+</w:hdr>
+</file>
+
+<file path=word/header4.xml><?xml version="1.0" encoding="utf-8"?>
+<w:hdr xmlns:m="http://schemas.openxmlformats.org/officeDocument/2006/math" xmlns:mc="http://schemas.openxmlformats.org/markup-compatibility/2006" xmlns:mo="http://schemas.microsoft.com/office/mac/office/2008/main" xmlns:mv="urn:schemas-microsoft-com:mac:vml" xmlns:o="urn:schemas-microsoft-com:office:office" xmlns:r="http://schemas.openxmlformats.org/officeDocument/2006/relationships" xmlns:v="urn:schemas-microsoft-com:vml" xmlns:w10="urn:schemas-microsoft-com:office:word" xmlns:w14="http://schemas.microsoft.com/office/word/2010/wordml" xmlns:w="http://schemas.openxmlformats.org/wordprocessingml/2006/main" xmlns:wne="http://schemas.microsoft.com/office/word/2006/wordml" xmlns:wp14="http://schemas.microsoft.com/office/word/2010/wordprocessingDrawing" xmlns:wp="http://schemas.openxmlformats.org/drawingml/2006/wordprocessingDrawing" xmlns:wpc="http://schemas.microsoft.com/office/word/2010/wordprocessingCanvas" xmlns:wpg="http://schemas.microsoft.com/office/word/2010/wordprocessingGroup" xmlns:wpi="http://schemas.microsoft.com/office/word/2010/wordprocessingInk" xmlns:wps="http://schemas.microsoft.com/office/word/2010/wordprocessingShape" mc:Ignorable="w14 wp14">
+  <w:p>
+    <w:pPr>
+      <w:pStyle w:val="Header"/>
+      <w:keepNext w:val="0"/>
+      <w:pageBreakBefore w:val="0"/>
+      <w:widowControl/>
+      <w:spacing w:before="0" w:after="0" w:line="240" w:lineRule="auto"/>
+      <w:ind w:firstLine="0"/>
+      <w:jc w:val="center"/>
+    </w:pPr>
+    <w:r>
+      <w:drawing>
+        <wp:inline xmlns:a="http://schemas.openxmlformats.org/drawingml/2006/main" xmlns:pic="http://schemas.openxmlformats.org/drawingml/2006/picture">
+          <wp:extent cx="1982880" cy="486000"/>
+          <wp:docPr id="1" name="Picture 1"/>
+          <wp:cNvGraphicFramePr>
+            <a:graphicFrameLocks noChangeAspect="1"/>
+          </wp:cNvGraphicFramePr>
+          <a:graphic>
+            <a:graphicData uri="http://schemas.openxmlformats.org/drawingml/2006/picture">
+              <pic:pic>
+                <pic:nvPicPr>
+                  <pic:cNvPr id="0" name="pua_logo_official.png"/>
+                  <pic:cNvPicPr/>
+                </pic:nvPicPr>
+                <pic:blipFill>
+                  <a:blip r:embed="rId1"/>
+                  <a:stretch>
+                    <a:fillRect/>
+                  </a:stretch>
+                </pic:blipFill>
+                <pic:spPr>
+                  <a:xfrm>
+                    <a:off x="0" y="0"/>
+                    <a:ext cx="1982880" cy="486000"/>
+                  </a:xfrm>
+                  <a:prstGeom prst="rect"/>
+                </pic:spPr>
+              </pic:pic>
+            </a:graphicData>
+          </a:graphic>
+        </wp:inline>
+      </w:drawing>
+    </w:r>
+  </w:p>
+  <w:p>
+    <w:pPr>
+      <w:keepNext w:val="0"/>
+      <w:pageBreakBefore w:val="0"/>
+      <w:widowControl/>
+      <w:spacing w:before="20" w:after="0" w:line="240" w:lineRule="auto"/>
+      <w:ind w:firstLine="0"/>
+      <w:jc w:val="center"/>
+      <w:pBdr>
+        <w:bottom w:val="single" w:sz="8" w:space="3" w:color="1B3A6B"/>
+      </w:pBdr>
+    </w:pPr>
+    <w:r>
+      <w:rPr>
+        <w:rFonts w:ascii="Times New Roman" w:hAnsi="Times New Roman" w:eastAsia="Times New Roman"/>
+        <w:b w:val="0"/>
+        <w:i/>
+        <w:color w:val="000000"/>
+        <w:sz w:val="18"/>
+      </w:rPr>
+      <w:t>Faculty of Dentistry — Pharos University in Alexandria</w:t>
+    </w:r>
+  </w:p>
+</w:hdr>
+</file>
+
+<file path=word/header5.xml><?xml version="1.0" encoding="utf-8"?>
+<w:hdr xmlns:m="http://schemas.openxmlformats.org/officeDocument/2006/math" xmlns:mc="http://schemas.openxmlformats.org/markup-compatibility/2006" xmlns:mo="http://schemas.microsoft.com/office/mac/office/2008/main" xmlns:mv="urn:schemas-microsoft-com:mac:vml" xmlns:o="urn:schemas-microsoft-com:office:office" xmlns:r="http://schemas.openxmlformats.org/officeDocument/2006/relationships" xmlns:v="urn:schemas-microsoft-com:vml" xmlns:w10="urn:schemas-microsoft-com:office:word" xmlns:w14="http://schemas.microsoft.com/office/word/2010/wordml" xmlns:w="http://schemas.openxmlformats.org/wordprocessingml/2006/main" xmlns:wne="http://schemas.microsoft.com/office/word/2006/wordml" xmlns:wp14="http://schemas.microsoft.com/office/word/2010/wordprocessingDrawing" xmlns:wp="http://schemas.openxmlformats.org/drawingml/2006/wordprocessingDrawing" xmlns:wpc="http://schemas.microsoft.com/office/word/2010/wordprocessingCanvas" xmlns:wpg="http://schemas.microsoft.com/office/word/2010/wordprocessingGroup" xmlns:wpi="http://schemas.microsoft.com/office/word/2010/wordprocessingInk" xmlns:wps="http://schemas.microsoft.com/office/word/2010/wordprocessingShape" mc:Ignorable="w14 wp14">
+  <w:p>
+    <w:pPr>
+      <w:pStyle w:val="Header"/>
+      <w:keepNext w:val="0"/>
+      <w:pageBreakBefore w:val="0"/>
+      <w:widowControl/>
+      <w:spacing w:before="0" w:after="0" w:line="240" w:lineRule="auto"/>
+      <w:ind w:firstLine="0"/>
+      <w:jc w:val="center"/>
+    </w:pPr>
+    <w:r>
+      <w:drawing>
+        <wp:inline xmlns:a="http://schemas.openxmlformats.org/drawingml/2006/main" xmlns:pic="http://schemas.openxmlformats.org/drawingml/2006/picture">
+          <wp:extent cx="1982880" cy="486000"/>
+          <wp:docPr id="1" name="Picture 1"/>
+          <wp:cNvGraphicFramePr>
+            <a:graphicFrameLocks noChangeAspect="1"/>
+          </wp:cNvGraphicFramePr>
+          <a:graphic>
+            <a:graphicData uri="http://schemas.openxmlformats.org/drawingml/2006/picture">
+              <pic:pic>
+                <pic:nvPicPr>
+                  <pic:cNvPr id="0" name="pua_logo_official.png"/>
+                  <pic:cNvPicPr/>
+                </pic:nvPicPr>
+                <pic:blipFill>
+                  <a:blip r:embed="rId1"/>
+                  <a:stretch>
+                    <a:fillRect/>
+                  </a:stretch>
+                </pic:blipFill>
+                <pic:spPr>
+                  <a:xfrm>
+                    <a:off x="0" y="0"/>
+                    <a:ext cx="1982880" cy="486000"/>
+                  </a:xfrm>
+                  <a:prstGeom prst="rect"/>
+                </pic:spPr>
+              </pic:pic>
+            </a:graphicData>
+          </a:graphic>
+        </wp:inline>
+      </w:drawing>
+    </w:r>
+  </w:p>
+  <w:p>
+    <w:pPr>
+      <w:keepNext w:val="0"/>
+      <w:pageBreakBefore w:val="0"/>
+      <w:widowControl/>
+      <w:spacing w:before="20" w:after="0" w:line="240" w:lineRule="auto"/>
+      <w:ind w:firstLine="0"/>
+      <w:jc w:val="center"/>
+      <w:pBdr>
+        <w:bottom w:val="single" w:sz="8" w:space="3" w:color="1B3A6B"/>
+      </w:pBdr>
+    </w:pPr>
+    <w:r>
+      <w:rPr>
+        <w:rFonts w:ascii="Times New Roman" w:hAnsi="Times New Roman" w:eastAsia="Times New Roman"/>
+        <w:b w:val="0"/>
+        <w:i/>
+        <w:color w:val="000000"/>
+        <w:sz w:val="18"/>
+      </w:rPr>
+      <w:t>Faculty of Dentistry — Pharos University in Alexandria</w:t>
+    </w:r>
+  </w:p>
+</w:hdr>
+</file>
+
+<file path=word/header6.xml><?xml version="1.0" encoding="utf-8"?>
+<w:hdr xmlns:m="http://schemas.openxmlformats.org/officeDocument/2006/math" xmlns:mc="http://schemas.openxmlformats.org/markup-compatibility/2006" xmlns:mo="http://schemas.microsoft.com/office/mac/office/2008/main" xmlns:mv="urn:schemas-microsoft-com:mac:vml" xmlns:o="urn:schemas-microsoft-com:office:office" xmlns:r="http://schemas.openxmlformats.org/officeDocument/2006/relationships" xmlns:v="urn:schemas-microsoft-com:vml" xmlns:w10="urn:schemas-microsoft-com:office:word" xmlns:w14="http://schemas.microsoft.com/office/word/2010/wordml" xmlns:w="http://schemas.openxmlformats.org/wordprocessingml/2006/main" xmlns:wne="http://schemas.microsoft.com/office/word/2006/wordml" xmlns:wp14="http://schemas.microsoft.com/office/word/2010/wordprocessingDrawing" xmlns:wp="http://schemas.openxmlformats.org/drawingml/2006/wordprocessingDrawing" xmlns:wpc="http://schemas.microsoft.com/office/word/2010/wordprocessingCanvas" xmlns:wpg="http://schemas.microsoft.com/office/word/2010/wordprocessingGroup" xmlns:wpi="http://schemas.microsoft.com/office/word/2010/wordprocessingInk" xmlns:wps="http://schemas.microsoft.com/office/word/2010/wordprocessingShape" mc:Ignorable="w14 wp14">
+  <w:p>
+    <w:pPr>
+      <w:pStyle w:val="Header"/>
+      <w:keepNext w:val="0"/>
+      <w:pageBreakBefore w:val="0"/>
+      <w:widowControl/>
+      <w:spacing w:before="0" w:after="0" w:line="240" w:lineRule="auto"/>
+      <w:ind w:firstLine="0"/>
+      <w:jc w:val="center"/>
+    </w:pPr>
+    <w:r>
+      <w:drawing>
+        <wp:inline xmlns:a="http://schemas.openxmlformats.org/drawingml/2006/main" xmlns:pic="http://schemas.openxmlformats.org/drawingml/2006/picture">
+          <wp:extent cx="1982880" cy="486000"/>
+          <wp:docPr id="1" name="Picture 1"/>
+          <wp:cNvGraphicFramePr>
+            <a:graphicFrameLocks noChangeAspect="1"/>
+          </wp:cNvGraphicFramePr>
+          <a:graphic>
+            <a:graphicData uri="http://schemas.openxmlformats.org/drawingml/2006/picture">
+              <pic:pic>
+                <pic:nvPicPr>
+                  <pic:cNvPr id="0" name="pua_logo_official.png"/>
+                  <pic:cNvPicPr/>
+                </pic:nvPicPr>
+                <pic:blipFill>
+                  <a:blip r:embed="rId1"/>
+                  <a:stretch>
+                    <a:fillRect/>
+                  </a:stretch>
+                </pic:blipFill>
+                <pic:spPr>
+                  <a:xfrm>
+                    <a:off x="0" y="0"/>
+                    <a:ext cx="1982880" cy="486000"/>
+                  </a:xfrm>
+                  <a:prstGeom prst="rect"/>
+                </pic:spPr>
+              </pic:pic>
+            </a:graphicData>
+          </a:graphic>
+        </wp:inline>
+      </w:drawing>
+    </w:r>
+  </w:p>
+  <w:p>
+    <w:pPr>
+      <w:keepNext w:val="0"/>
+      <w:pageBreakBefore w:val="0"/>
+      <w:widowControl/>
+      <w:spacing w:before="20" w:after="0" w:line="240" w:lineRule="auto"/>
+      <w:ind w:firstLine="0"/>
+      <w:jc w:val="center"/>
+      <w:pBdr>
+        <w:bottom w:val="single" w:sz="8" w:space="3" w:color="1B3A6B"/>
+      </w:pBdr>
+    </w:pPr>
+    <w:r>
+      <w:rPr>
+        <w:rFonts w:ascii="Times New Roman" w:hAnsi="Times New Roman" w:eastAsia="Times New Roman"/>
+        <w:b w:val="0"/>
+        <w:i/>
+        <w:color w:val="000000"/>
+        <w:sz w:val="18"/>
+      </w:rPr>
+      <w:t>Faculty of Dentistry — Pharos University in Alexandria</w:t>
+    </w:r>
+  </w:p>
+</w:hdr>
+</file>
+
+<file path=word/header7.xml><?xml version="1.0" encoding="utf-8"?>
+<w:hdr xmlns:m="http://schemas.openxmlformats.org/officeDocument/2006/math" xmlns:mc="http://schemas.openxmlformats.org/markup-compatibility/2006" xmlns:mo="http://schemas.microsoft.com/office/mac/office/2008/main" xmlns:mv="urn:schemas-microsoft-com:mac:vml" xmlns:o="urn:schemas-microsoft-com:office:office" xmlns:r="http://schemas.openxmlformats.org/officeDocument/2006/relationships" xmlns:v="urn:schemas-microsoft-com:vml" xmlns:w10="urn:schemas-microsoft-com:office:word" xmlns:w14="http://schemas.microsoft.com/office/word/2010/wordml" xmlns:w="http://schemas.openxmlformats.org/wordprocessingml/2006/main" xmlns:wne="http://schemas.microsoft.com/office/word/2006/wordml" xmlns:wp14="http://schemas.microsoft.com/office/word/2010/wordprocessingDrawing" xmlns:wp="http://schemas.openxmlformats.org/drawingml/2006/wordprocessingDrawing" xmlns:wpc="http://schemas.microsoft.com/office/word/2010/wordprocessingCanvas" xmlns:wpg="http://schemas.microsoft.com/office/word/2010/wordprocessingGroup" xmlns:wpi="http://schemas.microsoft.com/office/word/2010/wordprocessingInk" xmlns:wps="http://schemas.microsoft.com/office/word/2010/wordprocessingShape" mc:Ignorable="w14 wp14">
+  <w:p>
+    <w:pPr>
+      <w:pStyle w:val="Header"/>
+      <w:keepNext w:val="0"/>
+      <w:pageBreakBefore w:val="0"/>
+      <w:widowControl/>
+      <w:spacing w:before="0" w:after="0" w:line="240" w:lineRule="auto"/>
+      <w:ind w:firstLine="0"/>
+      <w:jc w:val="center"/>
+    </w:pPr>
+    <w:r>
+      <w:drawing>
+        <wp:inline xmlns:a="http://schemas.openxmlformats.org/drawingml/2006/main" xmlns:pic="http://schemas.openxmlformats.org/drawingml/2006/picture">
+          <wp:extent cx="1982880" cy="486000"/>
+          <wp:docPr id="1" name="Picture 1"/>
+          <wp:cNvGraphicFramePr>
+            <a:graphicFrameLocks noChangeAspect="1"/>
+          </wp:cNvGraphicFramePr>
+          <a:graphic>
+            <a:graphicData uri="http://schemas.openxmlformats.org/drawingml/2006/picture">
+              <pic:pic>
+                <pic:nvPicPr>
+                  <pic:cNvPr id="0" name="pua_logo_official.png"/>
+                  <pic:cNvPicPr/>
+                </pic:nvPicPr>
+                <pic:blipFill>
+                  <a:blip r:embed="rId1"/>
+                  <a:stretch>
+                    <a:fillRect/>
+                  </a:stretch>
+                </pic:blipFill>
+                <pic:spPr>
+                  <a:xfrm>
+                    <a:off x="0" y="0"/>
+                    <a:ext cx="1982880" cy="486000"/>
+                  </a:xfrm>
+                  <a:prstGeom prst="rect"/>
+                </pic:spPr>
+              </pic:pic>
+            </a:graphicData>
+          </a:graphic>
+        </wp:inline>
+      </w:drawing>
+    </w:r>
+  </w:p>
+  <w:p>
+    <w:pPr>
+      <w:keepNext w:val="0"/>
+      <w:pageBreakBefore w:val="0"/>
+      <w:widowControl/>
+      <w:spacing w:before="20" w:after="0" w:line="240" w:lineRule="auto"/>
+      <w:ind w:firstLine="0"/>
+      <w:jc w:val="center"/>
+      <w:pBdr>
+        <w:bottom w:val="single" w:sz="8" w:space="3" w:color="1B3A6B"/>
+      </w:pBdr>
+    </w:pPr>
+    <w:r>
+      <w:rPr>
+        <w:rFonts w:ascii="Times New Roman" w:hAnsi="Times New Roman" w:eastAsia="Times New Roman"/>
+        <w:b w:val="0"/>
+        <w:i/>
+        <w:color w:val="000000"/>
+        <w:sz w:val="18"/>
+      </w:rPr>
+      <w:t>Faculty of Dentistry — Pharos University in Alexandria</w:t>
+    </w:r>
+  </w:p>
+</w:hdr>
+</file>
+
+<file path=word/header8.xml><?xml version="1.0" encoding="utf-8"?>
+<w:hdr xmlns:m="http://schemas.openxmlformats.org/officeDocument/2006/math" xmlns:mc="http://schemas.openxmlformats.org/markup-compatibility/2006" xmlns:mo="http://schemas.microsoft.com/office/mac/office/2008/main" xmlns:mv="urn:schemas-microsoft-com:mac:vml" xmlns:o="urn:schemas-microsoft-com:office:office" xmlns:r="http://schemas.openxmlformats.org/officeDocument/2006/relationships" xmlns:v="urn:schemas-microsoft-com:vml" xmlns:w10="urn:schemas-microsoft-com:office:word" xmlns:w14="http://schemas.microsoft.com/office/word/2010/wordml" xmlns:w="http://schemas.openxmlformats.org/wordprocessingml/2006/main" xmlns:wne="http://schemas.microsoft.com/office/word/2006/wordml" xmlns:wp14="http://schemas.microsoft.com/office/word/2010/wordprocessingDrawing" xmlns:wp="http://schemas.openxmlformats.org/drawingml/2006/wordprocessingDrawing" xmlns:wpc="http://schemas.microsoft.com/office/word/2010/wordprocessingCanvas" xmlns:wpg="http://schemas.microsoft.com/office/word/2010/wordprocessingGroup" xmlns:wpi="http://schemas.microsoft.com/office/word/2010/wordprocessingInk" xmlns:wps="http://schemas.microsoft.com/office/word/2010/wordprocessingShape" mc:Ignorable="w14 wp14">
+  <w:p>
+    <w:pPr>
+      <w:pStyle w:val="Header"/>
+      <w:keepNext w:val="0"/>
+      <w:pageBreakBefore w:val="0"/>
+      <w:widowControl/>
+      <w:spacing w:before="0" w:after="0" w:line="240" w:lineRule="auto"/>
+      <w:ind w:firstLine="0"/>
+      <w:jc w:val="center"/>
+    </w:pPr>
+    <w:r>
+      <w:drawing>
+        <wp:inline xmlns:a="http://schemas.openxmlformats.org/drawingml/2006/main" xmlns:pic="http://schemas.openxmlformats.org/drawingml/2006/picture">
+          <wp:extent cx="1982880" cy="486000"/>
+          <wp:docPr id="1" name="Picture 1"/>
+          <wp:cNvGraphicFramePr>
+            <a:graphicFrameLocks noChangeAspect="1"/>
+          </wp:cNvGraphicFramePr>
+          <a:graphic>
+            <a:graphicData uri="http://schemas.openxmlformats.org/drawingml/2006/picture">
+              <pic:pic>
+                <pic:nvPicPr>
+                  <pic:cNvPr id="0" name="pua_logo_official.png"/>
+                  <pic:cNvPicPr/>
+                </pic:nvPicPr>
+                <pic:blipFill>
+                  <a:blip r:embed="rId1"/>
+                  <a:stretch>
+                    <a:fillRect/>
+                  </a:stretch>
+                </pic:blipFill>
+                <pic:spPr>
+                  <a:xfrm>
+                    <a:off x="0" y="0"/>
+                    <a:ext cx="1982880" cy="486000"/>
+                  </a:xfrm>
+                  <a:prstGeom prst="rect"/>
+                </pic:spPr>
+              </pic:pic>
+            </a:graphicData>
+          </a:graphic>
+        </wp:inline>
+      </w:drawing>
+    </w:r>
+  </w:p>
+  <w:p>
+    <w:pPr>
+      <w:keepNext w:val="0"/>
+      <w:pageBreakBefore w:val="0"/>
+      <w:widowControl/>
+      <w:spacing w:before="20" w:after="0" w:line="240" w:lineRule="auto"/>
+      <w:ind w:firstLine="0"/>
+      <w:jc w:val="center"/>
+      <w:pBdr>
+        <w:bottom w:val="single" w:sz="8" w:space="3" w:color="1B3A6B"/>
+      </w:pBdr>
+    </w:pPr>
+    <w:r>
+      <w:rPr>
+        <w:rFonts w:ascii="Times New Roman" w:hAnsi="Times New Roman" w:eastAsia="Times New Roman"/>
+        <w:b w:val="0"/>
+        <w:i/>
+        <w:color w:val="000000"/>
+        <w:sz w:val="18"/>
+      </w:rPr>
+      <w:t>Faculty of Dentistry — Pharos University in Alexandria</w:t>
+    </w:r>
+  </w:p>
+</w:hdr>
+</file>
+
+<file path=word/header9.xml><?xml version="1.0" encoding="utf-8"?>
+<w:hdr xmlns:m="http://schemas.openxmlformats.org/officeDocument/2006/math" xmlns:mc="http://schemas.openxmlformats.org/markup-compatibility/2006" xmlns:mo="http://schemas.microsoft.com/office/mac/office/2008/main" xmlns:mv="urn:schemas-microsoft-com:mac:vml" xmlns:o="urn:schemas-microsoft-com:office:office" xmlns:r="http://schemas.openxmlformats.org/officeDocument/2006/relationships" xmlns:v="urn:schemas-microsoft-com:vml" xmlns:w10="urn:schemas-microsoft-com:office:word" xmlns:w14="http://schemas.microsoft.com/office/word/2010/wordml" xmlns:w="http://schemas.openxmlformats.org/wordprocessingml/2006/main" xmlns:wne="http://schemas.microsoft.com/office/word/2006/wordml" xmlns:wp14="http://schemas.microsoft.com/office/word/2010/wordprocessingDrawing" xmlns:wp="http://schemas.openxmlformats.org/drawingml/2006/wordprocessingDrawing" xmlns:wpc="http://schemas.microsoft.com/office/word/2010/wordprocessingCanvas" xmlns:wpg="http://schemas.microsoft.com/office/word/2010/wordprocessingGroup" xmlns:wpi="http://schemas.microsoft.com/office/word/2010/wordprocessingInk" xmlns:wps="http://schemas.microsoft.com/office/word/2010/wordprocessingShape" mc:Ignorable="w14 wp14">
+  <w:p>
+    <w:pPr>
+      <w:pStyle w:val="Header"/>
+      <w:keepNext w:val="0"/>
+      <w:pageBreakBefore w:val="0"/>
+      <w:widowControl/>
+      <w:spacing w:before="0" w:after="0" w:line="240" w:lineRule="auto"/>
+      <w:ind w:firstLine="0"/>
+      <w:jc w:val="center"/>
+    </w:pPr>
+    <w:r>
+      <w:drawing>
+        <wp:inline xmlns:a="http://schemas.openxmlformats.org/drawingml/2006/main" xmlns:pic="http://schemas.openxmlformats.org/drawingml/2006/picture">
+          <wp:extent cx="1982880" cy="486000"/>
+          <wp:docPr id="1" name="Picture 1"/>
+          <wp:cNvGraphicFramePr>
+            <a:graphicFrameLocks noChangeAspect="1"/>
+          </wp:cNvGraphicFramePr>
+          <a:graphic>
+            <a:graphicData uri="http://schemas.openxmlformats.org/drawingml/2006/picture">
+              <pic:pic>
+                <pic:nvPicPr>
+                  <pic:cNvPr id="0" name="pua_logo_official.png"/>
+                  <pic:cNvPicPr/>
+                </pic:nvPicPr>
+                <pic:blipFill>
+                  <a:blip r:embed="rId1"/>
+                  <a:stretch>
+                    <a:fillRect/>
+                  </a:stretch>
+                </pic:blipFill>
+                <pic:spPr>
+                  <a:xfrm>
+                    <a:off x="0" y="0"/>
+                    <a:ext cx="1982880" cy="486000"/>
+                  </a:xfrm>
+                  <a:prstGeom prst="rect"/>
+                </pic:spPr>
+              </pic:pic>
+            </a:graphicData>
+          </a:graphic>
+        </wp:inline>
+      </w:drawing>
+    </w:r>
+  </w:p>
+  <w:p>
+    <w:pPr>
+      <w:keepNext w:val="0"/>
+      <w:pageBreakBefore w:val="0"/>
+      <w:widowControl/>
+      <w:spacing w:before="20" w:after="0" w:line="240" w:lineRule="auto"/>
+      <w:ind w:firstLine="0"/>
+      <w:jc w:val="center"/>
+      <w:pBdr>
+        <w:bottom w:val="single" w:sz="8" w:space="3" w:color="1B3A6B"/>
+      </w:pBdr>
+    </w:pPr>
+    <w:r>
+      <w:rPr>
+        <w:rFonts w:ascii="Times New Roman" w:hAnsi="Times New Roman" w:eastAsia="Times New Roman"/>
+        <w:b w:val="0"/>
+        <w:i/>
+        <w:color w:val="000000"/>
+        <w:sz w:val="18"/>
+      </w:rPr>
+      <w:t>Faculty of Dentistry — Pharos University in Alexandria</w:t>
+    </w:r>
+  </w:p>
+</w:hdr>
 </file>
 
 <file path=word/numbering.xml><?xml version="1.0" encoding="utf-8"?>

</xml_diff>

<commit_message>
Insert locked Chapter 4 figures and a list of figures
Add Figures 4.1–4.3 from the locked spreadsheet means (weight loss,
Ra before/after, ΔRa). Cite each figure in the results text. Leave
Educator / RPD design untouched. Laboratory photographs are still
missing and are not invented.

Co-authored-by: Ahmed El Gamry <ahmed733676-droid@users.noreply.github.com>
</commit_message>
<xml_diff>
--- a/Thesis_Complete.docx
+++ b/Thesis_Complete.docx
@@ -1092,9 +1092,34 @@
           <w:color w:val="000000"/>
           <w:sz w:val="24"/>
         </w:rPr>
+        <w:t>List of Figures</w:t>
+        <w:tab/>
+        <w:t>xiii</w:t>
+      </w:r>
+    </w:p>
+    <w:p>
+      <w:pPr>
+        <w:keepNext w:val="0"/>
+        <w:pageBreakBefore w:val="0"/>
+        <w:widowControl/>
+        <w:tabs>
+          <w:tab w:pos="8787" w:val="right" w:leader="dot"/>
+        </w:tabs>
+        <w:spacing w:before="0" w:after="0" w:line="480" w:lineRule="auto"/>
+        <w:ind w:firstLine="0" w:left="0"/>
+        <w:jc w:val="left"/>
+      </w:pPr>
+      <w:r>
+        <w:rPr>
+          <w:rFonts w:ascii="Times New Roman" w:hAnsi="Times New Roman" w:eastAsia="Times New Roman"/>
+          <w:b/>
+          <w:i w:val="0"/>
+          <w:color w:val="000000"/>
+          <w:sz w:val="24"/>
+        </w:rPr>
         <w:t>List of Abbreviations</w:t>
         <w:tab/>
-        <w:t>xiii</w:t>
+        <w:t>xiv</w:t>
       </w:r>
     </w:p>
     <w:p>
@@ -1594,7 +1619,7 @@
         </w:rPr>
         <w:t>3.8 Post-test Evaluation</w:t>
         <w:tab/>
-        <w:t>14</w:t>
+        <w:t>13</w:t>
       </w:r>
     </w:p>
     <w:p>
@@ -1719,7 +1744,7 @@
         </w:rPr>
         <w:t>4.2 Surface Roughness</w:t>
         <w:tab/>
-        <w:t>16</w:t>
+        <w:t>17</w:t>
       </w:r>
     </w:p>
     <w:p>
@@ -1744,7 +1769,7 @@
         </w:rPr>
         <w:t>4.3 Summary of Results</w:t>
         <w:tab/>
-        <w:t>18</w:t>
+        <w:t>20</w:t>
       </w:r>
     </w:p>
     <w:p>
@@ -1769,7 +1794,7 @@
         </w:rPr>
         <w:t>CHAPTER 5  Discussion</w:t>
         <w:tab/>
-        <w:t>19</w:t>
+        <w:t>21</w:t>
       </w:r>
     </w:p>
     <w:p>
@@ -1794,7 +1819,7 @@
         </w:rPr>
         <w:t>5.1 Weight Loss</w:t>
         <w:tab/>
-        <w:t>19</w:t>
+        <w:t>21</w:t>
       </w:r>
     </w:p>
     <w:p>
@@ -1819,7 +1844,7 @@
         </w:rPr>
         <w:t>5.2 Surface Roughness</w:t>
         <w:tab/>
-        <w:t>21</w:t>
+        <w:t>23</w:t>
       </w:r>
     </w:p>
     <w:p>
@@ -1844,7 +1869,7 @@
         </w:rPr>
         <w:t>5.3 Clinical Implications</w:t>
         <w:tab/>
-        <w:t>22</w:t>
+        <w:t>24</w:t>
       </w:r>
     </w:p>
     <w:p>
@@ -1869,7 +1894,7 @@
         </w:rPr>
         <w:t>5.4 Strengths of the Study</w:t>
         <w:tab/>
-        <w:t>23</w:t>
+        <w:t>25</w:t>
       </w:r>
     </w:p>
     <w:p>
@@ -1894,7 +1919,7 @@
         </w:rPr>
         <w:t>5.5 Limitations of the Study</w:t>
         <w:tab/>
-        <w:t>23</w:t>
+        <w:t>26</w:t>
       </w:r>
     </w:p>
     <w:p>
@@ -1919,7 +1944,7 @@
         </w:rPr>
         <w:t>5.6 Concluding Remarks</w:t>
         <w:tab/>
-        <w:t>24</w:t>
+        <w:t>26</w:t>
       </w:r>
     </w:p>
     <w:p>
@@ -1944,7 +1969,7 @@
         </w:rPr>
         <w:t>CHAPTER 6  Conclusions and Recommendations</w:t>
         <w:tab/>
-        <w:t>25</w:t>
+        <w:t>27</w:t>
       </w:r>
     </w:p>
     <w:p>
@@ -1969,7 +1994,7 @@
         </w:rPr>
         <w:t>6.1 Summary</w:t>
         <w:tab/>
-        <w:t>25</w:t>
+        <w:t>27</w:t>
       </w:r>
     </w:p>
     <w:p>
@@ -1994,7 +2019,7 @@
         </w:rPr>
         <w:t>6.2 Conclusions</w:t>
         <w:tab/>
-        <w:t>25</w:t>
+        <w:t>27</w:t>
       </w:r>
     </w:p>
     <w:p>
@@ -2019,7 +2044,7 @@
         </w:rPr>
         <w:t>6.3 Recommendations</w:t>
         <w:tab/>
-        <w:t>26</w:t>
+        <w:t>28</w:t>
       </w:r>
     </w:p>
     <w:p>
@@ -2044,7 +2069,7 @@
         </w:rPr>
         <w:t>CHAPTER 7  References</w:t>
         <w:tab/>
-        <w:t>27</w:t>
+        <w:t>29</w:t>
       </w:r>
     </w:p>
     <w:p>
@@ -2069,7 +2094,7 @@
         </w:rPr>
         <w:t>Arabic Summary</w:t>
         <w:tab/>
-        <w:t>30</w:t>
+        <w:t>32</w:t>
       </w:r>
     </w:p>
     <w:p>
@@ -2165,7 +2190,7 @@
         </w:rPr>
         <w:t>Table 4.2  Mean surface roughness (Ra) before and after simulated toothbrushing and ΔRa</w:t>
         <w:tab/>
-        <w:t>16</w:t>
+        <w:t>17</w:t>
       </w:r>
     </w:p>
     <w:p>
@@ -2190,7 +2215,103 @@
         </w:rPr>
         <w:t>Table 4.3  Absolute weight loss after 10 000 brushing cycles</w:t>
         <w:tab/>
+        <w:t>20</w:t>
+      </w:r>
+    </w:p>
+    <w:p>
+      <w:pPr>
+        <w:pStyle w:val="Heading1"/>
+        <w:keepNext/>
+        <w:pageBreakBefore/>
+        <w:widowControl/>
+        <w:spacing w:before="0" w:after="120" w:line="480" w:lineRule="auto"/>
+        <w:ind w:firstLine="0"/>
+        <w:jc w:val="center"/>
+      </w:pPr>
+      <w:r>
+        <w:rPr>
+          <w:rFonts w:ascii="Times New Roman" w:hAnsi="Times New Roman" w:eastAsia="Times New Roman"/>
+          <w:b/>
+          <w:i w:val="0"/>
+          <w:color w:val="000000"/>
+          <w:sz w:val="28"/>
+        </w:rPr>
+        <w:t>LIST OF FIGURES</w:t>
+      </w:r>
+    </w:p>
+    <w:p>
+      <w:pPr>
+        <w:keepNext w:val="0"/>
+        <w:pageBreakBefore w:val="0"/>
+        <w:widowControl/>
+        <w:tabs>
+          <w:tab w:pos="8787" w:val="right" w:leader="dot"/>
+        </w:tabs>
+        <w:spacing w:before="0" w:after="0" w:line="480" w:lineRule="auto"/>
+        <w:ind w:firstLine="0"/>
+        <w:jc w:val="left"/>
+      </w:pPr>
+      <w:r>
+        <w:rPr>
+          <w:rFonts w:ascii="Times New Roman" w:hAnsi="Times New Roman" w:eastAsia="Times New Roman"/>
+          <w:b w:val="0"/>
+          <w:i w:val="0"/>
+          <w:color w:val="000000"/>
+          <w:sz w:val="24"/>
+        </w:rPr>
+        <w:t>Figure 4.1  Mean percentage weight loss after 10 000 toothbrushing cycles</w:t>
+        <w:tab/>
+        <w:t>16</w:t>
+      </w:r>
+    </w:p>
+    <w:p>
+      <w:pPr>
+        <w:keepNext w:val="0"/>
+        <w:pageBreakBefore w:val="0"/>
+        <w:widowControl/>
+        <w:tabs>
+          <w:tab w:pos="8787" w:val="right" w:leader="dot"/>
+        </w:tabs>
+        <w:spacing w:before="0" w:after="0" w:line="480" w:lineRule="auto"/>
+        <w:ind w:firstLine="0"/>
+        <w:jc w:val="left"/>
+      </w:pPr>
+      <w:r>
+        <w:rPr>
+          <w:rFonts w:ascii="Times New Roman" w:hAnsi="Times New Roman" w:eastAsia="Times New Roman"/>
+          <w:b w:val="0"/>
+          <w:i w:val="0"/>
+          <w:color w:val="000000"/>
+          <w:sz w:val="24"/>
+        </w:rPr>
+        <w:t>Figure 4.2  Mean Ra before and after 10 000 toothbrushing cycles</w:t>
+        <w:tab/>
         <w:t>18</w:t>
+      </w:r>
+    </w:p>
+    <w:p>
+      <w:pPr>
+        <w:keepNext w:val="0"/>
+        <w:pageBreakBefore w:val="0"/>
+        <w:widowControl/>
+        <w:tabs>
+          <w:tab w:pos="8787" w:val="right" w:leader="dot"/>
+        </w:tabs>
+        <w:spacing w:before="0" w:after="0" w:line="480" w:lineRule="auto"/>
+        <w:ind w:firstLine="0"/>
+        <w:jc w:val="left"/>
+      </w:pPr>
+      <w:r>
+        <w:rPr>
+          <w:rFonts w:ascii="Times New Roman" w:hAnsi="Times New Roman" w:eastAsia="Times New Roman"/>
+          <w:b w:val="0"/>
+          <w:i w:val="0"/>
+          <w:color w:val="000000"/>
+          <w:sz w:val="24"/>
+        </w:rPr>
+        <w:t>Figure 4.3  Mean change in Ra (ΔRa) after 10 000 toothbrushing cycles</w:t>
+        <w:tab/>
+        <w:t>19</w:t>
       </w:r>
     </w:p>
     <w:p>
@@ -3937,10 +4058,10 @@
     </w:p>
     <w:p>
       <w:pPr>
-        <w:keepNext/>
+        <w:keepNext w:val="0"/>
         <w:pageBreakBefore w:val="0"/>
         <w:widowControl/>
-        <w:spacing w:before="240" w:after="120" w:line="480" w:lineRule="auto"/>
+        <w:spacing w:before="120" w:after="240" w:line="480" w:lineRule="auto"/>
         <w:ind w:firstLine="0"/>
         <w:jc w:val="left"/>
       </w:pPr>
@@ -5185,10 +5306,10 @@
     </w:p>
     <w:p>
       <w:pPr>
-        <w:keepNext/>
+        <w:keepNext w:val="0"/>
         <w:pageBreakBefore w:val="0"/>
         <w:widowControl/>
-        <w:spacing w:before="240" w:after="120" w:line="480" w:lineRule="auto"/>
+        <w:spacing w:before="120" w:after="240" w:line="480" w:lineRule="auto"/>
         <w:ind w:firstLine="0"/>
         <w:jc w:val="left"/>
       </w:pPr>
@@ -5999,7 +6120,81 @@
           <w:color w:val="000000"/>
           <w:sz w:val="24"/>
         </w:rPr>
-        <w:t>A non-significant p-value does not make the three means equal. It says that, with twelve discs a group and with the variance that was observed, the test could not separate them. Most of that variance sits in one group.</w:t>
+        <w:t>A non-significant p-value does not make the three means equal. It says that, with twelve discs a group and with the variance that was observed, the test could not separate them. Most of that variance sits in one group. Figure 4.1 plots the same means and standard deviations as Table 4.1.</w:t>
+      </w:r>
+    </w:p>
+    <w:p>
+      <w:pPr>
+        <w:keepNext/>
+        <w:pageBreakBefore w:val="0"/>
+        <w:widowControl/>
+        <w:spacing w:before="240" w:after="120" w:line="240" w:lineRule="auto"/>
+        <w:ind w:firstLine="0"/>
+        <w:jc w:val="center"/>
+      </w:pPr>
+      <w:r>
+        <w:drawing>
+          <wp:inline xmlns:a="http://schemas.openxmlformats.org/drawingml/2006/main" xmlns:pic="http://schemas.openxmlformats.org/drawingml/2006/picture">
+            <wp:extent cx="5220000" cy="3634248"/>
+            <wp:docPr id="3" name="Picture 3"/>
+            <wp:cNvGraphicFramePr>
+              <a:graphicFrameLocks noChangeAspect="1"/>
+            </wp:cNvGraphicFramePr>
+            <a:graphic>
+              <a:graphicData uri="http://schemas.openxmlformats.org/drawingml/2006/picture">
+                <pic:pic>
+                  <pic:nvPicPr>
+                    <pic:cNvPr id="0" name="Figure_4.1_weight_loss.png"/>
+                    <pic:cNvPicPr/>
+                  </pic:nvPicPr>
+                  <pic:blipFill>
+                    <a:blip r:embed="rId29"/>
+                    <a:stretch>
+                      <a:fillRect/>
+                    </a:stretch>
+                  </pic:blipFill>
+                  <pic:spPr>
+                    <a:xfrm>
+                      <a:off x="0" y="0"/>
+                      <a:ext cx="5220000" cy="3634248"/>
+                    </a:xfrm>
+                    <a:prstGeom prst="rect"/>
+                  </pic:spPr>
+                </pic:pic>
+              </a:graphicData>
+            </a:graphic>
+          </wp:inline>
+        </w:drawing>
+      </w:r>
+    </w:p>
+    <w:p>
+      <w:pPr>
+        <w:keepNext w:val="0"/>
+        <w:pageBreakBefore w:val="0"/>
+        <w:widowControl/>
+        <w:spacing w:before="120" w:after="240" w:line="480" w:lineRule="auto"/>
+        <w:ind w:firstLine="0"/>
+        <w:jc w:val="left"/>
+      </w:pPr>
+      <w:r>
+        <w:rPr>
+          <w:rFonts w:ascii="Times New Roman" w:hAnsi="Times New Roman" w:eastAsia="Times New Roman"/>
+          <w:b/>
+          <w:i w:val="0"/>
+          <w:color w:val="000000"/>
+          <w:sz w:val="24"/>
+        </w:rPr>
+        <w:t>Figure 4.1</w:t>
+      </w:r>
+      <w:r>
+        <w:rPr>
+          <w:rFonts w:ascii="Times New Roman" w:hAnsi="Times New Roman" w:eastAsia="Times New Roman"/>
+          <w:b w:val="0"/>
+          <w:i w:val="0"/>
+          <w:color w:val="000000"/>
+          <w:sz w:val="24"/>
+        </w:rPr>
+        <w:t xml:space="preserve"> Mean percentage weight loss of the three composite resins after 10 000 toothbrushing cycles at 2 N. Error bars represent one standard deviation (n = 12 per group). In the Beautifil Flow Plus X F00 group the standard deviation exceeds the mean, so the lower error bar extends below zero; this reflects the dispersion introduced by a single specimen that lost about 11.4 % of its mass and does not imply a gain in weight. Differences among groups were not statistically significant (one-way ANOVA, p = 0.329).</w:t>
       </w:r>
     </w:p>
     <w:p>
@@ -6065,10 +6260,10 @@
     </w:p>
     <w:p>
       <w:pPr>
-        <w:keepNext/>
+        <w:keepNext w:val="0"/>
         <w:pageBreakBefore w:val="0"/>
         <w:widowControl/>
-        <w:spacing w:before="240" w:after="120" w:line="480" w:lineRule="auto"/>
+        <w:spacing w:before="120" w:after="240" w:line="480" w:lineRule="auto"/>
         <w:ind w:firstLine="0"/>
         <w:jc w:val="left"/>
       </w:pPr>
@@ -6859,7 +7054,155 @@
           <w:color w:val="000000"/>
           <w:sz w:val="24"/>
         </w:rPr>
-        <w:t>Every group roughened. ΔRa was 0.066 ± 0.021 µm for Beautifil Flow Plus X F00, 0.046 ± 0.023 µm for G-ænial Universal Injectable and 0.075 ± 0.066 µm for Beautifil II LS. After 10 000 cycles the means were 0.104 ± 0.017 µm, 0.100 ± 0.023 µm and 0.194 ± 0.050 µm.</w:t>
+        <w:t>Every group roughened. ΔRa was 0.066 ± 0.021 µm for Beautifil Flow Plus X F00, 0.046 ± 0.023 µm for G-ænial Universal Injectable and 0.075 ± 0.066 µm for Beautifil II LS. After 10 000 cycles the means were 0.104 ± 0.017 µm, 0.100 ± 0.023 µm and 0.194 ± 0.050 µm. Figure 4.2 shows Ra before and after on the same discs. Figure 4.3 shows ΔRa.</w:t>
+      </w:r>
+    </w:p>
+    <w:p>
+      <w:pPr>
+        <w:keepNext/>
+        <w:pageBreakBefore w:val="0"/>
+        <w:widowControl/>
+        <w:spacing w:before="240" w:after="120" w:line="240" w:lineRule="auto"/>
+        <w:ind w:firstLine="0"/>
+        <w:jc w:val="center"/>
+      </w:pPr>
+      <w:r>
+        <w:drawing>
+          <wp:inline xmlns:a="http://schemas.openxmlformats.org/drawingml/2006/main" xmlns:pic="http://schemas.openxmlformats.org/drawingml/2006/picture">
+            <wp:extent cx="5220000" cy="3286761"/>
+            <wp:docPr id="4" name="Picture 4"/>
+            <wp:cNvGraphicFramePr>
+              <a:graphicFrameLocks noChangeAspect="1"/>
+            </wp:cNvGraphicFramePr>
+            <a:graphic>
+              <a:graphicData uri="http://schemas.openxmlformats.org/drawingml/2006/picture">
+                <pic:pic>
+                  <pic:nvPicPr>
+                    <pic:cNvPr id="0" name="Figure_4.2_surface_roughness.png"/>
+                    <pic:cNvPicPr/>
+                  </pic:nvPicPr>
+                  <pic:blipFill>
+                    <a:blip r:embed="rId30"/>
+                    <a:stretch>
+                      <a:fillRect/>
+                    </a:stretch>
+                  </pic:blipFill>
+                  <pic:spPr>
+                    <a:xfrm>
+                      <a:off x="0" y="0"/>
+                      <a:ext cx="5220000" cy="3286761"/>
+                    </a:xfrm>
+                    <a:prstGeom prst="rect"/>
+                  </pic:spPr>
+                </pic:pic>
+              </a:graphicData>
+            </a:graphic>
+          </wp:inline>
+        </w:drawing>
+      </w:r>
+    </w:p>
+    <w:p>
+      <w:pPr>
+        <w:keepNext w:val="0"/>
+        <w:pageBreakBefore w:val="0"/>
+        <w:widowControl/>
+        <w:spacing w:before="120" w:after="240" w:line="480" w:lineRule="auto"/>
+        <w:ind w:firstLine="0"/>
+        <w:jc w:val="left"/>
+      </w:pPr>
+      <w:r>
+        <w:rPr>
+          <w:rFonts w:ascii="Times New Roman" w:hAnsi="Times New Roman" w:eastAsia="Times New Roman"/>
+          <w:b/>
+          <w:i w:val="0"/>
+          <w:color w:val="000000"/>
+          <w:sz w:val="24"/>
+        </w:rPr>
+        <w:t>Figure 4.2</w:t>
+      </w:r>
+      <w:r>
+        <w:rPr>
+          <w:rFonts w:ascii="Times New Roman" w:hAnsi="Times New Roman" w:eastAsia="Times New Roman"/>
+          <w:b w:val="0"/>
+          <w:i w:val="0"/>
+          <w:color w:val="000000"/>
+          <w:sz w:val="24"/>
+        </w:rPr>
+        <w:t xml:space="preserve"> Mean surface roughness (Ra) of the three composite resins before and after 10 000 toothbrushing cycles at 2 N. Error bars represent one standard deviation (n = 12 per group). The broken line marks the 0.2 µm threshold above which plaque retention increases. Ra after brushing differed significantly among groups (Kruskal–Wallis, p &lt; 0.001).</w:t>
+      </w:r>
+    </w:p>
+    <w:p>
+      <w:pPr>
+        <w:keepNext/>
+        <w:pageBreakBefore w:val="0"/>
+        <w:widowControl/>
+        <w:spacing w:before="240" w:after="120" w:line="240" w:lineRule="auto"/>
+        <w:ind w:firstLine="0"/>
+        <w:jc w:val="center"/>
+      </w:pPr>
+      <w:r>
+        <w:drawing>
+          <wp:inline xmlns:a="http://schemas.openxmlformats.org/drawingml/2006/main" xmlns:pic="http://schemas.openxmlformats.org/drawingml/2006/picture">
+            <wp:extent cx="5220000" cy="3448176"/>
+            <wp:docPr id="5" name="Picture 5"/>
+            <wp:cNvGraphicFramePr>
+              <a:graphicFrameLocks noChangeAspect="1"/>
+            </wp:cNvGraphicFramePr>
+            <a:graphic>
+              <a:graphicData uri="http://schemas.openxmlformats.org/drawingml/2006/picture">
+                <pic:pic>
+                  <pic:nvPicPr>
+                    <pic:cNvPr id="0" name="Figure_4.3_delta_ra.png"/>
+                    <pic:cNvPicPr/>
+                  </pic:nvPicPr>
+                  <pic:blipFill>
+                    <a:blip r:embed="rId31"/>
+                    <a:stretch>
+                      <a:fillRect/>
+                    </a:stretch>
+                  </pic:blipFill>
+                  <pic:spPr>
+                    <a:xfrm>
+                      <a:off x="0" y="0"/>
+                      <a:ext cx="5220000" cy="3448176"/>
+                    </a:xfrm>
+                    <a:prstGeom prst="rect"/>
+                  </pic:spPr>
+                </pic:pic>
+              </a:graphicData>
+            </a:graphic>
+          </wp:inline>
+        </w:drawing>
+      </w:r>
+    </w:p>
+    <w:p>
+      <w:pPr>
+        <w:keepNext w:val="0"/>
+        <w:pageBreakBefore w:val="0"/>
+        <w:widowControl/>
+        <w:spacing w:before="120" w:after="240" w:line="480" w:lineRule="auto"/>
+        <w:ind w:firstLine="0"/>
+        <w:jc w:val="left"/>
+      </w:pPr>
+      <w:r>
+        <w:rPr>
+          <w:rFonts w:ascii="Times New Roman" w:hAnsi="Times New Roman" w:eastAsia="Times New Roman"/>
+          <w:b/>
+          <w:i w:val="0"/>
+          <w:color w:val="000000"/>
+          <w:sz w:val="24"/>
+        </w:rPr>
+        <w:t>Figure 4.3</w:t>
+      </w:r>
+      <w:r>
+        <w:rPr>
+          <w:rFonts w:ascii="Times New Roman" w:hAnsi="Times New Roman" w:eastAsia="Times New Roman"/>
+          <w:b w:val="0"/>
+          <w:i w:val="0"/>
+          <w:color w:val="000000"/>
+          <w:sz w:val="24"/>
+        </w:rPr>
+        <w:t xml:space="preserve"> Mean change in surface roughness (ΔRa = Ra after − Ra before) of the three composite resins after 10 000 toothbrushing cycles at 2 N. Error bars represent one standard deviation (n = 12 per group).</w:t>
       </w:r>
     </w:p>
     <w:p>
@@ -6964,10 +7307,10 @@
     </w:p>
     <w:p>
       <w:pPr>
-        <w:keepNext/>
+        <w:keepNext w:val="0"/>
         <w:pageBreakBefore w:val="0"/>
         <w:widowControl/>
-        <w:spacing w:before="240" w:after="120" w:line="480" w:lineRule="auto"/>
+        <w:spacing w:before="120" w:after="240" w:line="480" w:lineRule="auto"/>
         <w:ind w:firstLine="0"/>
         <w:jc w:val="left"/>
       </w:pPr>

</xml_diff>

<commit_message>
Full academic chapters, aligned layout, official PUA header
Expand Chapters 1-7 to thesis length from the locked protocol, add the official PUA header, and insert Figures 4.1-4.3 from locked spreadsheet means. Geometry remains 10 mm x 1 mm discs. ANOVA p = 0.329 on percentage weight loss; Kruskal-Wallis p < 0.001 on Ra after brushing.
</commit_message>
<xml_diff>
--- a/Thesis_Complete.docx
+++ b/Thesis_Complete.docx
@@ -27,7 +27,7 @@
                     <pic:cNvPicPr/>
                   </pic:nvPicPr>
                   <pic:blipFill>
-                    <a:blip r:embed="rId10"/>
+                    <a:blip r:embed="rId15"/>
                     <a:stretch>
                       <a:fillRect/>
                     </a:stretch>
@@ -72,7 +72,7 @@
                     <pic:cNvPicPr/>
                   </pic:nvPicPr>
                   <pic:blipFill>
-                    <a:blip r:embed="rId11"/>
+                    <a:blip r:embed="rId16"/>
                     <a:stretch>
                       <a:fillRect/>
                     </a:stretch>
@@ -94,11 +94,15 @@
     <w:p>
       <w:pPr>
         <w:sectPr>
-          <w:footerReference w:type="default" r:id="rId9"/>
+          <w:headerReference w:type="default" r:id="rId9"/>
+          <w:headerReference w:type="first" r:id="rId10"/>
+          <w:headerReference w:type="even" r:id="rId11"/>
+          <w:footerReference w:type="default" r:id="rId12"/>
+          <w:footerReference w:type="first" r:id="rId13"/>
+          <w:footerReference w:type="even" r:id="rId14"/>
           <w:pgSz w:w="11906" w:h="16838"/>
           <w:pgMar w:top="0" w:right="0" w:bottom="0" w:left="0" w:header="0" w:footer="0" w:gutter="0"/>
           <w:cols w:space="720"/>
-          <w:titlePg/>
           <w:docGrid w:linePitch="360"/>
         </w:sectPr>
       </w:pPr>
@@ -874,7 +878,7 @@
         <w:pageBreakBefore w:val="0"/>
         <w:widowControl/>
         <w:tabs>
-          <w:tab w:pos="7937" w:val="right" w:leader="dot"/>
+          <w:tab w:pos="8787" w:val="right" w:leader="dot"/>
         </w:tabs>
         <w:spacing w:before="0" w:after="0" w:line="480" w:lineRule="auto"/>
         <w:ind w:firstLine="0" w:left="0"/>
@@ -899,7 +903,7 @@
         <w:pageBreakBefore w:val="0"/>
         <w:widowControl/>
         <w:tabs>
-          <w:tab w:pos="7937" w:val="right" w:leader="dot"/>
+          <w:tab w:pos="8787" w:val="right" w:leader="dot"/>
         </w:tabs>
         <w:spacing w:before="0" w:after="0" w:line="480" w:lineRule="auto"/>
         <w:ind w:firstLine="0" w:left="0"/>
@@ -924,7 +928,7 @@
         <w:pageBreakBefore w:val="0"/>
         <w:widowControl/>
         <w:tabs>
-          <w:tab w:pos="7937" w:val="right" w:leader="dot"/>
+          <w:tab w:pos="8787" w:val="right" w:leader="dot"/>
         </w:tabs>
         <w:spacing w:before="0" w:after="0" w:line="480" w:lineRule="auto"/>
         <w:ind w:firstLine="0" w:left="0"/>
@@ -949,7 +953,7 @@
         <w:pageBreakBefore w:val="0"/>
         <w:widowControl/>
         <w:tabs>
-          <w:tab w:pos="7937" w:val="right" w:leader="dot"/>
+          <w:tab w:pos="8787" w:val="right" w:leader="dot"/>
         </w:tabs>
         <w:spacing w:before="0" w:after="0" w:line="480" w:lineRule="auto"/>
         <w:ind w:firstLine="0" w:left="0"/>
@@ -974,7 +978,7 @@
         <w:pageBreakBefore w:val="0"/>
         <w:widowControl/>
         <w:tabs>
-          <w:tab w:pos="7937" w:val="right" w:leader="dot"/>
+          <w:tab w:pos="8787" w:val="right" w:leader="dot"/>
         </w:tabs>
         <w:spacing w:before="0" w:after="0" w:line="480" w:lineRule="auto"/>
         <w:ind w:firstLine="0" w:left="0"/>
@@ -999,7 +1003,7 @@
         <w:pageBreakBefore w:val="0"/>
         <w:widowControl/>
         <w:tabs>
-          <w:tab w:pos="7937" w:val="right" w:leader="dot"/>
+          <w:tab w:pos="8787" w:val="right" w:leader="dot"/>
         </w:tabs>
         <w:spacing w:before="0" w:after="0" w:line="480" w:lineRule="auto"/>
         <w:ind w:firstLine="0" w:left="0"/>
@@ -1015,7 +1019,7 @@
         </w:rPr>
         <w:t>Arabic Abstract</w:t>
         <w:tab/>
-        <w:t>vi</w:t>
+        <w:t>vii</w:t>
       </w:r>
     </w:p>
     <w:p>
@@ -1024,7 +1028,7 @@
         <w:pageBreakBefore w:val="0"/>
         <w:widowControl/>
         <w:tabs>
-          <w:tab w:pos="7937" w:val="right" w:leader="dot"/>
+          <w:tab w:pos="8787" w:val="right" w:leader="dot"/>
         </w:tabs>
         <w:spacing w:before="0" w:after="0" w:line="480" w:lineRule="auto"/>
         <w:ind w:firstLine="0" w:left="0"/>
@@ -1040,7 +1044,7 @@
         </w:rPr>
         <w:t>Contents</w:t>
         <w:tab/>
-        <w:t>vii</w:t>
+        <w:t>ix</w:t>
       </w:r>
     </w:p>
     <w:p>
@@ -1049,7 +1053,7 @@
         <w:pageBreakBefore w:val="0"/>
         <w:widowControl/>
         <w:tabs>
-          <w:tab w:pos="7937" w:val="right" w:leader="dot"/>
+          <w:tab w:pos="8787" w:val="right" w:leader="dot"/>
         </w:tabs>
         <w:spacing w:before="0" w:after="0" w:line="480" w:lineRule="auto"/>
         <w:ind w:firstLine="0" w:left="0"/>
@@ -1065,7 +1069,7 @@
         </w:rPr>
         <w:t>List of Tables</w:t>
         <w:tab/>
-        <w:t>ix</w:t>
+        <w:t>xii</w:t>
       </w:r>
     </w:p>
     <w:p>
@@ -1074,7 +1078,32 @@
         <w:pageBreakBefore w:val="0"/>
         <w:widowControl/>
         <w:tabs>
-          <w:tab w:pos="7937" w:val="right" w:leader="dot"/>
+          <w:tab w:pos="8787" w:val="right" w:leader="dot"/>
+        </w:tabs>
+        <w:spacing w:before="0" w:after="0" w:line="480" w:lineRule="auto"/>
+        <w:ind w:firstLine="0" w:left="0"/>
+        <w:jc w:val="left"/>
+      </w:pPr>
+      <w:r>
+        <w:rPr>
+          <w:rFonts w:ascii="Times New Roman" w:hAnsi="Times New Roman" w:eastAsia="Times New Roman"/>
+          <w:b/>
+          <w:i w:val="0"/>
+          <w:color w:val="000000"/>
+          <w:sz w:val="24"/>
+        </w:rPr>
+        <w:t>List of Figures</w:t>
+        <w:tab/>
+        <w:t>xiii</w:t>
+      </w:r>
+    </w:p>
+    <w:p>
+      <w:pPr>
+        <w:keepNext w:val="0"/>
+        <w:pageBreakBefore w:val="0"/>
+        <w:widowControl/>
+        <w:tabs>
+          <w:tab w:pos="8787" w:val="right" w:leader="dot"/>
         </w:tabs>
         <w:spacing w:before="0" w:after="0" w:line="480" w:lineRule="auto"/>
         <w:ind w:firstLine="0" w:left="0"/>
@@ -1090,7 +1119,7 @@
         </w:rPr>
         <w:t>List of Abbreviations</w:t>
         <w:tab/>
-        <w:t>x</w:t>
+        <w:t>xiv</w:t>
       </w:r>
     </w:p>
     <w:p>
@@ -1099,7 +1128,7 @@
         <w:pageBreakBefore w:val="0"/>
         <w:widowControl/>
         <w:tabs>
-          <w:tab w:pos="7937" w:val="right" w:leader="dot"/>
+          <w:tab w:pos="8787" w:val="right" w:leader="dot"/>
         </w:tabs>
         <w:spacing w:before="0" w:after="0" w:line="480" w:lineRule="auto"/>
         <w:ind w:firstLine="0" w:left="0"/>
@@ -1124,7 +1153,7 @@
         <w:pageBreakBefore w:val="0"/>
         <w:widowControl/>
         <w:tabs>
-          <w:tab w:pos="7937" w:val="right" w:leader="dot"/>
+          <w:tab w:pos="8787" w:val="right" w:leader="dot"/>
         </w:tabs>
         <w:spacing w:before="0" w:after="0" w:line="480" w:lineRule="auto"/>
         <w:ind w:firstLine="0" w:left="567"/>
@@ -1140,7 +1169,7 @@
         </w:rPr>
         <w:t>1.1 Aim of the Study</w:t>
         <w:tab/>
-        <w:t>2</w:t>
+        <w:t>3</w:t>
       </w:r>
     </w:p>
     <w:p>
@@ -1149,7 +1178,7 @@
         <w:pageBreakBefore w:val="0"/>
         <w:widowControl/>
         <w:tabs>
-          <w:tab w:pos="7937" w:val="right" w:leader="dot"/>
+          <w:tab w:pos="8787" w:val="right" w:leader="dot"/>
         </w:tabs>
         <w:spacing w:before="0" w:after="0" w:line="480" w:lineRule="auto"/>
         <w:ind w:firstLine="0" w:left="567"/>
@@ -1165,7 +1194,7 @@
         </w:rPr>
         <w:t>1.2 Objectives</w:t>
         <w:tab/>
-        <w:t>2</w:t>
+        <w:t>3</w:t>
       </w:r>
     </w:p>
     <w:p>
@@ -1174,7 +1203,7 @@
         <w:pageBreakBefore w:val="0"/>
         <w:widowControl/>
         <w:tabs>
-          <w:tab w:pos="7937" w:val="right" w:leader="dot"/>
+          <w:tab w:pos="8787" w:val="right" w:leader="dot"/>
         </w:tabs>
         <w:spacing w:before="0" w:after="0" w:line="480" w:lineRule="auto"/>
         <w:ind w:firstLine="0" w:left="567"/>
@@ -1190,7 +1219,7 @@
         </w:rPr>
         <w:t>1.3 Null Hypotheses</w:t>
         <w:tab/>
-        <w:t>2</w:t>
+        <w:t>3</w:t>
       </w:r>
     </w:p>
     <w:p>
@@ -1199,7 +1228,7 @@
         <w:pageBreakBefore w:val="0"/>
         <w:widowControl/>
         <w:tabs>
-          <w:tab w:pos="7937" w:val="right" w:leader="dot"/>
+          <w:tab w:pos="8787" w:val="right" w:leader="dot"/>
         </w:tabs>
         <w:spacing w:before="0" w:after="0" w:line="480" w:lineRule="auto"/>
         <w:ind w:firstLine="0" w:left="0"/>
@@ -1215,7 +1244,7 @@
         </w:rPr>
         <w:t>CHAPTER 2  Review of Literature</w:t>
         <w:tab/>
-        <w:t>3</w:t>
+        <w:t>4</w:t>
       </w:r>
     </w:p>
     <w:p>
@@ -1224,7 +1253,7 @@
         <w:pageBreakBefore w:val="0"/>
         <w:widowControl/>
         <w:tabs>
-          <w:tab w:pos="7937" w:val="right" w:leader="dot"/>
+          <w:tab w:pos="8787" w:val="right" w:leader="dot"/>
         </w:tabs>
         <w:spacing w:before="0" w:after="0" w:line="480" w:lineRule="auto"/>
         <w:ind w:firstLine="0" w:left="567"/>
@@ -1240,7 +1269,7 @@
         </w:rPr>
         <w:t>2.1 Wear of Restorative Resins</w:t>
         <w:tab/>
-        <w:t>3</w:t>
+        <w:t>4</w:t>
       </w:r>
     </w:p>
     <w:p>
@@ -1249,7 +1278,7 @@
         <w:pageBreakBefore w:val="0"/>
         <w:widowControl/>
         <w:tabs>
-          <w:tab w:pos="7937" w:val="right" w:leader="dot"/>
+          <w:tab w:pos="8787" w:val="right" w:leader="dot"/>
         </w:tabs>
         <w:spacing w:before="0" w:after="0" w:line="480" w:lineRule="auto"/>
         <w:ind w:firstLine="0" w:left="567"/>
@@ -1265,7 +1294,7 @@
         </w:rPr>
         <w:t>2.2 Surface Roughness</w:t>
         <w:tab/>
-        <w:t>4</w:t>
+        <w:t>5</w:t>
       </w:r>
     </w:p>
     <w:p>
@@ -1274,7 +1303,7 @@
         <w:pageBreakBefore w:val="0"/>
         <w:widowControl/>
         <w:tabs>
-          <w:tab w:pos="7937" w:val="right" w:leader="dot"/>
+          <w:tab w:pos="8787" w:val="right" w:leader="dot"/>
         </w:tabs>
         <w:spacing w:before="0" w:after="0" w:line="480" w:lineRule="auto"/>
         <w:ind w:firstLine="0" w:left="567"/>
@@ -1288,9 +1317,9 @@
           <w:color w:val="000000"/>
           <w:sz w:val="24"/>
         </w:rPr>
-        <w:t>2.3 Injectable Composite Resins</w:t>
+        <w:t>2.3 Filler Size and Toothbrush Abrasion</w:t>
         <w:tab/>
-        <w:t>5</w:t>
+        <w:t>6</w:t>
       </w:r>
     </w:p>
     <w:p>
@@ -1299,7 +1328,7 @@
         <w:pageBreakBefore w:val="0"/>
         <w:widowControl/>
         <w:tabs>
-          <w:tab w:pos="7937" w:val="right" w:leader="dot"/>
+          <w:tab w:pos="8787" w:val="right" w:leader="dot"/>
         </w:tabs>
         <w:spacing w:before="0" w:after="0" w:line="480" w:lineRule="auto"/>
         <w:ind w:firstLine="0" w:left="567"/>
@@ -1313,9 +1342,9 @@
           <w:color w:val="000000"/>
           <w:sz w:val="24"/>
         </w:rPr>
-        <w:t>2.4 Conventional Nanohybrid Resins and Giomers</w:t>
+        <w:t>2.4 Injectable Composite Resins</w:t>
         <w:tab/>
-        <w:t>6</w:t>
+        <w:t>7</w:t>
       </w:r>
     </w:p>
     <w:p>
@@ -1324,7 +1353,7 @@
         <w:pageBreakBefore w:val="0"/>
         <w:widowControl/>
         <w:tabs>
-          <w:tab w:pos="7937" w:val="right" w:leader="dot"/>
+          <w:tab w:pos="8787" w:val="right" w:leader="dot"/>
         </w:tabs>
         <w:spacing w:before="0" w:after="0" w:line="480" w:lineRule="auto"/>
         <w:ind w:firstLine="0" w:left="567"/>
@@ -1338,9 +1367,9 @@
           <w:color w:val="000000"/>
           <w:sz w:val="24"/>
         </w:rPr>
-        <w:t>2.5 Statement of the Problem</w:t>
+        <w:t>2.5 Conventional Nanohybrid Resins and Giomers</w:t>
         <w:tab/>
-        <w:t>6</w:t>
+        <w:t>8</w:t>
       </w:r>
     </w:p>
     <w:p>
@@ -1349,7 +1378,32 @@
         <w:pageBreakBefore w:val="0"/>
         <w:widowControl/>
         <w:tabs>
-          <w:tab w:pos="7937" w:val="right" w:leader="dot"/>
+          <w:tab w:pos="8787" w:val="right" w:leader="dot"/>
+        </w:tabs>
+        <w:spacing w:before="0" w:after="0" w:line="480" w:lineRule="auto"/>
+        <w:ind w:firstLine="0" w:left="567"/>
+        <w:jc w:val="left"/>
+      </w:pPr>
+      <w:r>
+        <w:rPr>
+          <w:rFonts w:ascii="Times New Roman" w:hAnsi="Times New Roman" w:eastAsia="Times New Roman"/>
+          <w:b w:val="0"/>
+          <w:i w:val="0"/>
+          <w:color w:val="000000"/>
+          <w:sz w:val="24"/>
+        </w:rPr>
+        <w:t>2.6 Statement of the Problem</w:t>
+        <w:tab/>
+        <w:t>9</w:t>
+      </w:r>
+    </w:p>
+    <w:p>
+      <w:pPr>
+        <w:keepNext w:val="0"/>
+        <w:pageBreakBefore w:val="0"/>
+        <w:widowControl/>
+        <w:tabs>
+          <w:tab w:pos="8787" w:val="right" w:leader="dot"/>
         </w:tabs>
         <w:spacing w:before="0" w:after="0" w:line="480" w:lineRule="auto"/>
         <w:ind w:firstLine="0" w:left="0"/>
@@ -1365,7 +1419,7 @@
         </w:rPr>
         <w:t>CHAPTER 3  Materials and Methods</w:t>
         <w:tab/>
-        <w:t>7</w:t>
+        <w:t>10</w:t>
       </w:r>
     </w:p>
     <w:p>
@@ -1374,7 +1428,7 @@
         <w:pageBreakBefore w:val="0"/>
         <w:widowControl/>
         <w:tabs>
-          <w:tab w:pos="7937" w:val="right" w:leader="dot"/>
+          <w:tab w:pos="8787" w:val="right" w:leader="dot"/>
         </w:tabs>
         <w:spacing w:before="0" w:after="0" w:line="480" w:lineRule="auto"/>
         <w:ind w:firstLine="0" w:left="567"/>
@@ -1390,7 +1444,7 @@
         </w:rPr>
         <w:t>3.1 Study Design and Setting</w:t>
         <w:tab/>
-        <w:t>7</w:t>
+        <w:t>10</w:t>
       </w:r>
     </w:p>
     <w:p>
@@ -1399,7 +1453,7 @@
         <w:pageBreakBefore w:val="0"/>
         <w:widowControl/>
         <w:tabs>
-          <w:tab w:pos="7937" w:val="right" w:leader="dot"/>
+          <w:tab w:pos="8787" w:val="right" w:leader="dot"/>
         </w:tabs>
         <w:spacing w:before="0" w:after="0" w:line="480" w:lineRule="auto"/>
         <w:ind w:firstLine="0" w:left="567"/>
@@ -1415,7 +1469,7 @@
         </w:rPr>
         <w:t>3.2 Sample Size</w:t>
         <w:tab/>
-        <w:t>7</w:t>
+        <w:t>10</w:t>
       </w:r>
     </w:p>
     <w:p>
@@ -1424,7 +1478,7 @@
         <w:pageBreakBefore w:val="0"/>
         <w:widowControl/>
         <w:tabs>
-          <w:tab w:pos="7937" w:val="right" w:leader="dot"/>
+          <w:tab w:pos="8787" w:val="right" w:leader="dot"/>
         </w:tabs>
         <w:spacing w:before="0" w:after="0" w:line="480" w:lineRule="auto"/>
         <w:ind w:firstLine="0" w:left="567"/>
@@ -1440,7 +1494,7 @@
         </w:rPr>
         <w:t>3.3 Materials</w:t>
         <w:tab/>
-        <w:t>8</w:t>
+        <w:t>11</w:t>
       </w:r>
     </w:p>
     <w:p>
@@ -1449,7 +1503,7 @@
         <w:pageBreakBefore w:val="0"/>
         <w:widowControl/>
         <w:tabs>
-          <w:tab w:pos="7937" w:val="right" w:leader="dot"/>
+          <w:tab w:pos="8787" w:val="right" w:leader="dot"/>
         </w:tabs>
         <w:spacing w:before="0" w:after="0" w:line="480" w:lineRule="auto"/>
         <w:ind w:firstLine="0" w:left="567"/>
@@ -1465,7 +1519,7 @@
         </w:rPr>
         <w:t>3.4 Equipment</w:t>
         <w:tab/>
-        <w:t>8</w:t>
+        <w:t>12</w:t>
       </w:r>
     </w:p>
     <w:p>
@@ -1474,7 +1528,7 @@
         <w:pageBreakBefore w:val="0"/>
         <w:widowControl/>
         <w:tabs>
-          <w:tab w:pos="7937" w:val="right" w:leader="dot"/>
+          <w:tab w:pos="8787" w:val="right" w:leader="dot"/>
         </w:tabs>
         <w:spacing w:before="0" w:after="0" w:line="480" w:lineRule="auto"/>
         <w:ind w:firstLine="0" w:left="567"/>
@@ -1490,7 +1544,7 @@
         </w:rPr>
         <w:t>3.5 Specimen Preparation</w:t>
         <w:tab/>
-        <w:t>9</w:t>
+        <w:t>12</w:t>
       </w:r>
     </w:p>
     <w:p>
@@ -1499,7 +1553,7 @@
         <w:pageBreakBefore w:val="0"/>
         <w:widowControl/>
         <w:tabs>
-          <w:tab w:pos="7937" w:val="right" w:leader="dot"/>
+          <w:tab w:pos="8787" w:val="right" w:leader="dot"/>
         </w:tabs>
         <w:spacing w:before="0" w:after="0" w:line="480" w:lineRule="auto"/>
         <w:ind w:firstLine="0" w:left="567"/>
@@ -1515,7 +1569,7 @@
         </w:rPr>
         <w:t>3.6 Baseline Measurements</w:t>
         <w:tab/>
-        <w:t>9</w:t>
+        <w:t>13</w:t>
       </w:r>
     </w:p>
     <w:p>
@@ -1524,7 +1578,7 @@
         <w:pageBreakBefore w:val="0"/>
         <w:widowControl/>
         <w:tabs>
-          <w:tab w:pos="7937" w:val="right" w:leader="dot"/>
+          <w:tab w:pos="8787" w:val="right" w:leader="dot"/>
         </w:tabs>
         <w:spacing w:before="0" w:after="0" w:line="480" w:lineRule="auto"/>
         <w:ind w:firstLine="0" w:left="567"/>
@@ -1540,7 +1594,7 @@
         </w:rPr>
         <w:t>3.7 Toothbrushing Protocol</w:t>
         <w:tab/>
-        <w:t>9</w:t>
+        <w:t>13</w:t>
       </w:r>
     </w:p>
     <w:p>
@@ -1549,7 +1603,7 @@
         <w:pageBreakBefore w:val="0"/>
         <w:widowControl/>
         <w:tabs>
-          <w:tab w:pos="7937" w:val="right" w:leader="dot"/>
+          <w:tab w:pos="8787" w:val="right" w:leader="dot"/>
         </w:tabs>
         <w:spacing w:before="0" w:after="0" w:line="480" w:lineRule="auto"/>
         <w:ind w:firstLine="0" w:left="567"/>
@@ -1565,7 +1619,7 @@
         </w:rPr>
         <w:t>3.8 Post-test Evaluation</w:t>
         <w:tab/>
-        <w:t>10</w:t>
+        <w:t>13</w:t>
       </w:r>
     </w:p>
     <w:p>
@@ -1574,7 +1628,7 @@
         <w:pageBreakBefore w:val="0"/>
         <w:widowControl/>
         <w:tabs>
-          <w:tab w:pos="7937" w:val="right" w:leader="dot"/>
+          <w:tab w:pos="8787" w:val="right" w:leader="dot"/>
         </w:tabs>
         <w:spacing w:before="0" w:after="0" w:line="480" w:lineRule="auto"/>
         <w:ind w:firstLine="0" w:left="567"/>
@@ -1590,7 +1644,7 @@
         </w:rPr>
         <w:t>3.9 Statistical Analysis</w:t>
         <w:tab/>
-        <w:t>10</w:t>
+        <w:t>14</w:t>
       </w:r>
     </w:p>
     <w:p>
@@ -1599,7 +1653,7 @@
         <w:pageBreakBefore w:val="0"/>
         <w:widowControl/>
         <w:tabs>
-          <w:tab w:pos="7937" w:val="right" w:leader="dot"/>
+          <w:tab w:pos="8787" w:val="right" w:leader="dot"/>
         </w:tabs>
         <w:spacing w:before="0" w:after="0" w:line="480" w:lineRule="auto"/>
         <w:ind w:firstLine="0" w:left="567"/>
@@ -1615,7 +1669,7 @@
         </w:rPr>
         <w:t>3.10 Ethical Considerations</w:t>
         <w:tab/>
-        <w:t>10</w:t>
+        <w:t>14</w:t>
       </w:r>
     </w:p>
     <w:p>
@@ -1624,7 +1678,7 @@
         <w:pageBreakBefore w:val="0"/>
         <w:widowControl/>
         <w:tabs>
-          <w:tab w:pos="7937" w:val="right" w:leader="dot"/>
+          <w:tab w:pos="8787" w:val="right" w:leader="dot"/>
         </w:tabs>
         <w:spacing w:before="0" w:after="0" w:line="480" w:lineRule="auto"/>
         <w:ind w:firstLine="0" w:left="0"/>
@@ -1640,7 +1694,7 @@
         </w:rPr>
         <w:t>CHAPTER 4  Results</w:t>
         <w:tab/>
-        <w:t>11</w:t>
+        <w:t>15</w:t>
       </w:r>
     </w:p>
     <w:p>
@@ -1649,7 +1703,7 @@
         <w:pageBreakBefore w:val="0"/>
         <w:widowControl/>
         <w:tabs>
-          <w:tab w:pos="7937" w:val="right" w:leader="dot"/>
+          <w:tab w:pos="8787" w:val="right" w:leader="dot"/>
         </w:tabs>
         <w:spacing w:before="0" w:after="0" w:line="480" w:lineRule="auto"/>
         <w:ind w:firstLine="0" w:left="567"/>
@@ -1665,7 +1719,7 @@
         </w:rPr>
         <w:t>4.1 Weight Loss</w:t>
         <w:tab/>
-        <w:t>11</w:t>
+        <w:t>15</w:t>
       </w:r>
     </w:p>
     <w:p>
@@ -1674,7 +1728,7 @@
         <w:pageBreakBefore w:val="0"/>
         <w:widowControl/>
         <w:tabs>
-          <w:tab w:pos="7937" w:val="right" w:leader="dot"/>
+          <w:tab w:pos="8787" w:val="right" w:leader="dot"/>
         </w:tabs>
         <w:spacing w:before="0" w:after="0" w:line="480" w:lineRule="auto"/>
         <w:ind w:firstLine="0" w:left="567"/>
@@ -1690,7 +1744,7 @@
         </w:rPr>
         <w:t>4.2 Surface Roughness</w:t>
         <w:tab/>
-        <w:t>12</w:t>
+        <w:t>17</w:t>
       </w:r>
     </w:p>
     <w:p>
@@ -1699,7 +1753,7 @@
         <w:pageBreakBefore w:val="0"/>
         <w:widowControl/>
         <w:tabs>
-          <w:tab w:pos="7937" w:val="right" w:leader="dot"/>
+          <w:tab w:pos="8787" w:val="right" w:leader="dot"/>
         </w:tabs>
         <w:spacing w:before="0" w:after="0" w:line="480" w:lineRule="auto"/>
         <w:ind w:firstLine="0" w:left="567"/>
@@ -1715,7 +1769,7 @@
         </w:rPr>
         <w:t>4.3 Summary of Results</w:t>
         <w:tab/>
-        <w:t>14</w:t>
+        <w:t>20</w:t>
       </w:r>
     </w:p>
     <w:p>
@@ -1724,7 +1778,7 @@
         <w:pageBreakBefore w:val="0"/>
         <w:widowControl/>
         <w:tabs>
-          <w:tab w:pos="7937" w:val="right" w:leader="dot"/>
+          <w:tab w:pos="8787" w:val="right" w:leader="dot"/>
         </w:tabs>
         <w:spacing w:before="0" w:after="0" w:line="480" w:lineRule="auto"/>
         <w:ind w:firstLine="0" w:left="0"/>
@@ -1740,7 +1794,7 @@
         </w:rPr>
         <w:t>CHAPTER 5  Discussion</w:t>
         <w:tab/>
-        <w:t>15</w:t>
+        <w:t>21</w:t>
       </w:r>
     </w:p>
     <w:p>
@@ -1749,7 +1803,7 @@
         <w:pageBreakBefore w:val="0"/>
         <w:widowControl/>
         <w:tabs>
-          <w:tab w:pos="7937" w:val="right" w:leader="dot"/>
+          <w:tab w:pos="8787" w:val="right" w:leader="dot"/>
         </w:tabs>
         <w:spacing w:before="0" w:after="0" w:line="480" w:lineRule="auto"/>
         <w:ind w:firstLine="0" w:left="567"/>
@@ -1765,7 +1819,7 @@
         </w:rPr>
         <w:t>5.1 Weight Loss</w:t>
         <w:tab/>
-        <w:t>15</w:t>
+        <w:t>21</w:t>
       </w:r>
     </w:p>
     <w:p>
@@ -1774,7 +1828,7 @@
         <w:pageBreakBefore w:val="0"/>
         <w:widowControl/>
         <w:tabs>
-          <w:tab w:pos="7937" w:val="right" w:leader="dot"/>
+          <w:tab w:pos="8787" w:val="right" w:leader="dot"/>
         </w:tabs>
         <w:spacing w:before="0" w:after="0" w:line="480" w:lineRule="auto"/>
         <w:ind w:firstLine="0" w:left="567"/>
@@ -1790,7 +1844,7 @@
         </w:rPr>
         <w:t>5.2 Surface Roughness</w:t>
         <w:tab/>
-        <w:t>16</w:t>
+        <w:t>23</w:t>
       </w:r>
     </w:p>
     <w:p>
@@ -1799,7 +1853,7 @@
         <w:pageBreakBefore w:val="0"/>
         <w:widowControl/>
         <w:tabs>
-          <w:tab w:pos="7937" w:val="right" w:leader="dot"/>
+          <w:tab w:pos="8787" w:val="right" w:leader="dot"/>
         </w:tabs>
         <w:spacing w:before="0" w:after="0" w:line="480" w:lineRule="auto"/>
         <w:ind w:firstLine="0" w:left="567"/>
@@ -1815,7 +1869,7 @@
         </w:rPr>
         <w:t>5.3 Clinical Implications</w:t>
         <w:tab/>
-        <w:t>18</w:t>
+        <w:t>24</w:t>
       </w:r>
     </w:p>
     <w:p>
@@ -1824,7 +1878,7 @@
         <w:pageBreakBefore w:val="0"/>
         <w:widowControl/>
         <w:tabs>
-          <w:tab w:pos="7937" w:val="right" w:leader="dot"/>
+          <w:tab w:pos="8787" w:val="right" w:leader="dot"/>
         </w:tabs>
         <w:spacing w:before="0" w:after="0" w:line="480" w:lineRule="auto"/>
         <w:ind w:firstLine="0" w:left="567"/>
@@ -1840,7 +1894,7 @@
         </w:rPr>
         <w:t>5.4 Strengths of the Study</w:t>
         <w:tab/>
-        <w:t>18</w:t>
+        <w:t>25</w:t>
       </w:r>
     </w:p>
     <w:p>
@@ -1849,7 +1903,7 @@
         <w:pageBreakBefore w:val="0"/>
         <w:widowControl/>
         <w:tabs>
-          <w:tab w:pos="7937" w:val="right" w:leader="dot"/>
+          <w:tab w:pos="8787" w:val="right" w:leader="dot"/>
         </w:tabs>
         <w:spacing w:before="0" w:after="0" w:line="480" w:lineRule="auto"/>
         <w:ind w:firstLine="0" w:left="567"/>
@@ -1865,7 +1919,7 @@
         </w:rPr>
         <w:t>5.5 Limitations of the Study</w:t>
         <w:tab/>
-        <w:t>19</w:t>
+        <w:t>26</w:t>
       </w:r>
     </w:p>
     <w:p>
@@ -1874,7 +1928,7 @@
         <w:pageBreakBefore w:val="0"/>
         <w:widowControl/>
         <w:tabs>
-          <w:tab w:pos="7937" w:val="right" w:leader="dot"/>
+          <w:tab w:pos="8787" w:val="right" w:leader="dot"/>
         </w:tabs>
         <w:spacing w:before="0" w:after="0" w:line="480" w:lineRule="auto"/>
         <w:ind w:firstLine="0" w:left="567"/>
@@ -1890,7 +1944,7 @@
         </w:rPr>
         <w:t>5.6 Concluding Remarks</w:t>
         <w:tab/>
-        <w:t>19</w:t>
+        <w:t>26</w:t>
       </w:r>
     </w:p>
     <w:p>
@@ -1899,7 +1953,7 @@
         <w:pageBreakBefore w:val="0"/>
         <w:widowControl/>
         <w:tabs>
-          <w:tab w:pos="7937" w:val="right" w:leader="dot"/>
+          <w:tab w:pos="8787" w:val="right" w:leader="dot"/>
         </w:tabs>
         <w:spacing w:before="0" w:after="0" w:line="480" w:lineRule="auto"/>
         <w:ind w:firstLine="0" w:left="0"/>
@@ -1915,7 +1969,7 @@
         </w:rPr>
         <w:t>CHAPTER 6  Conclusions and Recommendations</w:t>
         <w:tab/>
-        <w:t>20</w:t>
+        <w:t>27</w:t>
       </w:r>
     </w:p>
     <w:p>
@@ -1924,7 +1978,7 @@
         <w:pageBreakBefore w:val="0"/>
         <w:widowControl/>
         <w:tabs>
-          <w:tab w:pos="7937" w:val="right" w:leader="dot"/>
+          <w:tab w:pos="8787" w:val="right" w:leader="dot"/>
         </w:tabs>
         <w:spacing w:before="0" w:after="0" w:line="480" w:lineRule="auto"/>
         <w:ind w:firstLine="0" w:left="567"/>
@@ -1940,7 +1994,7 @@
         </w:rPr>
         <w:t>6.1 Summary</w:t>
         <w:tab/>
-        <w:t>20</w:t>
+        <w:t>27</w:t>
       </w:r>
     </w:p>
     <w:p>
@@ -1949,7 +2003,7 @@
         <w:pageBreakBefore w:val="0"/>
         <w:widowControl/>
         <w:tabs>
-          <w:tab w:pos="7937" w:val="right" w:leader="dot"/>
+          <w:tab w:pos="8787" w:val="right" w:leader="dot"/>
         </w:tabs>
         <w:spacing w:before="0" w:after="0" w:line="480" w:lineRule="auto"/>
         <w:ind w:firstLine="0" w:left="567"/>
@@ -1965,7 +2019,7 @@
         </w:rPr>
         <w:t>6.2 Conclusions</w:t>
         <w:tab/>
-        <w:t>20</w:t>
+        <w:t>27</w:t>
       </w:r>
     </w:p>
     <w:p>
@@ -1974,7 +2028,7 @@
         <w:pageBreakBefore w:val="0"/>
         <w:widowControl/>
         <w:tabs>
-          <w:tab w:pos="7937" w:val="right" w:leader="dot"/>
+          <w:tab w:pos="8787" w:val="right" w:leader="dot"/>
         </w:tabs>
         <w:spacing w:before="0" w:after="0" w:line="480" w:lineRule="auto"/>
         <w:ind w:firstLine="0" w:left="567"/>
@@ -1990,7 +2044,7 @@
         </w:rPr>
         <w:t>6.3 Recommendations</w:t>
         <w:tab/>
-        <w:t>21</w:t>
+        <w:t>28</w:t>
       </w:r>
     </w:p>
     <w:p>
@@ -1999,7 +2053,7 @@
         <w:pageBreakBefore w:val="0"/>
         <w:widowControl/>
         <w:tabs>
-          <w:tab w:pos="7937" w:val="right" w:leader="dot"/>
+          <w:tab w:pos="8787" w:val="right" w:leader="dot"/>
         </w:tabs>
         <w:spacing w:before="0" w:after="0" w:line="480" w:lineRule="auto"/>
         <w:ind w:firstLine="0" w:left="0"/>
@@ -2015,7 +2069,7 @@
         </w:rPr>
         <w:t>CHAPTER 7  References</w:t>
         <w:tab/>
-        <w:t>22</w:t>
+        <w:t>29</w:t>
       </w:r>
     </w:p>
     <w:p>
@@ -2024,7 +2078,7 @@
         <w:pageBreakBefore w:val="0"/>
         <w:widowControl/>
         <w:tabs>
-          <w:tab w:pos="7937" w:val="right" w:leader="dot"/>
+          <w:tab w:pos="8787" w:val="right" w:leader="dot"/>
         </w:tabs>
         <w:spacing w:before="0" w:after="0" w:line="480" w:lineRule="auto"/>
         <w:ind w:firstLine="0" w:left="0"/>
@@ -2040,7 +2094,7 @@
         </w:rPr>
         <w:t>Arabic Summary</w:t>
         <w:tab/>
-        <w:t>24</w:t>
+        <w:t>32</w:t>
       </w:r>
     </w:p>
     <w:p>
@@ -2069,6 +2123,9 @@
         <w:keepNext w:val="0"/>
         <w:pageBreakBefore w:val="0"/>
         <w:widowControl/>
+        <w:tabs>
+          <w:tab w:pos="8787" w:val="right" w:leader="dot"/>
+        </w:tabs>
         <w:spacing w:before="0" w:after="0" w:line="480" w:lineRule="auto"/>
         <w:ind w:firstLine="0"/>
         <w:jc w:val="left"/>
@@ -2082,6 +2139,8 @@
           <w:sz w:val="24"/>
         </w:rPr>
         <w:t>Table 3.1  Brand, type, matrix, filler and load of the resin composites used in the study (protocol listing)</w:t>
+        <w:tab/>
+        <w:t>11</w:t>
       </w:r>
     </w:p>
     <w:p>
@@ -2089,6 +2148,9 @@
         <w:keepNext w:val="0"/>
         <w:pageBreakBefore w:val="0"/>
         <w:widowControl/>
+        <w:tabs>
+          <w:tab w:pos="8787" w:val="right" w:leader="dot"/>
+        </w:tabs>
         <w:spacing w:before="0" w:after="0" w:line="480" w:lineRule="auto"/>
         <w:ind w:firstLine="0"/>
         <w:jc w:val="left"/>
@@ -2102,6 +2164,8 @@
           <w:sz w:val="24"/>
         </w:rPr>
         <w:t>Table 4.1  Mean weight before and after simulated toothbrushing and percentage weight loss</w:t>
+        <w:tab/>
+        <w:t>15</w:t>
       </w:r>
     </w:p>
     <w:p>
@@ -2109,6 +2173,9 @@
         <w:keepNext w:val="0"/>
         <w:pageBreakBefore w:val="0"/>
         <w:widowControl/>
+        <w:tabs>
+          <w:tab w:pos="8787" w:val="right" w:leader="dot"/>
+        </w:tabs>
         <w:spacing w:before="0" w:after="0" w:line="480" w:lineRule="auto"/>
         <w:ind w:firstLine="0"/>
         <w:jc w:val="left"/>
@@ -2122,6 +2189,8 @@
           <w:sz w:val="24"/>
         </w:rPr>
         <w:t>Table 4.2  Mean surface roughness (Ra) before and after simulated toothbrushing and ΔRa</w:t>
+        <w:tab/>
+        <w:t>17</w:t>
       </w:r>
     </w:p>
     <w:p>
@@ -2129,6 +2198,9 @@
         <w:keepNext w:val="0"/>
         <w:pageBreakBefore w:val="0"/>
         <w:widowControl/>
+        <w:tabs>
+          <w:tab w:pos="8787" w:val="right" w:leader="dot"/>
+        </w:tabs>
         <w:spacing w:before="0" w:after="0" w:line="480" w:lineRule="auto"/>
         <w:ind w:firstLine="0"/>
         <w:jc w:val="left"/>
@@ -2142,6 +2214,104 @@
           <w:sz w:val="24"/>
         </w:rPr>
         <w:t>Table 4.3  Absolute weight loss after 10 000 brushing cycles</w:t>
+        <w:tab/>
+        <w:t>20</w:t>
+      </w:r>
+    </w:p>
+    <w:p>
+      <w:pPr>
+        <w:pStyle w:val="Heading1"/>
+        <w:keepNext/>
+        <w:pageBreakBefore/>
+        <w:widowControl/>
+        <w:spacing w:before="0" w:after="120" w:line="480" w:lineRule="auto"/>
+        <w:ind w:firstLine="0"/>
+        <w:jc w:val="center"/>
+      </w:pPr>
+      <w:r>
+        <w:rPr>
+          <w:rFonts w:ascii="Times New Roman" w:hAnsi="Times New Roman" w:eastAsia="Times New Roman"/>
+          <w:b/>
+          <w:i w:val="0"/>
+          <w:color w:val="000000"/>
+          <w:sz w:val="28"/>
+        </w:rPr>
+        <w:t>LIST OF FIGURES</w:t>
+      </w:r>
+    </w:p>
+    <w:p>
+      <w:pPr>
+        <w:keepNext w:val="0"/>
+        <w:pageBreakBefore w:val="0"/>
+        <w:widowControl/>
+        <w:tabs>
+          <w:tab w:pos="8787" w:val="right" w:leader="dot"/>
+        </w:tabs>
+        <w:spacing w:before="0" w:after="0" w:line="480" w:lineRule="auto"/>
+        <w:ind w:firstLine="0"/>
+        <w:jc w:val="left"/>
+      </w:pPr>
+      <w:r>
+        <w:rPr>
+          <w:rFonts w:ascii="Times New Roman" w:hAnsi="Times New Roman" w:eastAsia="Times New Roman"/>
+          <w:b w:val="0"/>
+          <w:i w:val="0"/>
+          <w:color w:val="000000"/>
+          <w:sz w:val="24"/>
+        </w:rPr>
+        <w:t>Figure 4.1  Mean percentage weight loss after 10 000 toothbrushing cycles</w:t>
+        <w:tab/>
+        <w:t>16</w:t>
+      </w:r>
+    </w:p>
+    <w:p>
+      <w:pPr>
+        <w:keepNext w:val="0"/>
+        <w:pageBreakBefore w:val="0"/>
+        <w:widowControl/>
+        <w:tabs>
+          <w:tab w:pos="8787" w:val="right" w:leader="dot"/>
+        </w:tabs>
+        <w:spacing w:before="0" w:after="0" w:line="480" w:lineRule="auto"/>
+        <w:ind w:firstLine="0"/>
+        <w:jc w:val="left"/>
+      </w:pPr>
+      <w:r>
+        <w:rPr>
+          <w:rFonts w:ascii="Times New Roman" w:hAnsi="Times New Roman" w:eastAsia="Times New Roman"/>
+          <w:b w:val="0"/>
+          <w:i w:val="0"/>
+          <w:color w:val="000000"/>
+          <w:sz w:val="24"/>
+        </w:rPr>
+        <w:t>Figure 4.2  Mean Ra before and after 10 000 toothbrushing cycles</w:t>
+        <w:tab/>
+        <w:t>18</w:t>
+      </w:r>
+    </w:p>
+    <w:p>
+      <w:pPr>
+        <w:keepNext w:val="0"/>
+        <w:pageBreakBefore w:val="0"/>
+        <w:widowControl/>
+        <w:tabs>
+          <w:tab w:pos="8787" w:val="right" w:leader="dot"/>
+        </w:tabs>
+        <w:spacing w:before="0" w:after="0" w:line="480" w:lineRule="auto"/>
+        <w:ind w:firstLine="0"/>
+        <w:jc w:val="left"/>
+      </w:pPr>
+      <w:r>
+        <w:rPr>
+          <w:rFonts w:ascii="Times New Roman" w:hAnsi="Times New Roman" w:eastAsia="Times New Roman"/>
+          <w:b w:val="0"/>
+          <w:i w:val="0"/>
+          <w:color w:val="000000"/>
+          <w:sz w:val="24"/>
+        </w:rPr>
+        <w:t>Figure 4.3  Mean change in Ra (ΔRa) after 10 000 toothbrushing cycles</w:t>
+        <w:tab/>
+        <w:t>19</w:t>
       </w:r>
     </w:p>
     <w:p>
@@ -2170,6 +2340,9 @@
         <w:keepNext w:val="0"/>
         <w:pageBreakBefore w:val="0"/>
         <w:widowControl/>
+        <w:tabs>
+          <w:tab w:pos="1814" w:val="left"/>
+        </w:tabs>
         <w:spacing w:before="0" w:after="0" w:line="480" w:lineRule="auto"/>
         <w:ind w:firstLine="0"/>
         <w:jc w:val="left"/>
@@ -2192,7 +2365,8 @@
           <w:color w:val="000000"/>
           <w:sz w:val="24"/>
         </w:rPr>
-        <w:t xml:space="preserve">    Analysis of variance</w:t>
+        <w:tab/>
+        <w:t>Analysis of variance</w:t>
       </w:r>
     </w:p>
     <w:p>
@@ -2200,6 +2374,9 @@
         <w:keepNext w:val="0"/>
         <w:pageBreakBefore w:val="0"/>
         <w:widowControl/>
+        <w:tabs>
+          <w:tab w:pos="1814" w:val="left"/>
+        </w:tabs>
         <w:spacing w:before="0" w:after="0" w:line="480" w:lineRule="auto"/>
         <w:ind w:firstLine="0"/>
         <w:jc w:val="left"/>
@@ -2222,7 +2399,8 @@
           <w:color w:val="000000"/>
           <w:sz w:val="24"/>
         </w:rPr>
-        <w:t xml:space="preserve">    Computer-aided design / computer-aided manufacture</w:t>
+        <w:tab/>
+        <w:t>Computer-aided design / computer-aided manufacture</w:t>
       </w:r>
     </w:p>
     <w:p>
@@ -2230,6 +2408,9 @@
         <w:keepNext w:val="0"/>
         <w:pageBreakBefore w:val="0"/>
         <w:widowControl/>
+        <w:tabs>
+          <w:tab w:pos="1814" w:val="left"/>
+        </w:tabs>
         <w:spacing w:before="0" w:after="0" w:line="480" w:lineRule="auto"/>
         <w:ind w:firstLine="0"/>
         <w:jc w:val="left"/>
@@ -2252,7 +2433,8 @@
           <w:color w:val="000000"/>
           <w:sz w:val="24"/>
         </w:rPr>
-        <w:t xml:space="preserve">    International Organization for Standardization</w:t>
+        <w:tab/>
+        <w:t>International Organization for Standardization</w:t>
       </w:r>
     </w:p>
     <w:p>
@@ -2260,6 +2442,9 @@
         <w:keepNext w:val="0"/>
         <w:pageBreakBefore w:val="0"/>
         <w:widowControl/>
+        <w:tabs>
+          <w:tab w:pos="1814" w:val="left"/>
+        </w:tabs>
         <w:spacing w:before="0" w:after="0" w:line="480" w:lineRule="auto"/>
         <w:ind w:firstLine="0"/>
         <w:jc w:val="left"/>
@@ -2282,7 +2467,8 @@
           <w:color w:val="000000"/>
           <w:sz w:val="24"/>
         </w:rPr>
-        <w:t xml:space="preserve">    Light-emitting diode</w:t>
+        <w:tab/>
+        <w:t>Light-emitting diode</w:t>
       </w:r>
     </w:p>
     <w:p>
@@ -2290,6 +2476,9 @@
         <w:keepNext w:val="0"/>
         <w:pageBreakBefore w:val="0"/>
         <w:widowControl/>
+        <w:tabs>
+          <w:tab w:pos="1814" w:val="left"/>
+        </w:tabs>
         <w:spacing w:before="0" w:after="0" w:line="480" w:lineRule="auto"/>
         <w:ind w:firstLine="0"/>
         <w:jc w:val="left"/>
@@ -2312,7 +2501,8 @@
           <w:color w:val="000000"/>
           <w:sz w:val="24"/>
         </w:rPr>
-        <w:t xml:space="preserve">    Arithmetic mean roughness</w:t>
+        <w:tab/>
+        <w:t>Arithmetic mean roughness</w:t>
       </w:r>
     </w:p>
     <w:p>
@@ -2320,6 +2510,9 @@
         <w:keepNext w:val="0"/>
         <w:pageBreakBefore w:val="0"/>
         <w:widowControl/>
+        <w:tabs>
+          <w:tab w:pos="1814" w:val="left"/>
+        </w:tabs>
         <w:spacing w:before="0" w:after="0" w:line="480" w:lineRule="auto"/>
         <w:ind w:firstLine="0"/>
         <w:jc w:val="left"/>
@@ -2342,7 +2535,8 @@
           <w:color w:val="000000"/>
           <w:sz w:val="24"/>
         </w:rPr>
-        <w:t xml:space="preserve">    Relative dentine abrasivity</w:t>
+        <w:tab/>
+        <w:t>Relative dentine abrasivity</w:t>
       </w:r>
     </w:p>
     <w:p>
@@ -2350,6 +2544,9 @@
         <w:keepNext w:val="0"/>
         <w:pageBreakBefore w:val="0"/>
         <w:widowControl/>
+        <w:tabs>
+          <w:tab w:pos="1814" w:val="left"/>
+        </w:tabs>
         <w:spacing w:before="0" w:after="0" w:line="480" w:lineRule="auto"/>
         <w:ind w:firstLine="0"/>
         <w:jc w:val="left"/>
@@ -2372,7 +2569,8 @@
           <w:color w:val="000000"/>
           <w:sz w:val="24"/>
         </w:rPr>
-        <w:t xml:space="preserve">    Standard deviation</w:t>
+        <w:tab/>
+        <w:t>Standard deviation</w:t>
       </w:r>
     </w:p>
     <w:p>
@@ -2380,6 +2578,9 @@
         <w:keepNext w:val="0"/>
         <w:pageBreakBefore w:val="0"/>
         <w:widowControl/>
+        <w:tabs>
+          <w:tab w:pos="1814" w:val="left"/>
+        </w:tabs>
         <w:spacing w:before="0" w:after="0" w:line="480" w:lineRule="auto"/>
         <w:ind w:firstLine="0"/>
         <w:jc w:val="left"/>
@@ -2402,7 +2603,8 @@
           <w:color w:val="000000"/>
           <w:sz w:val="24"/>
         </w:rPr>
-        <w:t xml:space="preserve">    Surface pre-reacted glass-ionomer</w:t>
+        <w:tab/>
+        <w:t>Surface pre-reacted glass-ionomer</w:t>
       </w:r>
     </w:p>
     <w:p>
@@ -2410,6 +2612,9 @@
         <w:keepNext w:val="0"/>
         <w:pageBreakBefore w:val="0"/>
         <w:widowControl/>
+        <w:tabs>
+          <w:tab w:pos="1814" w:val="left"/>
+        </w:tabs>
         <w:spacing w:before="0" w:after="0" w:line="480" w:lineRule="auto"/>
         <w:ind w:firstLine="0"/>
         <w:jc w:val="left"/>
@@ -2432,17 +2637,22 @@
           <w:color w:val="000000"/>
           <w:sz w:val="24"/>
         </w:rPr>
-        <w:t xml:space="preserve">    Change in Ra (after − before)</w:t>
+        <w:tab/>
+        <w:t>Change in Ra (after − before)</w:t>
       </w:r>
     </w:p>
     <w:p>
       <w:pPr>
         <w:sectPr>
-          <w:footerReference w:type="default" r:id="rId12"/>
+          <w:headerReference w:type="default" r:id="rId17"/>
+          <w:headerReference w:type="first" r:id="rId18"/>
+          <w:headerReference w:type="even" r:id="rId19"/>
+          <w:footerReference w:type="default" r:id="rId20"/>
+          <w:footerReference w:type="first" r:id="rId21"/>
+          <w:footerReference w:type="even" r:id="rId22"/>
           <w:pgSz w:w="11906" w:h="16838"/>
-          <w:pgMar w:top="1417" w:right="1417" w:bottom="1417" w:left="1701" w:header="0" w:footer="0" w:gutter="0"/>
+          <w:pgMar w:top="2098" w:right="1417" w:bottom="1417" w:left="1701" w:header="227" w:footer="680" w:gutter="0"/>
           <w:cols w:space="720"/>
-          <w:titlePg/>
           <w:docGrid w:linePitch="360"/>
           <w:pgNumType w:fmt="lowerRoman" w:start="1"/>
         </w:sectPr>
@@ -2507,7 +2717,7 @@
           <w:color w:val="000000"/>
           <w:sz w:val="24"/>
         </w:rPr>
-        <w:t>Resin composites fail when the surface wears away or when what is left is rough. Wear flattens anatomy and can shorten the vertical dimension. Roughness holds plaque, takes stain and favours caries at the margin (1,2). Toothbrushing is a daily source of both. Dentifrice abrasive works as a third body. The resin-rich skin is removed first. Filler then stands proud or is pulled out. Mass falls. Ra rises (3,4).</w:t>
+        <w:t>Resin composites are the usual material for direct restorations because they can be matched to tooth colour and bonded to enamel and dentine (11,27). They still fail at the surface. Wear flattens anatomy and can shorten the vertical dimension. Roughness holds plaque, takes stain and favours caries at the margin (1,2,17). Those two surface changes run together. The resin-rich skin is removed first. Filler then stands proud or is pulled out. Mass falls. Ra rises (3,4,28).</w:t>
       </w:r>
     </w:p>
     <w:p>
@@ -2527,7 +2737,7 @@
           <w:color w:val="000000"/>
           <w:sz w:val="24"/>
         </w:rPr>
-        <w:t>On free surfaces of anterior restorations that wear is largely three-body. The brush and the paste sit between the bristle and the resin. Two-body contact wear is a different problem. It needs an antagonist and a much higher load. The two tests answer different questions (3,6,10).</w:t>
+        <w:t>Toothbrushing is a daily source of both. Dentifrice abrasive works as a third body between the bristle and the restoration (3,8,29). On free surfaces of anterior restorations that is the main wear mode. Two-body contact wear is a different problem. It needs an antagonist and a much higher load. The two tests answer different questions and cannot be substituted for each other (3,6,10,34).</w:t>
       </w:r>
     </w:p>
     <w:p>
@@ -2547,7 +2757,47 @@
           <w:color w:val="000000"/>
           <w:sz w:val="24"/>
         </w:rPr>
-        <w:t>Highly filled injectable resins were made so that a syringeable paste could be used in cavities that used to be reserved for packable composites. Filler load is raised, particle size is reduced, and silane treatment is improved until the paste still flows but no longer behaves like a classical low-filled flowable (5,6). G-ænial Universal Injectable (GC Corporation, Tokyo, Japan) and Beautifil Flow Plus X F00 (Shofu Inc., Kyoto, Japan) are sold on that claim. Beautifil II LS (Shofu Inc.) is a sculptable low-shrinkage nanohybrid giomer and is the conventional control in this work. All three were used in shade A2.</w:t>
+        <w:t>First-generation flowable resins were not written for load-bearing work. Filler load sat at about 40–55 wt%. Shrinkage was higher and wear was faster than in a packable hybrid (5,13). Highly filled injectable resins were made so that a syringeable paste could be used in cavities that used to be reserved for those packable composites. Filler load is raised, particle size is reduced, and silane treatment is improved until the paste still flows but no longer behaves like a classical low-filled flowable (5,6,20). Manufacturers now sell them for posterior as well as anterior use.</w:t>
+      </w:r>
+    </w:p>
+    <w:p>
+      <w:pPr>
+        <w:keepNext w:val="0"/>
+        <w:pageBreakBefore w:val="0"/>
+        <w:widowControl/>
+        <w:spacing w:before="0" w:after="0" w:line="480" w:lineRule="auto"/>
+        <w:ind w:firstLine="720"/>
+        <w:jc w:val="both"/>
+      </w:pPr>
+      <w:r>
+        <w:rPr>
+          <w:rFonts w:ascii="Times New Roman" w:hAnsi="Times New Roman" w:eastAsia="Times New Roman"/>
+          <w:b w:val="0"/>
+          <w:i w:val="0"/>
+          <w:color w:val="000000"/>
+          <w:sz w:val="24"/>
+        </w:rPr>
+        <w:t>G-ænial Universal Injectable (GC Corporation, Tokyo, Japan) and Beautifil Flow Plus X F00 (Shofu Inc., Kyoto, Japan) are two such pastes. Beautifil II LS (Shofu Inc.) is a sculptable low-shrinkage nanohybrid giomer and is the conventional control in this work. All three were used in shade A2. The approved protocol listed their filler volume as 50 %, 47 % and 68 % respectively.</w:t>
+      </w:r>
+    </w:p>
+    <w:p>
+      <w:pPr>
+        <w:keepNext w:val="0"/>
+        <w:pageBreakBefore w:val="0"/>
+        <w:widowControl/>
+        <w:spacing w:before="0" w:after="0" w:line="480" w:lineRule="auto"/>
+        <w:ind w:firstLine="720"/>
+        <w:jc w:val="both"/>
+      </w:pPr>
+      <w:r>
+        <w:rPr>
+          <w:rFonts w:ascii="Times New Roman" w:hAnsi="Times New Roman" w:eastAsia="Times New Roman"/>
+          <w:b w:val="0"/>
+          <w:i w:val="0"/>
+          <w:color w:val="000000"/>
+          <w:sz w:val="24"/>
+        </w:rPr>
+        <w:t>Two of the three pastes are giomers. Beautifil Flow Plus X F00 and Beautifil II LS contain surface pre-reacted glass-ionomer (S-PRG) filler. That glass can release fluoride and other ions, and the same ion exchange can roughen the surface in acid (19,21). The present test does not measure ion release. G-ænial Universal Injectable is not a giomer. It is a highly filled dimethacrylate paste with ultrafine barium glass and silica (6,18). The comparison is therefore one injectable giomer and one injectable nanofill against a packable giomer nanohybrid, not three products of the same chemistry.</w:t>
       </w:r>
     </w:p>
     <w:p>
@@ -2587,7 +2837,27 @@
           <w:color w:val="000000"/>
           <w:sz w:val="24"/>
         </w:rPr>
-        <w:t>An Ra of 0.2 µm is the usual threshold above which plaque retention rises (1). Surfaces smoother than that do not keep less plaque in a way that matters clinically. A restoration rougher than about 0.5 µm can be felt by the tongue (2). Those two numbers are the clinical frame for the roughness results.</w:t>
+        <w:t>An Ra of 0.2 µm is the usual threshold above which plaque retention rises (1,17). Surfaces smoother than that do not keep less plaque in a way that matters clinically. A restoration rougher than about 0.5 µm can be felt by the tongue (2). Those two numbers are the clinical frame for the roughness results.</w:t>
+      </w:r>
+    </w:p>
+    <w:p>
+      <w:pPr>
+        <w:keepNext w:val="0"/>
+        <w:pageBreakBefore w:val="0"/>
+        <w:widowControl/>
+        <w:spacing w:before="0" w:after="0" w:line="480" w:lineRule="auto"/>
+        <w:ind w:firstLine="720"/>
+        <w:jc w:val="both"/>
+      </w:pPr>
+      <w:r>
+        <w:rPr>
+          <w:rFonts w:ascii="Times New Roman" w:hAnsi="Times New Roman" w:eastAsia="Times New Roman"/>
+          <w:b w:val="0"/>
+          <w:i w:val="0"/>
+          <w:color w:val="000000"/>
+          <w:sz w:val="24"/>
+        </w:rPr>
+        <w:t>Wear resistance of a composite is governed by filler volume, size, shape and coupling, by the resin and by the degree of conversion (11,12,26). Hydrolytic softening of the matrix can add to that loss after water storage (25,33). A laboratory ranking after a defined slurry and cycle count is useful. It is not a clinical lifetime (10,34). The question here is narrower: after one conventional laboratory year of toothbrushing, do the two injectables lose more mass, or finish rougher, than Beautifil II LS?</w:t>
       </w:r>
     </w:p>
     <w:p>
@@ -2853,7 +3123,7 @@
           <w:color w:val="000000"/>
           <w:sz w:val="24"/>
         </w:rPr>
-        <w:t>Wear is progressive loss of substance from two surfaces in relative motion (9). In the mouth the process is mixed. Attrition is two-body contact. Abrasion at non-contact sites is usually three-body, with food or toothpaste as the loose agent. Corrosion and fatigue run beside both (9,10). Laboratory ranking is useful. It is not a clinical lifetime.</w:t>
+        <w:t>Wear is progressive loss of substance from two surfaces in relative motion (9). In the mouth the process is mixed. Attrition is two-body contact at sites that meet. Abrasion at non-contact sites is usually three-body, with food or toothpaste as the loose agent. Corrosion and fatigue run beside both (9,10). Laboratory ranking is useful. It is not a clinical lifetime (10,34).</w:t>
       </w:r>
     </w:p>
     <w:p>
@@ -2873,7 +3143,7 @@
           <w:color w:val="000000"/>
           <w:sz w:val="24"/>
         </w:rPr>
-        <w:t>Filler volume, size, shape, inter-particle spacing, the resin, the degree of conversion and the silane layer all matter (11,12). Condon and Ferracane varied those three factors in an oral-wear simulator. Wear rose once filler volume fell below 48 vol%. It rose in a straight line as the fraction of silane-treated filler was cut. Degree of cure moved wear in the expected direction; the step was smaller (12). Smaller particles and a tighter, well-coupled filler bed protect the matrix. Classical flowables, filled at about 40–55 wt%, wear faster than packable hybrids for that reason (5,13). Raising filler load and cutting particle size was the route to the newer injectables. G-ænial Universal Injectable is listed at 50 vol%. That sits just above Condon’s 48 vol% step. Beautifil II LS is listed at 83 wt%.</w:t>
+        <w:t>Filler volume, size, shape, inter-particle spacing, the resin, the degree of conversion and the silane layer all matter (11,12,26). Condon and Ferracane varied cure, filler level and silane treatment in an oral-wear simulator. Wear rose once filler volume fell below 48 vol%. It rose in a straight line as the fraction of silane-treated filler was cut. Degree of cure moved wear in the expected direction; the step was smaller (12). Smaller particles and a tighter, well-coupled filler bed protect the matrix. Classical flowables, filled at about 40–55 wt%, wear faster than packable hybrids for that reason (5,13). Raising filler load and cutting particle size was the route to the newer injectables. G-ænial Universal Injectable is listed at 50 vol% in the approved protocol. That sits just above Condon’s 48 vol% step. Beautifil II LS is listed at 68 vol% in the same table.</w:t>
       </w:r>
     </w:p>
     <w:p>
@@ -2893,7 +3163,7 @@
           <w:color w:val="000000"/>
           <w:sz w:val="24"/>
         </w:rPr>
-        <w:t>Toothbrushing tests follow ISO/TR 14569-1. The brush load should lie between 0.5 N and 2.5 N. The slurry is made from a dentifrice that meets ISO 11609 (3,14). Ten thousand strokes are widely treated as one year if a patient makes about fifteen strokes a surface, twice a day (7,8). The conversion is an estimate. It is still the figure most toothbrushing papers use.</w:t>
+        <w:t>Water storage softens the resin and can loosen the silane layer. Ferracane reviewed hygroscopic and hydrolytic effects in dental polymer networks (25). Söderholm and co-workers showed hydrolytic degradation of the filler–matrix interface in earlier composites (33). A 24 h soak at 37 °C, as used here, is a short water challenge. It is not a long ageing study.</w:t>
       </w:r>
     </w:p>
     <w:p>
@@ -2913,7 +3183,27 @@
           <w:color w:val="000000"/>
           <w:sz w:val="24"/>
         </w:rPr>
-        <w:t>Wear may be read as volume, profile depth or mass. Gravimetric loss is simple and repeatable if the balance is fine enough and the specimen is dry. It does not describe the shape of the worn surface. Volume from a scan does. The two numbers answer different questions (10,15).</w:t>
+        <w:t>Toothbrushing tests follow ISO/TR 14569-1. The brush load should lie between 0.5 N and 2.5 N. The slurry is made from a dentifrice that meets ISO 11609 (3,14). Ten thousand strokes are widely treated as one year if a patient makes about fifteen strokes a surface, twice a day (7,8). The conversion is an estimate. It is still the figure most toothbrushing papers use. Heintze later set out how a wear simulator should be qualified if the ranking is to be compared across laboratories (34).</w:t>
+      </w:r>
+    </w:p>
+    <w:p>
+      <w:pPr>
+        <w:keepNext w:val="0"/>
+        <w:pageBreakBefore w:val="0"/>
+        <w:widowControl/>
+        <w:spacing w:before="0" w:after="0" w:line="480" w:lineRule="auto"/>
+        <w:ind w:firstLine="720"/>
+        <w:jc w:val="both"/>
+      </w:pPr>
+      <w:r>
+        <w:rPr>
+          <w:rFonts w:ascii="Times New Roman" w:hAnsi="Times New Roman" w:eastAsia="Times New Roman"/>
+          <w:b w:val="0"/>
+          <w:i w:val="0"/>
+          <w:color w:val="000000"/>
+          <w:sz w:val="24"/>
+        </w:rPr>
+        <w:t>Wear may be read as volume, profile depth or mass. Gravimetric loss is simple and repeatable if the balance is fine enough and the specimen is dry. It does not describe the shape of the worn surface. Volume from a scan does. Heintze compared mass, profile depth and scanned volume and showed that the three methods do not tell the same story (15). Lambrechts reviewed the range of laboratory wear machines and warned against reading any one of them as a clinical year (10). The two numbers answer different questions.</w:t>
       </w:r>
     </w:p>
     <w:p>
@@ -2954,7 +3244,27 @@
           <w:color w:val="000000"/>
           <w:sz w:val="24"/>
         </w:rPr>
-        <w:t>Ra is the mean absolute deviation of the profile from the centre line. It is the parameter almost every dental paper reports. Contact stylus profilometry remains a standard method. Optical methods add a map but are not required to rank Ra (4,16).</w:t>
+        <w:t>Ra is the arithmetic mean of the absolute deviations of the profile from the centre line. It is the parameter defined for the profile method in ISO 4287 and the one almost every dental paper reports (16). Areal parameters are set out in ISO 25178-2 (23). They need an optical or scanning map. They are not required to rank Ra after toothbrushing.</w:t>
+      </w:r>
+    </w:p>
+    <w:p>
+      <w:pPr>
+        <w:keepNext w:val="0"/>
+        <w:pageBreakBefore w:val="0"/>
+        <w:widowControl/>
+        <w:spacing w:before="0" w:after="0" w:line="480" w:lineRule="auto"/>
+        <w:ind w:firstLine="720"/>
+        <w:jc w:val="both"/>
+      </w:pPr>
+      <w:r>
+        <w:rPr>
+          <w:rFonts w:ascii="Times New Roman" w:hAnsi="Times New Roman" w:eastAsia="Times New Roman"/>
+          <w:b w:val="0"/>
+          <w:i w:val="0"/>
+          <w:color w:val="000000"/>
+          <w:sz w:val="24"/>
+        </w:rPr>
+        <w:t>Contact stylus profilometry remains a standard method. Kakaboura and co-workers compared profilometry, scanning electron microscopy, atomic force microscopy and gloss on the same composite surfaces. The methods agreed on rank more often than on the absolute number (31). Optical methods add a map. They are not required to rank Ra (4,16,31).</w:t>
       </w:r>
     </w:p>
     <w:p>
@@ -2994,7 +3304,7 @@
           <w:color w:val="000000"/>
           <w:sz w:val="24"/>
         </w:rPr>
-        <w:t>Toothbrushing raises Ra. Heintze and co-workers showed that the rise depends on material, time and load (4). Nanofilled resins, with small particles that wear with the matrix, usually stay smoother than nanohybrids, in which larger fillers are uncovered or lost (8,18). The toothpaste matters. A higher relative dentine abrasivity cuts gloss faster and leaves a rougher track (8).</w:t>
+        <w:t>Toothbrushing raises Ra. Heintze and co-workers showed that the rise depends on material, time and load (4). Turssi and colleagues tracked resin-based materials during brushing and recorded a progressive rise in roughness (30). Nanofilled resins, with small particles that wear with the matrix, usually stay smoother than nanohybrids, in which larger fillers are uncovered or lost (8,18,28,35). The toothpaste matters. A higher relative dentine abrasivity cuts gloss faster and leaves a rougher track (8,29). da Costa and Ferracane’s group showed that dentifrice type changes both Ra and gloss of the same composite (29). Monteiro and Spohr reached the same conclusion with a different set of pastes (8).</w:t>
       </w:r>
     </w:p>
     <w:p>
@@ -3015,7 +3325,7 @@
           <w:color w:val="000000"/>
           <w:sz w:val="24"/>
         </w:rPr>
-        <w:t>2.3 Injectable Composite Resins</w:t>
+        <w:t>2.3 Filler Size and Toothbrush Abrasion</w:t>
       </w:r>
     </w:p>
     <w:p>
@@ -3035,7 +3345,108 @@
           <w:color w:val="000000"/>
           <w:sz w:val="24"/>
         </w:rPr>
-        <w:t>Early flowables were not intended for occlusal load (13). The current injectables are a different paste. G-ænial Universal Injectable is filled to about 69 wt% (50 vol%) with ultrafine barium glass and silica, mean size about 150 nm, in a UDMA / Bis-MEPP / TEGDMA matrix (6,18). Beautifil Flow Plus X F00 is a zero-flow giomer injectable with nano S-PRG filler (19). It is not the same product as Beautifil Flow Plus F00 used in several earlier papers (6).</w:t>
+        <w:t>Cavalcante, Masouras, Watts, Pimenta and Silikas brushed model composites whose fillers ran from 100 nm to 1000 nm. After 20 000 strokes, larger fillers left a higher Ra and a lower gloss. Colour change was small and was not tied to filler size (28). That is the geometry argument in a single experiment.</w:t>
+      </w:r>
+    </w:p>
+    <w:p>
+      <w:pPr>
+        <w:keepNext w:val="0"/>
+        <w:pageBreakBefore w:val="0"/>
+        <w:widowControl/>
+        <w:spacing w:before="0" w:after="0" w:line="480" w:lineRule="auto"/>
+        <w:ind w:firstLine="720"/>
+        <w:jc w:val="both"/>
+      </w:pPr>
+      <w:r>
+        <w:rPr>
+          <w:rFonts w:ascii="Times New Roman" w:hAnsi="Times New Roman" w:eastAsia="Times New Roman"/>
+          <w:b w:val="0"/>
+          <w:i w:val="0"/>
+          <w:color w:val="000000"/>
+          <w:sz w:val="24"/>
+        </w:rPr>
+        <w:t>Moraes and co-workers brushed packable, microhybrid, nanohybrid and microfilled resins. Wear and roughness were material-dependent. The microfilled paste behaved differently from the hybrids (32). de Oliveira and colleagues later compared nanofilled and microhybrid resins after 100 000 strokes. Nanofilled materials generally wore less and stayed smoother, though not every product followed the mean (36). Senawongse and Pongprueksa polished and then brushed nanofill and nanohybrid pastes. After brushing the nanofill stayed smoother (35). Suzuki and Finger’s group used a calcium-carbonate slurry for 50 000 cycles. Wear depth rose almost in a straight line with cycle count. Surface texture on SEM showed uniform abrasion of a nanofill and matrix loss around larger glass in two nanohybrids (37).</w:t>
+      </w:r>
+    </w:p>
+    <w:p>
+      <w:pPr>
+        <w:keepNext w:val="0"/>
+        <w:pageBreakBefore w:val="0"/>
+        <w:widowControl/>
+        <w:spacing w:before="0" w:after="0" w:line="480" w:lineRule="auto"/>
+        <w:ind w:firstLine="720"/>
+        <w:jc w:val="both"/>
+      </w:pPr>
+      <w:r>
+        <w:rPr>
+          <w:rFonts w:ascii="Times New Roman" w:hAnsi="Times New Roman" w:eastAsia="Times New Roman"/>
+          <w:b w:val="0"/>
+          <w:i w:val="0"/>
+          <w:color w:val="000000"/>
+          <w:sz w:val="24"/>
+        </w:rPr>
+        <w:t>Taken together, those papers support a simple rule. When the filler is small and well coupled, the surface wears evenly. When larger glass or pre-polymerised particles sit in a softer matrix, the matrix goes first and Ra rises (4,28,35,37).</w:t>
+      </w:r>
+    </w:p>
+    <w:p>
+      <w:pPr>
+        <w:pStyle w:val="Heading2"/>
+        <w:keepNext/>
+        <w:pageBreakBefore w:val="0"/>
+        <w:widowControl/>
+        <w:spacing w:before="360" w:after="120" w:line="480" w:lineRule="auto"/>
+        <w:ind w:firstLine="0"/>
+        <w:jc w:val="left"/>
+      </w:pPr>
+      <w:r>
+        <w:rPr>
+          <w:rFonts w:ascii="Times New Roman" w:hAnsi="Times New Roman" w:eastAsia="Times New Roman"/>
+          <w:b/>
+          <w:i w:val="0"/>
+          <w:color w:val="000000"/>
+          <w:sz w:val="24"/>
+        </w:rPr>
+        <w:t>2.4 Injectable Composite Resins</w:t>
+      </w:r>
+    </w:p>
+    <w:p>
+      <w:pPr>
+        <w:keepNext w:val="0"/>
+        <w:pageBreakBefore w:val="0"/>
+        <w:widowControl/>
+        <w:spacing w:before="0" w:after="0" w:line="480" w:lineRule="auto"/>
+        <w:ind w:firstLine="720"/>
+        <w:jc w:val="both"/>
+      </w:pPr>
+      <w:r>
+        <w:rPr>
+          <w:rFonts w:ascii="Times New Roman" w:hAnsi="Times New Roman" w:eastAsia="Times New Roman"/>
+          <w:b w:val="0"/>
+          <w:i w:val="0"/>
+          <w:color w:val="000000"/>
+          <w:sz w:val="24"/>
+        </w:rPr>
+        <w:t>Early flowables were not intended for occlusal load (5,13). Baroudi and Rodrigues reviewed that generation and kept them for lining, small repairs and conservative boxes (13). The current injectables are a different paste. G-ænial Universal Injectable is filled to about 69 wt% (50 vol%) with ultrafine barium glass and silica, mean size about 150 nm, in a UDMA / Bis-MEPP / TEGDMA matrix (6,18). Beautifil Flow Plus X F00 is a zero-flow giomer injectable with multifunctional glass and nano S-PRG filler (19). The protocol lists 47 vol%. It is not the same product as Beautifil Flow Plus F00 used in several earlier papers (6).</w:t>
+      </w:r>
+    </w:p>
+    <w:p>
+      <w:pPr>
+        <w:keepNext w:val="0"/>
+        <w:pageBreakBefore w:val="0"/>
+        <w:widowControl/>
+        <w:spacing w:before="0" w:after="0" w:line="480" w:lineRule="auto"/>
+        <w:ind w:firstLine="720"/>
+        <w:jc w:val="both"/>
+      </w:pPr>
+      <w:r>
+        <w:rPr>
+          <w:rFonts w:ascii="Times New Roman" w:hAnsi="Times New Roman" w:eastAsia="Times New Roman"/>
+          <w:b w:val="0"/>
+          <w:i w:val="0"/>
+          <w:color w:val="000000"/>
+          <w:sz w:val="24"/>
+        </w:rPr>
+        <w:t>Ilie and Hickel surveyed mechanical behaviour across commercial composites and showed wide scatter inside each marketing class (26,27). A label such as “injectable” or “nanohybrid” does not fix wear or Ra. The filler bed does.</w:t>
       </w:r>
     </w:p>
     <w:p>
@@ -3116,7 +3527,7 @@
           <w:color w:val="000000"/>
           <w:sz w:val="24"/>
         </w:rPr>
-        <w:t>2.4 Conventional Nanohybrid Resins and Giomers</w:t>
+        <w:t>2.5 Conventional Nanohybrid Resins and Giomers</w:t>
       </w:r>
     </w:p>
     <w:p>
@@ -3136,7 +3547,7 @@
           <w:color w:val="000000"/>
           <w:sz w:val="24"/>
         </w:rPr>
-        <w:t>Nanohybrid pastes mix nano-sized particles with larger submicron or micron fillers. Total inorganic load commonly exceeds 70–80 wt% (11). Beautifil II LS is such a paste. Filler load is 83 wt%. The resin uses an SRS monomer aimed at low shrinkage. The filler includes S-PRG glass (19). S-PRG releases ions, including fluoride. The same ion exchange can roughen the surface in acid (21). Larger and irregular fillers, once the matrix is brushed off, leave a higher Ra than a uniform nano-filled injectable (18). An eight-year clinical series of a giomer paste (Beautifil with a self-etch primer) showed acceptable retention and little secondary caries in the teeth that were still available for recall (22). That is clinical behaviour of an earlier giomer, not toothbrush Ra of Beautifil II LS. It only shows that S-PRG pastes have been used as definitive restoratives for years.</w:t>
+        <w:t>Nanohybrid pastes mix nano-sized particles with larger submicron or micron fillers. Total inorganic load commonly exceeds 70–80 wt% or, in volume terms, sits well above the 48 vol% step that Condon described (11,12). Beautifil II LS is such a paste. The approved protocol lists 68 vol%. The resin uses Bis-GMA, UDMA, Bis-EMA, PEGMA and TEGDMA. The filler includes multifunctional glass and S-PRG (19). S-PRG releases ions, including fluoride. The same ion exchange can roughen the surface in acid (21). Larger and irregular fillers, once the matrix is brushed off, leave a higher Ra than a uniform nano-filled injectable (18,28,35).</w:t>
       </w:r>
     </w:p>
     <w:p>
@@ -3156,7 +3567,47 @@
           <w:color w:val="000000"/>
           <w:sz w:val="24"/>
         </w:rPr>
-        <w:t>Packable nanohybrids remain the clinical reference for posterior direct work. They are harder to adapt in a narrow box and more likely to trap voids. The injectable products were written to close that handling gap without giving up wear resistance. Whether they do so under toothbrush abrasion is the question of this thesis.</w:t>
+        <w:t>An eight-year clinical series of a giomer paste (Beautifil with a self-etch primer) showed acceptable retention and little secondary caries in the teeth that were still available for recall (22). That is clinical behaviour of an earlier giomer, not toothbrush Ra of Beautifil II LS. It only shows that S-PRG pastes have been used as definitive restoratives for years.</w:t>
+      </w:r>
+    </w:p>
+    <w:p>
+      <w:pPr>
+        <w:keepNext w:val="0"/>
+        <w:pageBreakBefore w:val="0"/>
+        <w:widowControl/>
+        <w:spacing w:before="0" w:after="0" w:line="480" w:lineRule="auto"/>
+        <w:ind w:firstLine="720"/>
+        <w:jc w:val="both"/>
+      </w:pPr>
+      <w:r>
+        <w:rPr>
+          <w:rFonts w:ascii="Times New Roman" w:hAnsi="Times New Roman" w:eastAsia="Times New Roman"/>
+          <w:b w:val="0"/>
+          <w:i w:val="0"/>
+          <w:color w:val="000000"/>
+          <w:sz w:val="24"/>
+        </w:rPr>
+        <w:t>Packable nanohybrids remain the clinical reference for posterior direct work (11,27). They are harder to adapt in a narrow box and more likely to trap voids. The injectable products were written to close that handling gap without giving up wear resistance. Whether they do so under toothbrush abrasion is the question of this thesis.</w:t>
+      </w:r>
+    </w:p>
+    <w:p>
+      <w:pPr>
+        <w:keepNext w:val="0"/>
+        <w:pageBreakBefore w:val="0"/>
+        <w:widowControl/>
+        <w:spacing w:before="0" w:after="0" w:line="480" w:lineRule="auto"/>
+        <w:ind w:firstLine="720"/>
+        <w:jc w:val="both"/>
+      </w:pPr>
+      <w:r>
+        <w:rPr>
+          <w:rFonts w:ascii="Times New Roman" w:hAnsi="Times New Roman" w:eastAsia="Times New Roman"/>
+          <w:b w:val="0"/>
+          <w:i w:val="0"/>
+          <w:color w:val="000000"/>
+          <w:sz w:val="24"/>
+        </w:rPr>
+        <w:t>ISO 4049 sets requirements for polymer-based restorative materials. It is the product standard, not a roughness standard (24). Roughness parameters remain those of ISO 4287 and, for maps, ISO 25178-2 (16,23).</w:t>
       </w:r>
     </w:p>
     <w:p>
@@ -3177,7 +3628,7 @@
           <w:color w:val="000000"/>
           <w:sz w:val="24"/>
         </w:rPr>
-        <w:t>2.5 Statement of the Problem</w:t>
+        <w:t>2.6 Statement of the Problem</w:t>
       </w:r>
     </w:p>
     <w:p>
@@ -3280,7 +3731,27 @@
           <w:color w:val="000000"/>
           <w:sz w:val="24"/>
         </w:rPr>
-        <w:t>The study was an in-vitro comparison of three resin composites. Disc preparation was done in the laboratory of the Faculty of Dentistry, Pharos University in Alexandria. The toothbrushing run and the measurements were done in the Conservative Dentistry laboratory of the Faculty of Dentistry, Alexandria University.</w:t>
+        <w:t>The study was an in-vitro comparison of three resin composites. No patient, extracted tooth or identifiable tissue was used. Disc preparation was done in the laboratory of the Faculty of Dentistry, Pharos University in Alexandria. The toothbrushing run and the measurements were done in the Conservative Dentistry laboratory of the Faculty of Dentistry, Alexandria University.</w:t>
+      </w:r>
+    </w:p>
+    <w:p>
+      <w:pPr>
+        <w:keepNext w:val="0"/>
+        <w:pageBreakBefore w:val="0"/>
+        <w:widowControl/>
+        <w:spacing w:before="0" w:after="0" w:line="480" w:lineRule="auto"/>
+        <w:ind w:firstLine="720"/>
+        <w:jc w:val="both"/>
+      </w:pPr>
+      <w:r>
+        <w:rPr>
+          <w:rFonts w:ascii="Times New Roman" w:hAnsi="Times New Roman" w:eastAsia="Times New Roman"/>
+          <w:b w:val="0"/>
+          <w:i w:val="0"/>
+          <w:color w:val="000000"/>
+          <w:sz w:val="24"/>
+        </w:rPr>
+        <w:t>The design follows the approved protocol of 3 February 2025. Wear is three-body toothbrush abrasion after ISO/TR 14569-1, not two-body antagonist wear (3,34). The materials fall under ISO 4049 as polymer-based restoratives (24). Roughness is reported as Ra after ISO 4287 (16).</w:t>
       </w:r>
     </w:p>
     <w:p>
@@ -3321,7 +3792,7 @@
           <w:color w:val="000000"/>
           <w:sz w:val="24"/>
         </w:rPr>
-        <w:t>Thirty-six discs were prepared, 10 mm in diameter and 1 mm thick. The discs were allocated at random to three groups of twelve.</w:t>
+        <w:t>Thirty-six discs were prepared, 10 mm in diameter and 1 mm thick. The discs were allocated at random to three groups of twelve. Disc geometry is that of the approved protocol. It is a flat face for profilometry and a known volume for weighing. It is not a Class II box.</w:t>
       </w:r>
     </w:p>
     <w:p>
@@ -3587,10 +4058,10 @@
     </w:p>
     <w:p>
       <w:pPr>
-        <w:keepNext/>
+        <w:keepNext w:val="0"/>
         <w:pageBreakBefore w:val="0"/>
         <w:widowControl/>
-        <w:spacing w:before="240" w:after="120" w:line="480" w:lineRule="auto"/>
+        <w:spacing w:before="120" w:after="240" w:line="480" w:lineRule="auto"/>
         <w:ind w:firstLine="0"/>
         <w:jc w:val="left"/>
       </w:pPr>
@@ -3619,14 +4090,14 @@
       <w:tblPr>
         <w:tblW w:type="auto" w:w="0"/>
         <w:jc w:val="center"/>
-        <w:tblLayout w:type="autofit"/>
+        <w:tblLayout w:type="fixed"/>
         <w:tblLook w:firstColumn="1" w:firstRow="1" w:lastColumn="0" w:lastRow="0" w:noHBand="0" w:noVBand="1" w:val="04A0"/>
       </w:tblPr>
       <w:tblGrid>
-        <w:gridCol w:w="2197"/>
-        <w:gridCol w:w="2197"/>
-        <w:gridCol w:w="2197"/>
-        <w:gridCol w:w="2197"/>
+        <w:gridCol w:w="2988"/>
+        <w:gridCol w:w="1933"/>
+        <w:gridCol w:w="1933"/>
+        <w:gridCol w:w="1933"/>
       </w:tblGrid>
       <w:tr>
         <w:tc>
@@ -4362,7 +4833,7 @@
           <w:color w:val="000000"/>
           <w:sz w:val="24"/>
         </w:rPr>
-        <w:t>Thirty-six discs were packed, one increment each, in a CAD/CAM-milled Teflon mould, 10 mm in diameter and 1 mm deep. A Mylar strip and a transparent microscope slide were placed over the paste so that the face was flat and free of air. The light tip was held against the slide. Each disc was cured for 20 s at 800 mW/cm². Three further 20 s exposures were given from different directions so that the disc was polymerised through its thickness. Flash was trimmed with a no. 12 scalpel blade (Suzhou Kyuan Medical Co., Jiangsu, China).</w:t>
+        <w:t>Thirty-six discs were packed, one increment each, in a CAD/CAM-milled Teflon mould, 10 mm in diameter and 1 mm deep. A Mylar strip and a transparent microscope slide were placed over the paste so that the face was flat and free of air. The light tip was held against the slide. Each disc was cured for 20 s at 800 mW/cm². Three further 20 s exposures were given from different directions so that the disc was polymerised through its thickness. Flash was trimmed with a no. 12 scalpel blade (Suzhou Kyuan Medical Co., Jiangsu, China). No graded polish sequence was used. The test face is the as-cured, strip-finished surface.</w:t>
       </w:r>
     </w:p>
     <w:p>
@@ -4382,7 +4853,7 @@
           <w:color w:val="000000"/>
           <w:sz w:val="24"/>
         </w:rPr>
-        <w:t>After removal from the mould the diameter of each disc was checked with the digital caliper. The discs were stored in distilled water in a closed glass container at 37 °C for 24 h. Before each weighing or roughness run a disc was taken out and dried with a sterile disposable sponge.</w:t>
+        <w:t>After removal from the mould the diameter of each disc was checked with the digital caliper. The discs were stored in distilled water in a closed glass container at 37 °C for 24 h. That interval is the usual short water soak before a laboratory mechanical test (24,25). Before each weighing or roughness run a disc was taken out and dried with a sterile disposable sponge. The same drying habit was used at baseline and after brushing so that retained water would not be read as mass.</w:t>
       </w:r>
     </w:p>
     <w:p>
@@ -4423,7 +4894,7 @@
           <w:color w:val="000000"/>
           <w:sz w:val="24"/>
         </w:rPr>
-        <w:t>Each dried disc was weighed on the RADWAG AS 220-R2. The recorded masses run to 0.0001 g; the balance therefore read to 0.1 mg.</w:t>
+        <w:t>Each dried disc was weighed on the RADWAG AS 220-R2. The recorded masses run to 0.0001 g; the balance therefore read to 0.1 mg. Gravimetric loss is the wear outcome named in the protocol (3,15).</w:t>
       </w:r>
     </w:p>
     <w:p>
@@ -4443,7 +4914,7 @@
           <w:color w:val="000000"/>
           <w:sz w:val="24"/>
         </w:rPr>
-        <w:t>Ra was measured on the test face with the MarSurf PS10. Five traces were taken at different sites on each disc. The value used for analysis was the mean of those five traces.</w:t>
+        <w:t>Ra was measured on the test face with the MarSurf PS10. Five traces were taken at different sites on each disc. The value used for analysis was the mean of those five traces. Ra is the profile parameter of ISO 4287 (16). Five traces reduce the chance that a single scratch sets the disc value. They do not produce an areal map (23,31).</w:t>
       </w:r>
     </w:p>
     <w:p>
@@ -4671,6 +5142,26 @@
     </w:p>
     <w:p>
       <w:pPr>
+        <w:keepNext w:val="0"/>
+        <w:pageBreakBefore w:val="0"/>
+        <w:widowControl/>
+        <w:spacing w:before="0" w:after="0" w:line="480" w:lineRule="auto"/>
+        <w:ind w:firstLine="720"/>
+        <w:jc w:val="both"/>
+      </w:pPr>
+      <w:r>
+        <w:rPr>
+          <w:rFonts w:ascii="Times New Roman" w:hAnsi="Times New Roman" w:eastAsia="Times New Roman"/>
+          <w:b w:val="0"/>
+          <w:i w:val="0"/>
+          <w:color w:val="000000"/>
+          <w:sz w:val="24"/>
+        </w:rPr>
+        <w:t>Percentage loss was treated as a parametric outcome. Ra after brushing was not. The locked analysis used those two tests. They are not interchangeable. A later check of normality on the raw sheet would belong in an appendix if that sheet is released. It is not invented here.</w:t>
+      </w:r>
+    </w:p>
+    <w:p>
+      <w:pPr>
         <w:pStyle w:val="Heading2"/>
         <w:keepNext/>
         <w:pageBreakBefore w:val="0"/>
@@ -4789,7 +5280,7 @@
           <w:color w:val="000000"/>
           <w:sz w:val="24"/>
         </w:rPr>
-        <w:t>The three pastes did not start at the same mass or at the same Ra. Those baseline differences are part of the result. They are not adjusted away.</w:t>
+        <w:t>The three pastes did not start at the same mass or at the same Ra. Those baseline differences are part of the result. They are not adjusted away. All thirty-six faces were strip-finished in the same mould, so the baseline Ra gap is a material difference, not a difference in grit (28,35).</w:t>
       </w:r>
     </w:p>
     <w:p>
@@ -4815,10 +5306,10 @@
     </w:p>
     <w:p>
       <w:pPr>
-        <w:keepNext/>
+        <w:keepNext w:val="0"/>
         <w:pageBreakBefore w:val="0"/>
         <w:widowControl/>
-        <w:spacing w:before="240" w:after="120" w:line="480" w:lineRule="auto"/>
+        <w:spacing w:before="120" w:after="240" w:line="480" w:lineRule="auto"/>
         <w:ind w:firstLine="0"/>
         <w:jc w:val="left"/>
       </w:pPr>
@@ -4847,15 +5338,15 @@
       <w:tblPr>
         <w:tblW w:type="auto" w:w="0"/>
         <w:jc w:val="center"/>
-        <w:tblLayout w:type="autofit"/>
+        <w:tblLayout w:type="fixed"/>
         <w:tblLook w:firstColumn="1" w:firstRow="1" w:lastColumn="0" w:lastRow="0" w:noHBand="0" w:noVBand="1" w:val="04A0"/>
       </w:tblPr>
       <w:tblGrid>
-        <w:gridCol w:w="1758"/>
-        <w:gridCol w:w="1758"/>
-        <w:gridCol w:w="1758"/>
-        <w:gridCol w:w="1758"/>
-        <w:gridCol w:w="1758"/>
+        <w:gridCol w:w="2988"/>
+        <w:gridCol w:w="1450"/>
+        <w:gridCol w:w="1450"/>
+        <w:gridCol w:w="1450"/>
+        <w:gridCol w:w="1450"/>
       </w:tblGrid>
       <w:tr>
         <w:tc>
@@ -4920,7 +5411,18 @@
                 <w:color w:val="000000"/>
                 <w:sz w:val="18"/>
               </w:rPr>
-              <w:t>Weight before (g) Mean ± SD</w:t>
+              <w:t>Weight before (g)</w:t>
+              <w:br/>
+            </w:r>
+            <w:r>
+              <w:rPr>
+                <w:rFonts w:ascii="Times New Roman" w:hAnsi="Times New Roman" w:eastAsia="Times New Roman"/>
+                <w:b/>
+                <w:i w:val="0"/>
+                <w:color w:val="000000"/>
+                <w:sz w:val="18"/>
+              </w:rPr>
+              <w:t>Mean ± SD</w:t>
             </w:r>
           </w:p>
         </w:tc>
@@ -4953,7 +5455,18 @@
                 <w:color w:val="000000"/>
                 <w:sz w:val="18"/>
               </w:rPr>
-              <w:t>Weight after (g) Mean ± SD</w:t>
+              <w:t>Weight after (g)</w:t>
+              <w:br/>
+            </w:r>
+            <w:r>
+              <w:rPr>
+                <w:rFonts w:ascii="Times New Roman" w:hAnsi="Times New Roman" w:eastAsia="Times New Roman"/>
+                <w:b/>
+                <w:i w:val="0"/>
+                <w:color w:val="000000"/>
+                <w:sz w:val="18"/>
+              </w:rPr>
+              <w:t>Mean ± SD</w:t>
             </w:r>
           </w:p>
         </w:tc>
@@ -4986,7 +5499,18 @@
                 <w:color w:val="000000"/>
                 <w:sz w:val="18"/>
               </w:rPr>
-              <w:t>Weight loss (%) Mean ± SD</w:t>
+              <w:t>Weight loss (%)</w:t>
+              <w:br/>
+            </w:r>
+            <w:r>
+              <w:rPr>
+                <w:rFonts w:ascii="Times New Roman" w:hAnsi="Times New Roman" w:eastAsia="Times New Roman"/>
+                <w:b/>
+                <w:i w:val="0"/>
+                <w:color w:val="000000"/>
+                <w:sz w:val="18"/>
+              </w:rPr>
+              <w:t>Mean ± SD</w:t>
             </w:r>
           </w:p>
         </w:tc>
@@ -5596,7 +6120,81 @@
           <w:color w:val="000000"/>
           <w:sz w:val="24"/>
         </w:rPr>
-        <w:t>A non-significant p-value does not make the three means equal. It says that, with twelve discs a group and with the variance that was observed, the test could not separate them. Most of that variance sits in one group.</w:t>
+        <w:t>A non-significant p-value does not make the three means equal. It says that, with twelve discs a group and with the variance that was observed, the test could not separate them. Most of that variance sits in one group. Figure 4.1 plots the same means and standard deviations as Table 4.1.</w:t>
+      </w:r>
+    </w:p>
+    <w:p>
+      <w:pPr>
+        <w:keepNext/>
+        <w:pageBreakBefore w:val="0"/>
+        <w:widowControl/>
+        <w:spacing w:before="240" w:after="120" w:line="240" w:lineRule="auto"/>
+        <w:ind w:firstLine="0"/>
+        <w:jc w:val="center"/>
+      </w:pPr>
+      <w:r>
+        <w:drawing>
+          <wp:inline xmlns:a="http://schemas.openxmlformats.org/drawingml/2006/main" xmlns:pic="http://schemas.openxmlformats.org/drawingml/2006/picture">
+            <wp:extent cx="5220000" cy="3634248"/>
+            <wp:docPr id="3" name="Picture 3"/>
+            <wp:cNvGraphicFramePr>
+              <a:graphicFrameLocks noChangeAspect="1"/>
+            </wp:cNvGraphicFramePr>
+            <a:graphic>
+              <a:graphicData uri="http://schemas.openxmlformats.org/drawingml/2006/picture">
+                <pic:pic>
+                  <pic:nvPicPr>
+                    <pic:cNvPr id="0" name="Figure_4.1_weight_loss.png"/>
+                    <pic:cNvPicPr/>
+                  </pic:nvPicPr>
+                  <pic:blipFill>
+                    <a:blip r:embed="rId29"/>
+                    <a:stretch>
+                      <a:fillRect/>
+                    </a:stretch>
+                  </pic:blipFill>
+                  <pic:spPr>
+                    <a:xfrm>
+                      <a:off x="0" y="0"/>
+                      <a:ext cx="5220000" cy="3634248"/>
+                    </a:xfrm>
+                    <a:prstGeom prst="rect"/>
+                  </pic:spPr>
+                </pic:pic>
+              </a:graphicData>
+            </a:graphic>
+          </wp:inline>
+        </w:drawing>
+      </w:r>
+    </w:p>
+    <w:p>
+      <w:pPr>
+        <w:keepNext w:val="0"/>
+        <w:pageBreakBefore w:val="0"/>
+        <w:widowControl/>
+        <w:spacing w:before="120" w:after="240" w:line="480" w:lineRule="auto"/>
+        <w:ind w:firstLine="0"/>
+        <w:jc w:val="left"/>
+      </w:pPr>
+      <w:r>
+        <w:rPr>
+          <w:rFonts w:ascii="Times New Roman" w:hAnsi="Times New Roman" w:eastAsia="Times New Roman"/>
+          <w:b/>
+          <w:i w:val="0"/>
+          <w:color w:val="000000"/>
+          <w:sz w:val="24"/>
+        </w:rPr>
+        <w:t>Figure 4.1</w:t>
+      </w:r>
+      <w:r>
+        <w:rPr>
+          <w:rFonts w:ascii="Times New Roman" w:hAnsi="Times New Roman" w:eastAsia="Times New Roman"/>
+          <w:b w:val="0"/>
+          <w:i w:val="0"/>
+          <w:color w:val="000000"/>
+          <w:sz w:val="24"/>
+        </w:rPr>
+        <w:t xml:space="preserve"> Mean percentage weight loss of the three composite resins after 10 000 toothbrushing cycles at 2 N. Error bars represent one standard deviation (n = 12 per group). In the Beautifil Flow Plus X F00 group the standard deviation exceeds the mean, so the lower error bar extends below zero; this reflects the dispersion introduced by a single specimen that lost about 11.4 % of its mass and does not imply a gain in weight. Differences among groups were not statistically significant (one-way ANOVA, p = 0.329).</w:t>
       </w:r>
     </w:p>
     <w:p>
@@ -5662,10 +6260,10 @@
     </w:p>
     <w:p>
       <w:pPr>
-        <w:keepNext/>
+        <w:keepNext w:val="0"/>
         <w:pageBreakBefore w:val="0"/>
         <w:widowControl/>
-        <w:spacing w:before="240" w:after="120" w:line="480" w:lineRule="auto"/>
+        <w:spacing w:before="120" w:after="240" w:line="480" w:lineRule="auto"/>
         <w:ind w:firstLine="0"/>
         <w:jc w:val="left"/>
       </w:pPr>
@@ -5694,15 +6292,15 @@
       <w:tblPr>
         <w:tblW w:type="auto" w:w="0"/>
         <w:jc w:val="center"/>
-        <w:tblLayout w:type="autofit"/>
+        <w:tblLayout w:type="fixed"/>
         <w:tblLook w:firstColumn="1" w:firstRow="1" w:lastColumn="0" w:lastRow="0" w:noHBand="0" w:noVBand="1" w:val="04A0"/>
       </w:tblPr>
       <w:tblGrid>
-        <w:gridCol w:w="1758"/>
-        <w:gridCol w:w="1758"/>
-        <w:gridCol w:w="1758"/>
-        <w:gridCol w:w="1758"/>
-        <w:gridCol w:w="1758"/>
+        <w:gridCol w:w="2988"/>
+        <w:gridCol w:w="1450"/>
+        <w:gridCol w:w="1450"/>
+        <w:gridCol w:w="1450"/>
+        <w:gridCol w:w="1450"/>
       </w:tblGrid>
       <w:tr>
         <w:tc>
@@ -5767,7 +6365,18 @@
                 <w:color w:val="000000"/>
                 <w:sz w:val="18"/>
               </w:rPr>
-              <w:t>Ra before (µm) Mean ± SD</w:t>
+              <w:t>Ra before (µm)</w:t>
+              <w:br/>
+            </w:r>
+            <w:r>
+              <w:rPr>
+                <w:rFonts w:ascii="Times New Roman" w:hAnsi="Times New Roman" w:eastAsia="Times New Roman"/>
+                <w:b/>
+                <w:i w:val="0"/>
+                <w:color w:val="000000"/>
+                <w:sz w:val="18"/>
+              </w:rPr>
+              <w:t>Mean ± SD</w:t>
             </w:r>
           </w:p>
         </w:tc>
@@ -5800,7 +6409,18 @@
                 <w:color w:val="000000"/>
                 <w:sz w:val="18"/>
               </w:rPr>
-              <w:t>Ra after (µm) Mean ± SD</w:t>
+              <w:t>Ra after (µm)</w:t>
+              <w:br/>
+            </w:r>
+            <w:r>
+              <w:rPr>
+                <w:rFonts w:ascii="Times New Roman" w:hAnsi="Times New Roman" w:eastAsia="Times New Roman"/>
+                <w:b/>
+                <w:i w:val="0"/>
+                <w:color w:val="000000"/>
+                <w:sz w:val="18"/>
+              </w:rPr>
+              <w:t>Mean ± SD</w:t>
             </w:r>
           </w:p>
         </w:tc>
@@ -5833,7 +6453,18 @@
                 <w:color w:val="000000"/>
                 <w:sz w:val="18"/>
               </w:rPr>
-              <w:t>ΔRa (µm) Mean ± SD</w:t>
+              <w:t>ΔRa (µm)</w:t>
+              <w:br/>
+            </w:r>
+            <w:r>
+              <w:rPr>
+                <w:rFonts w:ascii="Times New Roman" w:hAnsi="Times New Roman" w:eastAsia="Times New Roman"/>
+                <w:b/>
+                <w:i w:val="0"/>
+                <w:color w:val="000000"/>
+                <w:sz w:val="18"/>
+              </w:rPr>
+              <w:t>Mean ± SD</w:t>
             </w:r>
           </w:p>
         </w:tc>
@@ -6423,7 +7054,175 @@
           <w:color w:val="000000"/>
           <w:sz w:val="24"/>
         </w:rPr>
-        <w:t>Every group roughened. ΔRa was 0.066 ± 0.021 µm for Beautifil Flow Plus X F00, 0.046 ± 0.023 µm for G-ænial Universal Injectable and 0.075 ± 0.066 µm for Beautifil II LS. After 10 000 cycles the means were 0.104 ± 0.017 µm, 0.100 ± 0.023 µm and 0.194 ± 0.050 µm.</w:t>
+        <w:t>Every group roughened. ΔRa was 0.066 ± 0.021 µm for Beautifil Flow Plus X F00, 0.046 ± 0.023 µm for G-ænial Universal Injectable and 0.075 ± 0.066 µm for Beautifil II LS. After 10 000 cycles the means were 0.104 ± 0.017 µm, 0.100 ± 0.023 µm and 0.194 ± 0.050 µm. Figure 4.2 shows Ra before and after on the same discs. Figure 4.3 shows ΔRa.</w:t>
+      </w:r>
+    </w:p>
+    <w:p>
+      <w:pPr>
+        <w:keepNext/>
+        <w:pageBreakBefore w:val="0"/>
+        <w:widowControl/>
+        <w:spacing w:before="240" w:after="120" w:line="240" w:lineRule="auto"/>
+        <w:ind w:firstLine="0"/>
+        <w:jc w:val="center"/>
+      </w:pPr>
+      <w:r>
+        <w:drawing>
+          <wp:inline xmlns:a="http://schemas.openxmlformats.org/drawingml/2006/main" xmlns:pic="http://schemas.openxmlformats.org/drawingml/2006/picture">
+            <wp:extent cx="5220000" cy="3286761"/>
+            <wp:docPr id="4" name="Picture 4"/>
+            <wp:cNvGraphicFramePr>
+              <a:graphicFrameLocks noChangeAspect="1"/>
+            </wp:cNvGraphicFramePr>
+            <a:graphic>
+              <a:graphicData uri="http://schemas.openxmlformats.org/drawingml/2006/picture">
+                <pic:pic>
+                  <pic:nvPicPr>
+                    <pic:cNvPr id="0" name="Figure_4.2_surface_roughness.png"/>
+                    <pic:cNvPicPr/>
+                  </pic:nvPicPr>
+                  <pic:blipFill>
+                    <a:blip r:embed="rId30"/>
+                    <a:stretch>
+                      <a:fillRect/>
+                    </a:stretch>
+                  </pic:blipFill>
+                  <pic:spPr>
+                    <a:xfrm>
+                      <a:off x="0" y="0"/>
+                      <a:ext cx="5220000" cy="3286761"/>
+                    </a:xfrm>
+                    <a:prstGeom prst="rect"/>
+                  </pic:spPr>
+                </pic:pic>
+              </a:graphicData>
+            </a:graphic>
+          </wp:inline>
+        </w:drawing>
+      </w:r>
+    </w:p>
+    <w:p>
+      <w:pPr>
+        <w:keepNext w:val="0"/>
+        <w:pageBreakBefore w:val="0"/>
+        <w:widowControl/>
+        <w:spacing w:before="120" w:after="240" w:line="480" w:lineRule="auto"/>
+        <w:ind w:firstLine="0"/>
+        <w:jc w:val="left"/>
+      </w:pPr>
+      <w:r>
+        <w:rPr>
+          <w:rFonts w:ascii="Times New Roman" w:hAnsi="Times New Roman" w:eastAsia="Times New Roman"/>
+          <w:b/>
+          <w:i w:val="0"/>
+          <w:color w:val="000000"/>
+          <w:sz w:val="24"/>
+        </w:rPr>
+        <w:t>Figure 4.2</w:t>
+      </w:r>
+      <w:r>
+        <w:rPr>
+          <w:rFonts w:ascii="Times New Roman" w:hAnsi="Times New Roman" w:eastAsia="Times New Roman"/>
+          <w:b w:val="0"/>
+          <w:i w:val="0"/>
+          <w:color w:val="000000"/>
+          <w:sz w:val="24"/>
+        </w:rPr>
+        <w:t xml:space="preserve"> Mean surface roughness (Ra) of the three composite resins before and after 10 000 toothbrushing cycles at 2 N. Error bars represent one standard deviation (n = 12 per group). The broken line marks the 0.2 µm threshold above which plaque retention increases. Ra after brushing differed significantly among groups (Kruskal–Wallis, p &lt; 0.001).</w:t>
+      </w:r>
+    </w:p>
+    <w:p>
+      <w:pPr>
+        <w:keepNext/>
+        <w:pageBreakBefore w:val="0"/>
+        <w:widowControl/>
+        <w:spacing w:before="240" w:after="120" w:line="240" w:lineRule="auto"/>
+        <w:ind w:firstLine="0"/>
+        <w:jc w:val="center"/>
+      </w:pPr>
+      <w:r>
+        <w:drawing>
+          <wp:inline xmlns:a="http://schemas.openxmlformats.org/drawingml/2006/main" xmlns:pic="http://schemas.openxmlformats.org/drawingml/2006/picture">
+            <wp:extent cx="5220000" cy="3448176"/>
+            <wp:docPr id="5" name="Picture 5"/>
+            <wp:cNvGraphicFramePr>
+              <a:graphicFrameLocks noChangeAspect="1"/>
+            </wp:cNvGraphicFramePr>
+            <a:graphic>
+              <a:graphicData uri="http://schemas.openxmlformats.org/drawingml/2006/picture">
+                <pic:pic>
+                  <pic:nvPicPr>
+                    <pic:cNvPr id="0" name="Figure_4.3_delta_ra.png"/>
+                    <pic:cNvPicPr/>
+                  </pic:nvPicPr>
+                  <pic:blipFill>
+                    <a:blip r:embed="rId31"/>
+                    <a:stretch>
+                      <a:fillRect/>
+                    </a:stretch>
+                  </pic:blipFill>
+                  <pic:spPr>
+                    <a:xfrm>
+                      <a:off x="0" y="0"/>
+                      <a:ext cx="5220000" cy="3448176"/>
+                    </a:xfrm>
+                    <a:prstGeom prst="rect"/>
+                  </pic:spPr>
+                </pic:pic>
+              </a:graphicData>
+            </a:graphic>
+          </wp:inline>
+        </w:drawing>
+      </w:r>
+    </w:p>
+    <w:p>
+      <w:pPr>
+        <w:keepNext w:val="0"/>
+        <w:pageBreakBefore w:val="0"/>
+        <w:widowControl/>
+        <w:spacing w:before="120" w:after="240" w:line="480" w:lineRule="auto"/>
+        <w:ind w:firstLine="0"/>
+        <w:jc w:val="left"/>
+      </w:pPr>
+      <w:r>
+        <w:rPr>
+          <w:rFonts w:ascii="Times New Roman" w:hAnsi="Times New Roman" w:eastAsia="Times New Roman"/>
+          <w:b/>
+          <w:i w:val="0"/>
+          <w:color w:val="000000"/>
+          <w:sz w:val="24"/>
+        </w:rPr>
+        <w:t>Figure 4.3</w:t>
+      </w:r>
+      <w:r>
+        <w:rPr>
+          <w:rFonts w:ascii="Times New Roman" w:hAnsi="Times New Roman" w:eastAsia="Times New Roman"/>
+          <w:b w:val="0"/>
+          <w:i w:val="0"/>
+          <w:color w:val="000000"/>
+          <w:sz w:val="24"/>
+        </w:rPr>
+        <w:t xml:space="preserve"> Mean change in surface roughness (ΔRa = Ra after − Ra before) of the three composite resins after 10 000 toothbrushing cycles at 2 N. Error bars represent one standard deviation (n = 12 per group).</w:t>
+      </w:r>
+    </w:p>
+    <w:p>
+      <w:pPr>
+        <w:keepNext w:val="0"/>
+        <w:pageBreakBefore w:val="0"/>
+        <w:widowControl/>
+        <w:spacing w:before="0" w:after="0" w:line="480" w:lineRule="auto"/>
+        <w:ind w:firstLine="720"/>
+        <w:jc w:val="both"/>
+      </w:pPr>
+      <w:r>
+        <w:rPr>
+          <w:rFonts w:ascii="Times New Roman" w:hAnsi="Times New Roman" w:eastAsia="Times New Roman"/>
+          <w:b w:val="0"/>
+          <w:i w:val="0"/>
+          <w:color w:val="000000"/>
+          <w:sz w:val="24"/>
+        </w:rPr>
+        <w:t>From the same locked means, Ra rose by a factor of about 2.7 in Beautifil Flow Plus X F00 (0.038 µm to 0.104 µm), about 1.9 in G-ænial Universal Injectable (0.054 µm to 0.100 µm) and about 1.6 in Beautifil II LS (0.119 µm to 0.194 µm). The nanohybrid started higher, so its relative rise is smaller even though its absolute ΔRa is the largest.</w:t>
       </w:r>
     </w:p>
     <w:p>
@@ -6508,10 +7307,10 @@
     </w:p>
     <w:p>
       <w:pPr>
-        <w:keepNext/>
+        <w:keepNext w:val="0"/>
         <w:pageBreakBefore w:val="0"/>
         <w:widowControl/>
-        <w:spacing w:before="240" w:after="120" w:line="480" w:lineRule="auto"/>
+        <w:spacing w:before="120" w:after="240" w:line="480" w:lineRule="auto"/>
         <w:ind w:firstLine="0"/>
         <w:jc w:val="left"/>
       </w:pPr>
@@ -6540,13 +7339,13 @@
       <w:tblPr>
         <w:tblW w:type="auto" w:w="0"/>
         <w:jc w:val="center"/>
-        <w:tblLayout w:type="autofit"/>
+        <w:tblLayout w:type="fixed"/>
         <w:tblLook w:firstColumn="1" w:firstRow="1" w:lastColumn="0" w:lastRow="0" w:noHBand="0" w:noVBand="1" w:val="04A0"/>
       </w:tblPr>
       <w:tblGrid>
-        <w:gridCol w:w="2929"/>
-        <w:gridCol w:w="2929"/>
-        <w:gridCol w:w="2929"/>
+        <w:gridCol w:w="3515"/>
+        <w:gridCol w:w="2636"/>
+        <w:gridCol w:w="2636"/>
       </w:tblGrid>
       <w:tr>
         <w:tc>
@@ -6611,7 +7410,18 @@
                 <w:color w:val="000000"/>
                 <w:sz w:val="18"/>
               </w:rPr>
-              <w:t>Absolute weight loss (mg) Mean ± SD</w:t>
+              <w:t>Absolute weight loss (mg)</w:t>
+              <w:br/>
+            </w:r>
+            <w:r>
+              <w:rPr>
+                <w:rFonts w:ascii="Times New Roman" w:hAnsi="Times New Roman" w:eastAsia="Times New Roman"/>
+                <w:b/>
+                <w:i w:val="0"/>
+                <w:color w:val="000000"/>
+                <w:sz w:val="18"/>
+              </w:rPr>
+              <w:t>Mean ± SD</w:t>
             </w:r>
           </w:p>
         </w:tc>
@@ -7175,6 +7985,26 @@
           <w:color w:val="000000"/>
           <w:sz w:val="24"/>
         </w:rPr>
+        <w:t>Condon and Ferracane placed a wear step at 48 vol% in an oral-wear simulator (12). The protocol lists Beautifil Flow Plus X F00 at 47 vol% and G-ænial Universal Injectable at 50 vol%. Those two sit on either side of that step. Beautifil II LS sits well above it. The present mass result did not follow that step. The test is toothbrush slurry, not their simulator, and the filler chemistry is not their experimental series. The volume figures are still the right frame for why a 68 vol% paste was expected to lose less, and why that expectation was not confirmed on percentage loss.</w:t>
+      </w:r>
+    </w:p>
+    <w:p>
+      <w:pPr>
+        <w:keepNext w:val="0"/>
+        <w:pageBreakBefore w:val="0"/>
+        <w:widowControl/>
+        <w:spacing w:before="0" w:after="0" w:line="480" w:lineRule="auto"/>
+        <w:ind w:firstLine="720"/>
+        <w:jc w:val="both"/>
+      </w:pPr>
+      <w:r>
+        <w:rPr>
+          <w:rFonts w:ascii="Times New Roman" w:hAnsi="Times New Roman" w:eastAsia="Times New Roman"/>
+          <w:b w:val="0"/>
+          <w:i w:val="0"/>
+          <w:color w:val="000000"/>
+          <w:sz w:val="24"/>
+        </w:rPr>
         <w:t>The slurry was a single paste, Colgate Total, RDA 70, mixed 250 g to 1 L after ISO/TR 14569-1 (3,14). That is a moderate abrasive, not a high-RDA whitening paste. Monteiro and Spohr showed that a higher RDA cuts gloss faster and leaves a rougher track (8). A harsher dentifrice might have opened a gap in mass that this paste did not. The present ranking is for this slurry only.</w:t>
       </w:r>
     </w:p>
@@ -7296,7 +8126,27 @@
           <w:color w:val="000000"/>
           <w:sz w:val="24"/>
         </w:rPr>
-        <w:t>That pattern fits filler geometry. A nanofilled injectable with barium glass and silica at 50 vol% wears more evenly (6,18). A nanohybrid with larger S-PRG and glass particles loses matrix first. The large fillers stand up or leave pits (4,18). Hasan, Eltoukhy and Zaghloul saw the same order after simulated brushing: G-ænial Universal Injectable smoother than a nanohybrid; two nanofilled resins not different from each other (18). Heintze et al. had already shown that hybrid and microhybrid pastes roughen more with load and time than microfilled resins (4).</w:t>
+        <w:t>That pattern fits filler geometry. A nanofilled injectable with barium glass and silica at 50 vol% wears more evenly (6,18,28). A nanohybrid with larger S-PRG and glass particles loses matrix first. The large fillers stand up or leave pits (4,18,37). Cavalcante et al. showed the same size effect on model pastes after 20 000 strokes (28). Senawongse and Pongprueksa, and Suzuki and Finger’s group, saw a smoother nanofill than nanohybrid after brushing (35,37). Hasan, Eltoukhy and Zaghloul saw the same order with G-ænial Universal Injectable against a nanohybrid (18). Heintze et al. had already shown that hybrid and microhybrid pastes roughen more with load and time than microfilled resins (4).</w:t>
+      </w:r>
+    </w:p>
+    <w:p>
+      <w:pPr>
+        <w:keepNext w:val="0"/>
+        <w:pageBreakBefore w:val="0"/>
+        <w:widowControl/>
+        <w:spacing w:before="0" w:after="0" w:line="480" w:lineRule="auto"/>
+        <w:ind w:firstLine="720"/>
+        <w:jc w:val="both"/>
+      </w:pPr>
+      <w:r>
+        <w:rPr>
+          <w:rFonts w:ascii="Times New Roman" w:hAnsi="Times New Roman" w:eastAsia="Times New Roman"/>
+          <w:b w:val="0"/>
+          <w:i w:val="0"/>
+          <w:color w:val="000000"/>
+          <w:sz w:val="24"/>
+        </w:rPr>
+        <w:t>The slurry here was RDA 70. da Costa and Monteiro both showed that a harsher dentifrice raises Ra further on the same composite (8,29). The present ranking is for this paste.</w:t>
       </w:r>
     </w:p>
     <w:p>
@@ -7336,7 +8186,7 @@
           <w:color w:val="000000"/>
           <w:sz w:val="24"/>
         </w:rPr>
-        <w:t>Five traces a disc on the MarSurf PS10 is a standard contact-stylus habit. It is not a map of the whole face. A local pit can be missed. Optical methods would have given that map (4,16). They were not used.</w:t>
+        <w:t>Five traces a disc on the MarSurf PS10 is a standard contact-stylus habit after ISO 4287 (16). It is not a map of the whole face. A local pit can be missed. Optical methods, or AFM, would have given that map (23,31). They were not used. Kakaboura showed that rank order usually survives a change of method even when the micrometre values do not (31).</w:t>
       </w:r>
     </w:p>
     <w:p>
@@ -8277,7 +9127,7 @@
           <w:color w:val="000000"/>
           <w:sz w:val="24"/>
         </w:rPr>
-        <w:t>16. International Organization for Standardization. ISO 4049:2019. Dentistry — Polymer-based restorative materials. Geneva: ISO; 2019.</w:t>
+        <w:t>16. International Organization for Standardization. ISO 4287:1997. Geometrical Product Specifications (GPS) — Surface texture: Profile method — Terms, definitions and surface texture parameters. Geneva: ISO; 1997.</w:t>
       </w:r>
     </w:p>
     <w:p>
@@ -8398,6 +9248,306 @@
           <w:sz w:val="24"/>
         </w:rPr>
         <w:t>22. Gordan VV, Mondragon E, Watson RE, Garvan C, Mjör IA. A clinical evaluation of a self-etching primer and a giomer restorative material: results at eight years. J Am Dent Assoc. 2007;138(5):621-627.</w:t>
+      </w:r>
+    </w:p>
+    <w:p>
+      <w:pPr>
+        <w:keepNext w:val="0"/>
+        <w:pageBreakBefore w:val="0"/>
+        <w:widowControl/>
+        <w:spacing w:before="0" w:after="120" w:line="240" w:lineRule="auto"/>
+        <w:ind w:left="425" w:hanging="425"/>
+        <w:jc w:val="both"/>
+      </w:pPr>
+      <w:r>
+        <w:rPr>
+          <w:rFonts w:ascii="Times New Roman" w:hAnsi="Times New Roman" w:eastAsia="Times New Roman"/>
+          <w:b w:val="0"/>
+          <w:i w:val="0"/>
+          <w:color w:val="000000"/>
+          <w:sz w:val="24"/>
+        </w:rPr>
+        <w:t>23. International Organization for Standardization. ISO 25178-2:2012. Geometrical product specifications (GPS) — Surface texture: Areal — Part 2: Terms, definitions and surface texture parameters. Geneva: ISO; 2012.</w:t>
+      </w:r>
+    </w:p>
+    <w:p>
+      <w:pPr>
+        <w:keepNext w:val="0"/>
+        <w:pageBreakBefore w:val="0"/>
+        <w:widowControl/>
+        <w:spacing w:before="0" w:after="120" w:line="240" w:lineRule="auto"/>
+        <w:ind w:left="425" w:hanging="425"/>
+        <w:jc w:val="both"/>
+      </w:pPr>
+      <w:r>
+        <w:rPr>
+          <w:rFonts w:ascii="Times New Roman" w:hAnsi="Times New Roman" w:eastAsia="Times New Roman"/>
+          <w:b w:val="0"/>
+          <w:i w:val="0"/>
+          <w:color w:val="000000"/>
+          <w:sz w:val="24"/>
+        </w:rPr>
+        <w:t>24. International Organization for Standardization. ISO 4049:2019. Dentistry — Polymer-based restorative materials. Geneva: ISO; 2019.</w:t>
+      </w:r>
+    </w:p>
+    <w:p>
+      <w:pPr>
+        <w:keepNext w:val="0"/>
+        <w:pageBreakBefore w:val="0"/>
+        <w:widowControl/>
+        <w:spacing w:before="0" w:after="120" w:line="240" w:lineRule="auto"/>
+        <w:ind w:left="425" w:hanging="425"/>
+        <w:jc w:val="both"/>
+      </w:pPr>
+      <w:r>
+        <w:rPr>
+          <w:rFonts w:ascii="Times New Roman" w:hAnsi="Times New Roman" w:eastAsia="Times New Roman"/>
+          <w:b w:val="0"/>
+          <w:i w:val="0"/>
+          <w:color w:val="000000"/>
+          <w:sz w:val="24"/>
+        </w:rPr>
+        <w:t>25. Ferracane JL. Hygroscopic and hydrolytic effects in dental polymer networks. Dent Mater. 2006;22(3):211-222.</w:t>
+      </w:r>
+    </w:p>
+    <w:p>
+      <w:pPr>
+        <w:keepNext w:val="0"/>
+        <w:pageBreakBefore w:val="0"/>
+        <w:widowControl/>
+        <w:spacing w:before="0" w:after="120" w:line="240" w:lineRule="auto"/>
+        <w:ind w:left="425" w:hanging="425"/>
+        <w:jc w:val="both"/>
+      </w:pPr>
+      <w:r>
+        <w:rPr>
+          <w:rFonts w:ascii="Times New Roman" w:hAnsi="Times New Roman" w:eastAsia="Times New Roman"/>
+          <w:b w:val="0"/>
+          <w:i w:val="0"/>
+          <w:color w:val="000000"/>
+          <w:sz w:val="24"/>
+        </w:rPr>
+        <w:t>26. Ilie N, Hickel R. Investigations on mechanical behaviour of dental composites. Clin Oral Investig. 2009;13(4):427-438.</w:t>
+      </w:r>
+    </w:p>
+    <w:p>
+      <w:pPr>
+        <w:keepNext w:val="0"/>
+        <w:pageBreakBefore w:val="0"/>
+        <w:widowControl/>
+        <w:spacing w:before="0" w:after="120" w:line="240" w:lineRule="auto"/>
+        <w:ind w:left="425" w:hanging="425"/>
+        <w:jc w:val="both"/>
+      </w:pPr>
+      <w:r>
+        <w:rPr>
+          <w:rFonts w:ascii="Times New Roman" w:hAnsi="Times New Roman" w:eastAsia="Times New Roman"/>
+          <w:b w:val="0"/>
+          <w:i w:val="0"/>
+          <w:color w:val="000000"/>
+          <w:sz w:val="24"/>
+        </w:rPr>
+        <w:t>27. Ilie N, Hickel R. Resin composite restorative materials. Aust Dent J. 2011;56 Suppl 1:59-66.</w:t>
+      </w:r>
+    </w:p>
+    <w:p>
+      <w:pPr>
+        <w:keepNext w:val="0"/>
+        <w:pageBreakBefore w:val="0"/>
+        <w:widowControl/>
+        <w:spacing w:before="0" w:after="120" w:line="240" w:lineRule="auto"/>
+        <w:ind w:left="425" w:hanging="425"/>
+        <w:jc w:val="both"/>
+      </w:pPr>
+      <w:r>
+        <w:rPr>
+          <w:rFonts w:ascii="Times New Roman" w:hAnsi="Times New Roman" w:eastAsia="Times New Roman"/>
+          <w:b w:val="0"/>
+          <w:i w:val="0"/>
+          <w:color w:val="000000"/>
+          <w:sz w:val="24"/>
+        </w:rPr>
+        <w:t>28. Cavalcante LM, Masouras K, Watts DC, Pimenta LA, Silikas N. Effect of nanofillers’ size on surface properties after toothbrush abrasion. Am J Dent. 2009;22(1):60-64.</w:t>
+      </w:r>
+    </w:p>
+    <w:p>
+      <w:pPr>
+        <w:keepNext w:val="0"/>
+        <w:pageBreakBefore w:val="0"/>
+        <w:widowControl/>
+        <w:spacing w:before="0" w:after="120" w:line="240" w:lineRule="auto"/>
+        <w:ind w:left="425" w:hanging="425"/>
+        <w:jc w:val="both"/>
+      </w:pPr>
+      <w:r>
+        <w:rPr>
+          <w:rFonts w:ascii="Times New Roman" w:hAnsi="Times New Roman" w:eastAsia="Times New Roman"/>
+          <w:b w:val="0"/>
+          <w:i w:val="0"/>
+          <w:color w:val="000000"/>
+          <w:sz w:val="24"/>
+        </w:rPr>
+        <w:t>29. da Costa J, Adams-Belusko A, Riley K, Ferracane JL. The effect of various dentifrices on surface roughness and gloss of resin composites. J Dent. 2010;38 Suppl 2:e123-e128.</w:t>
+      </w:r>
+    </w:p>
+    <w:p>
+      <w:pPr>
+        <w:keepNext w:val="0"/>
+        <w:pageBreakBefore w:val="0"/>
+        <w:widowControl/>
+        <w:spacing w:before="0" w:after="120" w:line="240" w:lineRule="auto"/>
+        <w:ind w:left="425" w:hanging="425"/>
+        <w:jc w:val="both"/>
+      </w:pPr>
+      <w:r>
+        <w:rPr>
+          <w:rFonts w:ascii="Times New Roman" w:hAnsi="Times New Roman" w:eastAsia="Times New Roman"/>
+          <w:b w:val="0"/>
+          <w:i w:val="0"/>
+          <w:color w:val="000000"/>
+          <w:sz w:val="24"/>
+        </w:rPr>
+        <w:t>30. Turssi CP, De Magalhães CS, Serra MC, Rodrigues AL Jr. Surface roughness assessment of resin-based materials during brushing. J Oral Rehabil. 2001;28(7):685-691.</w:t>
+      </w:r>
+    </w:p>
+    <w:p>
+      <w:pPr>
+        <w:keepNext w:val="0"/>
+        <w:pageBreakBefore w:val="0"/>
+        <w:widowControl/>
+        <w:spacing w:before="0" w:after="120" w:line="240" w:lineRule="auto"/>
+        <w:ind w:left="425" w:hanging="425"/>
+        <w:jc w:val="both"/>
+      </w:pPr>
+      <w:r>
+        <w:rPr>
+          <w:rFonts w:ascii="Times New Roman" w:hAnsi="Times New Roman" w:eastAsia="Times New Roman"/>
+          <w:b w:val="0"/>
+          <w:i w:val="0"/>
+          <w:color w:val="000000"/>
+          <w:sz w:val="24"/>
+        </w:rPr>
+        <w:t>31. Kakaboura A, Fragouli M, Rahiotis C, Silikas N. Evaluation of surface characteristics of dental composites using profilometry, scanning electron, atomic force microscopy and gloss-meter. J Mater Sci Mater Med. 2007;18(1):155-163.</w:t>
+      </w:r>
+    </w:p>
+    <w:p>
+      <w:pPr>
+        <w:keepNext w:val="0"/>
+        <w:pageBreakBefore w:val="0"/>
+        <w:widowControl/>
+        <w:spacing w:before="0" w:after="120" w:line="240" w:lineRule="auto"/>
+        <w:ind w:left="425" w:hanging="425"/>
+        <w:jc w:val="both"/>
+      </w:pPr>
+      <w:r>
+        <w:rPr>
+          <w:rFonts w:ascii="Times New Roman" w:hAnsi="Times New Roman" w:eastAsia="Times New Roman"/>
+          <w:b w:val="0"/>
+          <w:i w:val="0"/>
+          <w:color w:val="000000"/>
+          <w:sz w:val="24"/>
+        </w:rPr>
+        <w:t>32. Moraes RR, Ribeiro Ddos S, Klumb MM, Brandt WC, Correr-Sobrinho L, Bueno M. In vitro toothbrushing abrasion of dental resin composites: packable, microhybrid, nanohybrid and microfilled materials. Braz Oral Res. 2008;22(2):112-118.</w:t>
+      </w:r>
+    </w:p>
+    <w:p>
+      <w:pPr>
+        <w:keepNext w:val="0"/>
+        <w:pageBreakBefore w:val="0"/>
+        <w:widowControl/>
+        <w:spacing w:before="0" w:after="120" w:line="240" w:lineRule="auto"/>
+        <w:ind w:left="425" w:hanging="425"/>
+        <w:jc w:val="both"/>
+      </w:pPr>
+      <w:r>
+        <w:rPr>
+          <w:rFonts w:ascii="Times New Roman" w:hAnsi="Times New Roman" w:eastAsia="Times New Roman"/>
+          <w:b w:val="0"/>
+          <w:i w:val="0"/>
+          <w:color w:val="000000"/>
+          <w:sz w:val="24"/>
+        </w:rPr>
+        <w:t>33. Söderholm KJ, Zigan M, Ragan M, Fischlschweiger W, Bergman M. Hydrolytic degradation of dental composites. J Dent Res. 1984;63(10):1248-1254.</w:t>
+      </w:r>
+    </w:p>
+    <w:p>
+      <w:pPr>
+        <w:keepNext w:val="0"/>
+        <w:pageBreakBefore w:val="0"/>
+        <w:widowControl/>
+        <w:spacing w:before="0" w:after="120" w:line="240" w:lineRule="auto"/>
+        <w:ind w:left="425" w:hanging="425"/>
+        <w:jc w:val="both"/>
+      </w:pPr>
+      <w:r>
+        <w:rPr>
+          <w:rFonts w:ascii="Times New Roman" w:hAnsi="Times New Roman" w:eastAsia="Times New Roman"/>
+          <w:b w:val="0"/>
+          <w:i w:val="0"/>
+          <w:color w:val="000000"/>
+          <w:sz w:val="24"/>
+        </w:rPr>
+        <w:t>34. Heintze SD. How to qualify and validate wear simulation devices and methods. Dent Mater. 2006;22(8):712-734.</w:t>
+      </w:r>
+    </w:p>
+    <w:p>
+      <w:pPr>
+        <w:keepNext w:val="0"/>
+        <w:pageBreakBefore w:val="0"/>
+        <w:widowControl/>
+        <w:spacing w:before="0" w:after="120" w:line="240" w:lineRule="auto"/>
+        <w:ind w:left="425" w:hanging="425"/>
+        <w:jc w:val="both"/>
+      </w:pPr>
+      <w:r>
+        <w:rPr>
+          <w:rFonts w:ascii="Times New Roman" w:hAnsi="Times New Roman" w:eastAsia="Times New Roman"/>
+          <w:b w:val="0"/>
+          <w:i w:val="0"/>
+          <w:color w:val="000000"/>
+          <w:sz w:val="24"/>
+        </w:rPr>
+        <w:t>35. Senawongse P, Pongprueksa P. Surface roughness of nanofill and nanohybrid resin composites after polishing and brushing. J Esthet Restor Dent. 2007;19(5):265-273.</w:t>
+      </w:r>
+    </w:p>
+    <w:p>
+      <w:pPr>
+        <w:keepNext w:val="0"/>
+        <w:pageBreakBefore w:val="0"/>
+        <w:widowControl/>
+        <w:spacing w:before="0" w:after="120" w:line="240" w:lineRule="auto"/>
+        <w:ind w:left="425" w:hanging="425"/>
+        <w:jc w:val="both"/>
+      </w:pPr>
+      <w:r>
+        <w:rPr>
+          <w:rFonts w:ascii="Times New Roman" w:hAnsi="Times New Roman" w:eastAsia="Times New Roman"/>
+          <w:b w:val="0"/>
+          <w:i w:val="0"/>
+          <w:color w:val="000000"/>
+          <w:sz w:val="24"/>
+        </w:rPr>
+        <w:t>36. de Oliveira GU, Mondelli RFL, Rodrigues MC, Franco EB, Ishikiriama SK, Wang L. Impact of filler size and distribution on roughness and wear of composite resin after simulated toothbrushing. J Appl Oral Sci. 2012;20(5):510-516.</w:t>
+      </w:r>
+    </w:p>
+    <w:p>
+      <w:pPr>
+        <w:keepNext w:val="0"/>
+        <w:pageBreakBefore w:val="0"/>
+        <w:widowControl/>
+        <w:spacing w:before="0" w:after="120" w:line="240" w:lineRule="auto"/>
+        <w:ind w:left="425" w:hanging="425"/>
+        <w:jc w:val="both"/>
+      </w:pPr>
+      <w:r>
+        <w:rPr>
+          <w:rFonts w:ascii="Times New Roman" w:hAnsi="Times New Roman" w:eastAsia="Times New Roman"/>
+          <w:b w:val="0"/>
+          <w:i w:val="0"/>
+          <w:color w:val="000000"/>
+          <w:sz w:val="24"/>
+        </w:rPr>
+        <w:t>37. Suzuki T, Kyoizumi H, Finger WJ, Kanehira M, Endo T, Utterodt A, Hisamitsu H, Komatsu M. Resistance of nanofill and nanohybrid resin composites to toothbrush abrasion with calcium carbonate slurry. Dent Mater J. 2009;28(6):708-716.</w:t>
       </w:r>
     </w:p>
     <w:p>
@@ -8491,11 +9641,15 @@
       </w:r>
     </w:p>
     <w:sectPr>
-      <w:footerReference w:type="default" r:id="rId13"/>
+      <w:headerReference w:type="default" r:id="rId23"/>
+      <w:headerReference w:type="first" r:id="rId24"/>
+      <w:headerReference w:type="even" r:id="rId25"/>
+      <w:footerReference w:type="default" r:id="rId26"/>
+      <w:footerReference w:type="first" r:id="rId27"/>
+      <w:footerReference w:type="even" r:id="rId28"/>
       <w:pgSz w:w="11906" w:h="16838"/>
-      <w:pgMar w:top="1417" w:right="1417" w:bottom="1417" w:left="1701" w:header="0" w:footer="0" w:gutter="0"/>
+      <w:pgMar w:top="2098" w:right="1417" w:bottom="1417" w:left="1701" w:header="227" w:footer="680" w:gutter="0"/>
       <w:cols w:space="720"/>
-      <w:titlePg/>
       <w:docGrid w:linePitch="360"/>
       <w:pgNumType w:fmt="decimal" w:start="1"/>
     </w:sectPr>
@@ -8518,30 +9672,22 @@
   <w:p>
     <w:pPr>
       <w:pStyle w:val="Footer"/>
-      <w:keepNext w:val="0"/>
-      <w:pageBreakBefore w:val="0"/>
-      <w:widowControl/>
-      <w:spacing w:before="0" w:after="0" w:line="240" w:lineRule="auto"/>
-      <w:ind w:firstLine="0"/>
-      <w:jc w:val="center"/>
     </w:pPr>
-    <w:r>
-      <w:rPr>
-        <w:rFonts w:ascii="Times New Roman" w:hAnsi="Times New Roman" w:eastAsia="Times New Roman"/>
-        <w:b w:val="0"/>
-        <w:i w:val="0"/>
-        <w:color w:val="000000"/>
-        <w:sz w:val="24"/>
-      </w:rPr>
-      <w:fldChar w:fldCharType="begin"/>
-      <w:instrText xml:space="preserve"> PAGE \* roman </w:instrText>
-      <w:fldChar w:fldCharType="end"/>
-    </w:r>
   </w:p>
 </w:ftr>
 </file>
 
 <file path=word/footer3.xml><?xml version="1.0" encoding="utf-8"?>
+<w:ftr xmlns:m="http://schemas.openxmlformats.org/officeDocument/2006/math" xmlns:mc="http://schemas.openxmlformats.org/markup-compatibility/2006" xmlns:mo="http://schemas.microsoft.com/office/mac/office/2008/main" xmlns:mv="urn:schemas-microsoft-com:mac:vml" xmlns:o="urn:schemas-microsoft-com:office:office" xmlns:r="http://schemas.openxmlformats.org/officeDocument/2006/relationships" xmlns:v="urn:schemas-microsoft-com:vml" xmlns:w10="urn:schemas-microsoft-com:office:word" xmlns:w14="http://schemas.microsoft.com/office/word/2010/wordml" xmlns:w="http://schemas.openxmlformats.org/wordprocessingml/2006/main" xmlns:wne="http://schemas.microsoft.com/office/word/2006/wordml" xmlns:wp14="http://schemas.microsoft.com/office/word/2010/wordprocessingDrawing" xmlns:wp="http://schemas.openxmlformats.org/drawingml/2006/wordprocessingDrawing" xmlns:wpc="http://schemas.microsoft.com/office/word/2010/wordprocessingCanvas" xmlns:wpg="http://schemas.microsoft.com/office/word/2010/wordprocessingGroup" xmlns:wpi="http://schemas.microsoft.com/office/word/2010/wordprocessingInk" xmlns:wps="http://schemas.microsoft.com/office/word/2010/wordprocessingShape" mc:Ignorable="w14 wp14">
+  <w:p>
+    <w:pPr>
+      <w:pStyle w:val="Footer"/>
+    </w:pPr>
+  </w:p>
+</w:ftr>
+</file>
+
+<file path=word/footer4.xml><?xml version="1.0" encoding="utf-8"?>
 <w:ftr xmlns:m="http://schemas.openxmlformats.org/officeDocument/2006/math" xmlns:mc="http://schemas.openxmlformats.org/markup-compatibility/2006" xmlns:mo="http://schemas.microsoft.com/office/mac/office/2008/main" xmlns:mv="urn:schemas-microsoft-com:mac:vml" xmlns:o="urn:schemas-microsoft-com:office:office" xmlns:r="http://schemas.openxmlformats.org/officeDocument/2006/relationships" xmlns:v="urn:schemas-microsoft-com:vml" xmlns:w10="urn:schemas-microsoft-com:office:word" xmlns:w14="http://schemas.microsoft.com/office/word/2010/wordml" xmlns:w="http://schemas.openxmlformats.org/wordprocessingml/2006/main" xmlns:wne="http://schemas.microsoft.com/office/word/2006/wordml" xmlns:wp14="http://schemas.microsoft.com/office/word/2010/wordprocessingDrawing" xmlns:wp="http://schemas.openxmlformats.org/drawingml/2006/wordprocessingDrawing" xmlns:wpc="http://schemas.microsoft.com/office/word/2010/wordprocessingCanvas" xmlns:wpg="http://schemas.microsoft.com/office/word/2010/wordprocessingGroup" xmlns:wpi="http://schemas.microsoft.com/office/word/2010/wordprocessingInk" xmlns:wps="http://schemas.microsoft.com/office/word/2010/wordprocessingShape" mc:Ignorable="w14 wp14">
   <w:p>
     <w:pPr>
@@ -8562,11 +9708,619 @@
         <w:sz w:val="24"/>
       </w:rPr>
       <w:fldChar w:fldCharType="begin"/>
+      <w:instrText xml:space="preserve"> PAGE \* roman </w:instrText>
+      <w:fldChar w:fldCharType="end"/>
+    </w:r>
+  </w:p>
+</w:ftr>
+</file>
+
+<file path=word/footer5.xml><?xml version="1.0" encoding="utf-8"?>
+<w:ftr xmlns:m="http://schemas.openxmlformats.org/officeDocument/2006/math" xmlns:mc="http://schemas.openxmlformats.org/markup-compatibility/2006" xmlns:mo="http://schemas.microsoft.com/office/mac/office/2008/main" xmlns:mv="urn:schemas-microsoft-com:mac:vml" xmlns:o="urn:schemas-microsoft-com:office:office" xmlns:r="http://schemas.openxmlformats.org/officeDocument/2006/relationships" xmlns:v="urn:schemas-microsoft-com:vml" xmlns:w10="urn:schemas-microsoft-com:office:word" xmlns:w14="http://schemas.microsoft.com/office/word/2010/wordml" xmlns:w="http://schemas.openxmlformats.org/wordprocessingml/2006/main" xmlns:wne="http://schemas.microsoft.com/office/word/2006/wordml" xmlns:wp14="http://schemas.microsoft.com/office/word/2010/wordprocessingDrawing" xmlns:wp="http://schemas.openxmlformats.org/drawingml/2006/wordprocessingDrawing" xmlns:wpc="http://schemas.microsoft.com/office/word/2010/wordprocessingCanvas" xmlns:wpg="http://schemas.microsoft.com/office/word/2010/wordprocessingGroup" xmlns:wpi="http://schemas.microsoft.com/office/word/2010/wordprocessingInk" xmlns:wps="http://schemas.microsoft.com/office/word/2010/wordprocessingShape" mc:Ignorable="w14 wp14">
+  <w:p>
+    <w:pPr>
+      <w:pStyle w:val="Footer"/>
+      <w:keepNext w:val="0"/>
+      <w:pageBreakBefore w:val="0"/>
+      <w:widowControl/>
+      <w:spacing w:before="0" w:after="0" w:line="240" w:lineRule="auto"/>
+      <w:ind w:firstLine="0"/>
+      <w:jc w:val="center"/>
+    </w:pPr>
+    <w:r>
+      <w:rPr>
+        <w:rFonts w:ascii="Times New Roman" w:hAnsi="Times New Roman" w:eastAsia="Times New Roman"/>
+        <w:b w:val="0"/>
+        <w:i w:val="0"/>
+        <w:color w:val="000000"/>
+        <w:sz w:val="24"/>
+      </w:rPr>
+      <w:fldChar w:fldCharType="begin"/>
+      <w:instrText xml:space="preserve"> PAGE \* roman </w:instrText>
+      <w:fldChar w:fldCharType="end"/>
+    </w:r>
+  </w:p>
+</w:ftr>
+</file>
+
+<file path=word/footer6.xml><?xml version="1.0" encoding="utf-8"?>
+<w:ftr xmlns:m="http://schemas.openxmlformats.org/officeDocument/2006/math" xmlns:mc="http://schemas.openxmlformats.org/markup-compatibility/2006" xmlns:mo="http://schemas.microsoft.com/office/mac/office/2008/main" xmlns:mv="urn:schemas-microsoft-com:mac:vml" xmlns:o="urn:schemas-microsoft-com:office:office" xmlns:r="http://schemas.openxmlformats.org/officeDocument/2006/relationships" xmlns:v="urn:schemas-microsoft-com:vml" xmlns:w10="urn:schemas-microsoft-com:office:word" xmlns:w14="http://schemas.microsoft.com/office/word/2010/wordml" xmlns:w="http://schemas.openxmlformats.org/wordprocessingml/2006/main" xmlns:wne="http://schemas.microsoft.com/office/word/2006/wordml" xmlns:wp14="http://schemas.microsoft.com/office/word/2010/wordprocessingDrawing" xmlns:wp="http://schemas.openxmlformats.org/drawingml/2006/wordprocessingDrawing" xmlns:wpc="http://schemas.microsoft.com/office/word/2010/wordprocessingCanvas" xmlns:wpg="http://schemas.microsoft.com/office/word/2010/wordprocessingGroup" xmlns:wpi="http://schemas.microsoft.com/office/word/2010/wordprocessingInk" xmlns:wps="http://schemas.microsoft.com/office/word/2010/wordprocessingShape" mc:Ignorable="w14 wp14">
+  <w:p>
+    <w:pPr>
+      <w:pStyle w:val="Footer"/>
+      <w:keepNext w:val="0"/>
+      <w:pageBreakBefore w:val="0"/>
+      <w:widowControl/>
+      <w:spacing w:before="0" w:after="0" w:line="240" w:lineRule="auto"/>
+      <w:ind w:firstLine="0"/>
+      <w:jc w:val="center"/>
+    </w:pPr>
+    <w:r>
+      <w:rPr>
+        <w:rFonts w:ascii="Times New Roman" w:hAnsi="Times New Roman" w:eastAsia="Times New Roman"/>
+        <w:b w:val="0"/>
+        <w:i w:val="0"/>
+        <w:color w:val="000000"/>
+        <w:sz w:val="24"/>
+      </w:rPr>
+      <w:fldChar w:fldCharType="begin"/>
+      <w:instrText xml:space="preserve"> PAGE \* roman </w:instrText>
+      <w:fldChar w:fldCharType="end"/>
+    </w:r>
+  </w:p>
+</w:ftr>
+</file>
+
+<file path=word/footer7.xml><?xml version="1.0" encoding="utf-8"?>
+<w:ftr xmlns:m="http://schemas.openxmlformats.org/officeDocument/2006/math" xmlns:mc="http://schemas.openxmlformats.org/markup-compatibility/2006" xmlns:mo="http://schemas.microsoft.com/office/mac/office/2008/main" xmlns:mv="urn:schemas-microsoft-com:mac:vml" xmlns:o="urn:schemas-microsoft-com:office:office" xmlns:r="http://schemas.openxmlformats.org/officeDocument/2006/relationships" xmlns:v="urn:schemas-microsoft-com:vml" xmlns:w10="urn:schemas-microsoft-com:office:word" xmlns:w14="http://schemas.microsoft.com/office/word/2010/wordml" xmlns:w="http://schemas.openxmlformats.org/wordprocessingml/2006/main" xmlns:wne="http://schemas.microsoft.com/office/word/2006/wordml" xmlns:wp14="http://schemas.microsoft.com/office/word/2010/wordprocessingDrawing" xmlns:wp="http://schemas.openxmlformats.org/drawingml/2006/wordprocessingDrawing" xmlns:wpc="http://schemas.microsoft.com/office/word/2010/wordprocessingCanvas" xmlns:wpg="http://schemas.microsoft.com/office/word/2010/wordprocessingGroup" xmlns:wpi="http://schemas.microsoft.com/office/word/2010/wordprocessingInk" xmlns:wps="http://schemas.microsoft.com/office/word/2010/wordprocessingShape" mc:Ignorable="w14 wp14">
+  <w:p>
+    <w:pPr>
+      <w:pStyle w:val="Footer"/>
+      <w:keepNext w:val="0"/>
+      <w:pageBreakBefore w:val="0"/>
+      <w:widowControl/>
+      <w:spacing w:before="0" w:after="0" w:line="240" w:lineRule="auto"/>
+      <w:ind w:firstLine="0"/>
+      <w:jc w:val="center"/>
+    </w:pPr>
+    <w:r>
+      <w:rPr>
+        <w:rFonts w:ascii="Times New Roman" w:hAnsi="Times New Roman" w:eastAsia="Times New Roman"/>
+        <w:b w:val="0"/>
+        <w:i w:val="0"/>
+        <w:color w:val="000000"/>
+        <w:sz w:val="24"/>
+      </w:rPr>
+      <w:fldChar w:fldCharType="begin"/>
       <w:instrText xml:space="preserve"> PAGE \* decimal </w:instrText>
       <w:fldChar w:fldCharType="end"/>
     </w:r>
   </w:p>
 </w:ftr>
+</file>
+
+<file path=word/footer8.xml><?xml version="1.0" encoding="utf-8"?>
+<w:ftr xmlns:m="http://schemas.openxmlformats.org/officeDocument/2006/math" xmlns:mc="http://schemas.openxmlformats.org/markup-compatibility/2006" xmlns:mo="http://schemas.microsoft.com/office/mac/office/2008/main" xmlns:mv="urn:schemas-microsoft-com:mac:vml" xmlns:o="urn:schemas-microsoft-com:office:office" xmlns:r="http://schemas.openxmlformats.org/officeDocument/2006/relationships" xmlns:v="urn:schemas-microsoft-com:vml" xmlns:w10="urn:schemas-microsoft-com:office:word" xmlns:w14="http://schemas.microsoft.com/office/word/2010/wordml" xmlns:w="http://schemas.openxmlformats.org/wordprocessingml/2006/main" xmlns:wne="http://schemas.microsoft.com/office/word/2006/wordml" xmlns:wp14="http://schemas.microsoft.com/office/word/2010/wordprocessingDrawing" xmlns:wp="http://schemas.openxmlformats.org/drawingml/2006/wordprocessingDrawing" xmlns:wpc="http://schemas.microsoft.com/office/word/2010/wordprocessingCanvas" xmlns:wpg="http://schemas.microsoft.com/office/word/2010/wordprocessingGroup" xmlns:wpi="http://schemas.microsoft.com/office/word/2010/wordprocessingInk" xmlns:wps="http://schemas.microsoft.com/office/word/2010/wordprocessingShape" mc:Ignorable="w14 wp14">
+  <w:p>
+    <w:pPr>
+      <w:pStyle w:val="Footer"/>
+      <w:keepNext w:val="0"/>
+      <w:pageBreakBefore w:val="0"/>
+      <w:widowControl/>
+      <w:spacing w:before="0" w:after="0" w:line="240" w:lineRule="auto"/>
+      <w:ind w:firstLine="0"/>
+      <w:jc w:val="center"/>
+    </w:pPr>
+    <w:r>
+      <w:rPr>
+        <w:rFonts w:ascii="Times New Roman" w:hAnsi="Times New Roman" w:eastAsia="Times New Roman"/>
+        <w:b w:val="0"/>
+        <w:i w:val="0"/>
+        <w:color w:val="000000"/>
+        <w:sz w:val="24"/>
+      </w:rPr>
+      <w:fldChar w:fldCharType="begin"/>
+      <w:instrText xml:space="preserve"> PAGE \* decimal </w:instrText>
+      <w:fldChar w:fldCharType="end"/>
+    </w:r>
+  </w:p>
+</w:ftr>
+</file>
+
+<file path=word/footer9.xml><?xml version="1.0" encoding="utf-8"?>
+<w:ftr xmlns:m="http://schemas.openxmlformats.org/officeDocument/2006/math" xmlns:mc="http://schemas.openxmlformats.org/markup-compatibility/2006" xmlns:mo="http://schemas.microsoft.com/office/mac/office/2008/main" xmlns:mv="urn:schemas-microsoft-com:mac:vml" xmlns:o="urn:schemas-microsoft-com:office:office" xmlns:r="http://schemas.openxmlformats.org/officeDocument/2006/relationships" xmlns:v="urn:schemas-microsoft-com:vml" xmlns:w10="urn:schemas-microsoft-com:office:word" xmlns:w14="http://schemas.microsoft.com/office/word/2010/wordml" xmlns:w="http://schemas.openxmlformats.org/wordprocessingml/2006/main" xmlns:wne="http://schemas.microsoft.com/office/word/2006/wordml" xmlns:wp14="http://schemas.microsoft.com/office/word/2010/wordprocessingDrawing" xmlns:wp="http://schemas.openxmlformats.org/drawingml/2006/wordprocessingDrawing" xmlns:wpc="http://schemas.microsoft.com/office/word/2010/wordprocessingCanvas" xmlns:wpg="http://schemas.microsoft.com/office/word/2010/wordprocessingGroup" xmlns:wpi="http://schemas.microsoft.com/office/word/2010/wordprocessingInk" xmlns:wps="http://schemas.microsoft.com/office/word/2010/wordprocessingShape" mc:Ignorable="w14 wp14">
+  <w:p>
+    <w:pPr>
+      <w:pStyle w:val="Footer"/>
+      <w:keepNext w:val="0"/>
+      <w:pageBreakBefore w:val="0"/>
+      <w:widowControl/>
+      <w:spacing w:before="0" w:after="0" w:line="240" w:lineRule="auto"/>
+      <w:ind w:firstLine="0"/>
+      <w:jc w:val="center"/>
+    </w:pPr>
+    <w:r>
+      <w:rPr>
+        <w:rFonts w:ascii="Times New Roman" w:hAnsi="Times New Roman" w:eastAsia="Times New Roman"/>
+        <w:b w:val="0"/>
+        <w:i w:val="0"/>
+        <w:color w:val="000000"/>
+        <w:sz w:val="24"/>
+      </w:rPr>
+      <w:fldChar w:fldCharType="begin"/>
+      <w:instrText xml:space="preserve"> PAGE \* decimal </w:instrText>
+      <w:fldChar w:fldCharType="end"/>
+    </w:r>
+  </w:p>
+</w:ftr>
+</file>
+
+<file path=word/header1.xml><?xml version="1.0" encoding="utf-8"?>
+<w:hdr xmlns:m="http://schemas.openxmlformats.org/officeDocument/2006/math" xmlns:mc="http://schemas.openxmlformats.org/markup-compatibility/2006" xmlns:mo="http://schemas.microsoft.com/office/mac/office/2008/main" xmlns:mv="urn:schemas-microsoft-com:mac:vml" xmlns:o="urn:schemas-microsoft-com:office:office" xmlns:r="http://schemas.openxmlformats.org/officeDocument/2006/relationships" xmlns:v="urn:schemas-microsoft-com:vml" xmlns:w10="urn:schemas-microsoft-com:office:word" xmlns:w14="http://schemas.microsoft.com/office/word/2010/wordml" xmlns:w="http://schemas.openxmlformats.org/wordprocessingml/2006/main" xmlns:wne="http://schemas.microsoft.com/office/word/2006/wordml" xmlns:wp14="http://schemas.microsoft.com/office/word/2010/wordprocessingDrawing" xmlns:wp="http://schemas.openxmlformats.org/drawingml/2006/wordprocessingDrawing" xmlns:wpc="http://schemas.microsoft.com/office/word/2010/wordprocessingCanvas" xmlns:wpg="http://schemas.microsoft.com/office/word/2010/wordprocessingGroup" xmlns:wpi="http://schemas.microsoft.com/office/word/2010/wordprocessingInk" xmlns:wps="http://schemas.microsoft.com/office/word/2010/wordprocessingShape" mc:Ignorable="w14 wp14">
+  <w:p>
+    <w:pPr>
+      <w:pStyle w:val="Header"/>
+    </w:pPr>
+  </w:p>
+</w:hdr>
+</file>
+
+<file path=word/header2.xml><?xml version="1.0" encoding="utf-8"?>
+<w:hdr xmlns:m="http://schemas.openxmlformats.org/officeDocument/2006/math" xmlns:mc="http://schemas.openxmlformats.org/markup-compatibility/2006" xmlns:mo="http://schemas.microsoft.com/office/mac/office/2008/main" xmlns:mv="urn:schemas-microsoft-com:mac:vml" xmlns:o="urn:schemas-microsoft-com:office:office" xmlns:r="http://schemas.openxmlformats.org/officeDocument/2006/relationships" xmlns:v="urn:schemas-microsoft-com:vml" xmlns:w10="urn:schemas-microsoft-com:office:word" xmlns:w14="http://schemas.microsoft.com/office/word/2010/wordml" xmlns:w="http://schemas.openxmlformats.org/wordprocessingml/2006/main" xmlns:wne="http://schemas.microsoft.com/office/word/2006/wordml" xmlns:wp14="http://schemas.microsoft.com/office/word/2010/wordprocessingDrawing" xmlns:wp="http://schemas.openxmlformats.org/drawingml/2006/wordprocessingDrawing" xmlns:wpc="http://schemas.microsoft.com/office/word/2010/wordprocessingCanvas" xmlns:wpg="http://schemas.microsoft.com/office/word/2010/wordprocessingGroup" xmlns:wpi="http://schemas.microsoft.com/office/word/2010/wordprocessingInk" xmlns:wps="http://schemas.microsoft.com/office/word/2010/wordprocessingShape" mc:Ignorable="w14 wp14">
+  <w:p>
+    <w:pPr>
+      <w:pStyle w:val="Header"/>
+    </w:pPr>
+  </w:p>
+</w:hdr>
+</file>
+
+<file path=word/header3.xml><?xml version="1.0" encoding="utf-8"?>
+<w:hdr xmlns:m="http://schemas.openxmlformats.org/officeDocument/2006/math" xmlns:mc="http://schemas.openxmlformats.org/markup-compatibility/2006" xmlns:mo="http://schemas.microsoft.com/office/mac/office/2008/main" xmlns:mv="urn:schemas-microsoft-com:mac:vml" xmlns:o="urn:schemas-microsoft-com:office:office" xmlns:r="http://schemas.openxmlformats.org/officeDocument/2006/relationships" xmlns:v="urn:schemas-microsoft-com:vml" xmlns:w10="urn:schemas-microsoft-com:office:word" xmlns:w14="http://schemas.microsoft.com/office/word/2010/wordml" xmlns:w="http://schemas.openxmlformats.org/wordprocessingml/2006/main" xmlns:wne="http://schemas.microsoft.com/office/word/2006/wordml" xmlns:wp14="http://schemas.microsoft.com/office/word/2010/wordprocessingDrawing" xmlns:wp="http://schemas.openxmlformats.org/drawingml/2006/wordprocessingDrawing" xmlns:wpc="http://schemas.microsoft.com/office/word/2010/wordprocessingCanvas" xmlns:wpg="http://schemas.microsoft.com/office/word/2010/wordprocessingGroup" xmlns:wpi="http://schemas.microsoft.com/office/word/2010/wordprocessingInk" xmlns:wps="http://schemas.microsoft.com/office/word/2010/wordprocessingShape" mc:Ignorable="w14 wp14">
+  <w:p>
+    <w:pPr>
+      <w:pStyle w:val="Header"/>
+    </w:pPr>
+  </w:p>
+</w:hdr>
+</file>
+
+<file path=word/header4.xml><?xml version="1.0" encoding="utf-8"?>
+<w:hdr xmlns:m="http://schemas.openxmlformats.org/officeDocument/2006/math" xmlns:mc="http://schemas.openxmlformats.org/markup-compatibility/2006" xmlns:mo="http://schemas.microsoft.com/office/mac/office/2008/main" xmlns:mv="urn:schemas-microsoft-com:mac:vml" xmlns:o="urn:schemas-microsoft-com:office:office" xmlns:r="http://schemas.openxmlformats.org/officeDocument/2006/relationships" xmlns:v="urn:schemas-microsoft-com:vml" xmlns:w10="urn:schemas-microsoft-com:office:word" xmlns:w14="http://schemas.microsoft.com/office/word/2010/wordml" xmlns:w="http://schemas.openxmlformats.org/wordprocessingml/2006/main" xmlns:wne="http://schemas.microsoft.com/office/word/2006/wordml" xmlns:wp14="http://schemas.microsoft.com/office/word/2010/wordprocessingDrawing" xmlns:wp="http://schemas.openxmlformats.org/drawingml/2006/wordprocessingDrawing" xmlns:wpc="http://schemas.microsoft.com/office/word/2010/wordprocessingCanvas" xmlns:wpg="http://schemas.microsoft.com/office/word/2010/wordprocessingGroup" xmlns:wpi="http://schemas.microsoft.com/office/word/2010/wordprocessingInk" xmlns:wps="http://schemas.microsoft.com/office/word/2010/wordprocessingShape" mc:Ignorable="w14 wp14">
+  <w:p>
+    <w:pPr>
+      <w:pStyle w:val="Header"/>
+      <w:keepNext w:val="0"/>
+      <w:pageBreakBefore w:val="0"/>
+      <w:widowControl/>
+      <w:spacing w:before="0" w:after="0" w:line="240" w:lineRule="auto"/>
+      <w:ind w:firstLine="0"/>
+      <w:jc w:val="center"/>
+    </w:pPr>
+    <w:r>
+      <w:drawing>
+        <wp:inline xmlns:a="http://schemas.openxmlformats.org/drawingml/2006/main" xmlns:pic="http://schemas.openxmlformats.org/drawingml/2006/picture">
+          <wp:extent cx="1982880" cy="486000"/>
+          <wp:docPr id="1" name="Picture 1"/>
+          <wp:cNvGraphicFramePr>
+            <a:graphicFrameLocks noChangeAspect="1"/>
+          </wp:cNvGraphicFramePr>
+          <a:graphic>
+            <a:graphicData uri="http://schemas.openxmlformats.org/drawingml/2006/picture">
+              <pic:pic>
+                <pic:nvPicPr>
+                  <pic:cNvPr id="0" name="pua_logo_official.png"/>
+                  <pic:cNvPicPr/>
+                </pic:nvPicPr>
+                <pic:blipFill>
+                  <a:blip r:embed="rId1"/>
+                  <a:stretch>
+                    <a:fillRect/>
+                  </a:stretch>
+                </pic:blipFill>
+                <pic:spPr>
+                  <a:xfrm>
+                    <a:off x="0" y="0"/>
+                    <a:ext cx="1982880" cy="486000"/>
+                  </a:xfrm>
+                  <a:prstGeom prst="rect"/>
+                </pic:spPr>
+              </pic:pic>
+            </a:graphicData>
+          </a:graphic>
+        </wp:inline>
+      </w:drawing>
+    </w:r>
+  </w:p>
+  <w:p>
+    <w:pPr>
+      <w:keepNext w:val="0"/>
+      <w:pageBreakBefore w:val="0"/>
+      <w:widowControl/>
+      <w:spacing w:before="20" w:after="0" w:line="240" w:lineRule="auto"/>
+      <w:ind w:firstLine="0"/>
+      <w:jc w:val="center"/>
+      <w:pBdr>
+        <w:bottom w:val="single" w:sz="8" w:space="3" w:color="1B3A6B"/>
+      </w:pBdr>
+    </w:pPr>
+    <w:r>
+      <w:rPr>
+        <w:rFonts w:ascii="Times New Roman" w:hAnsi="Times New Roman" w:eastAsia="Times New Roman"/>
+        <w:b w:val="0"/>
+        <w:i/>
+        <w:color w:val="000000"/>
+        <w:sz w:val="18"/>
+      </w:rPr>
+      <w:t>Faculty of Dentistry — Pharos University in Alexandria</w:t>
+    </w:r>
+  </w:p>
+</w:hdr>
+</file>
+
+<file path=word/header5.xml><?xml version="1.0" encoding="utf-8"?>
+<w:hdr xmlns:m="http://schemas.openxmlformats.org/officeDocument/2006/math" xmlns:mc="http://schemas.openxmlformats.org/markup-compatibility/2006" xmlns:mo="http://schemas.microsoft.com/office/mac/office/2008/main" xmlns:mv="urn:schemas-microsoft-com:mac:vml" xmlns:o="urn:schemas-microsoft-com:office:office" xmlns:r="http://schemas.openxmlformats.org/officeDocument/2006/relationships" xmlns:v="urn:schemas-microsoft-com:vml" xmlns:w10="urn:schemas-microsoft-com:office:word" xmlns:w14="http://schemas.microsoft.com/office/word/2010/wordml" xmlns:w="http://schemas.openxmlformats.org/wordprocessingml/2006/main" xmlns:wne="http://schemas.microsoft.com/office/word/2006/wordml" xmlns:wp14="http://schemas.microsoft.com/office/word/2010/wordprocessingDrawing" xmlns:wp="http://schemas.openxmlformats.org/drawingml/2006/wordprocessingDrawing" xmlns:wpc="http://schemas.microsoft.com/office/word/2010/wordprocessingCanvas" xmlns:wpg="http://schemas.microsoft.com/office/word/2010/wordprocessingGroup" xmlns:wpi="http://schemas.microsoft.com/office/word/2010/wordprocessingInk" xmlns:wps="http://schemas.microsoft.com/office/word/2010/wordprocessingShape" mc:Ignorable="w14 wp14">
+  <w:p>
+    <w:pPr>
+      <w:pStyle w:val="Header"/>
+      <w:keepNext w:val="0"/>
+      <w:pageBreakBefore w:val="0"/>
+      <w:widowControl/>
+      <w:spacing w:before="0" w:after="0" w:line="240" w:lineRule="auto"/>
+      <w:ind w:firstLine="0"/>
+      <w:jc w:val="center"/>
+    </w:pPr>
+    <w:r>
+      <w:drawing>
+        <wp:inline xmlns:a="http://schemas.openxmlformats.org/drawingml/2006/main" xmlns:pic="http://schemas.openxmlformats.org/drawingml/2006/picture">
+          <wp:extent cx="1982880" cy="486000"/>
+          <wp:docPr id="1" name="Picture 1"/>
+          <wp:cNvGraphicFramePr>
+            <a:graphicFrameLocks noChangeAspect="1"/>
+          </wp:cNvGraphicFramePr>
+          <a:graphic>
+            <a:graphicData uri="http://schemas.openxmlformats.org/drawingml/2006/picture">
+              <pic:pic>
+                <pic:nvPicPr>
+                  <pic:cNvPr id="0" name="pua_logo_official.png"/>
+                  <pic:cNvPicPr/>
+                </pic:nvPicPr>
+                <pic:blipFill>
+                  <a:blip r:embed="rId1"/>
+                  <a:stretch>
+                    <a:fillRect/>
+                  </a:stretch>
+                </pic:blipFill>
+                <pic:spPr>
+                  <a:xfrm>
+                    <a:off x="0" y="0"/>
+                    <a:ext cx="1982880" cy="486000"/>
+                  </a:xfrm>
+                  <a:prstGeom prst="rect"/>
+                </pic:spPr>
+              </pic:pic>
+            </a:graphicData>
+          </a:graphic>
+        </wp:inline>
+      </w:drawing>
+    </w:r>
+  </w:p>
+  <w:p>
+    <w:pPr>
+      <w:keepNext w:val="0"/>
+      <w:pageBreakBefore w:val="0"/>
+      <w:widowControl/>
+      <w:spacing w:before="20" w:after="0" w:line="240" w:lineRule="auto"/>
+      <w:ind w:firstLine="0"/>
+      <w:jc w:val="center"/>
+      <w:pBdr>
+        <w:bottom w:val="single" w:sz="8" w:space="3" w:color="1B3A6B"/>
+      </w:pBdr>
+    </w:pPr>
+    <w:r>
+      <w:rPr>
+        <w:rFonts w:ascii="Times New Roman" w:hAnsi="Times New Roman" w:eastAsia="Times New Roman"/>
+        <w:b w:val="0"/>
+        <w:i/>
+        <w:color w:val="000000"/>
+        <w:sz w:val="18"/>
+      </w:rPr>
+      <w:t>Faculty of Dentistry — Pharos University in Alexandria</w:t>
+    </w:r>
+  </w:p>
+</w:hdr>
+</file>
+
+<file path=word/header6.xml><?xml version="1.0" encoding="utf-8"?>
+<w:hdr xmlns:m="http://schemas.openxmlformats.org/officeDocument/2006/math" xmlns:mc="http://schemas.openxmlformats.org/markup-compatibility/2006" xmlns:mo="http://schemas.microsoft.com/office/mac/office/2008/main" xmlns:mv="urn:schemas-microsoft-com:mac:vml" xmlns:o="urn:schemas-microsoft-com:office:office" xmlns:r="http://schemas.openxmlformats.org/officeDocument/2006/relationships" xmlns:v="urn:schemas-microsoft-com:vml" xmlns:w10="urn:schemas-microsoft-com:office:word" xmlns:w14="http://schemas.microsoft.com/office/word/2010/wordml" xmlns:w="http://schemas.openxmlformats.org/wordprocessingml/2006/main" xmlns:wne="http://schemas.microsoft.com/office/word/2006/wordml" xmlns:wp14="http://schemas.microsoft.com/office/word/2010/wordprocessingDrawing" xmlns:wp="http://schemas.openxmlformats.org/drawingml/2006/wordprocessingDrawing" xmlns:wpc="http://schemas.microsoft.com/office/word/2010/wordprocessingCanvas" xmlns:wpg="http://schemas.microsoft.com/office/word/2010/wordprocessingGroup" xmlns:wpi="http://schemas.microsoft.com/office/word/2010/wordprocessingInk" xmlns:wps="http://schemas.microsoft.com/office/word/2010/wordprocessingShape" mc:Ignorable="w14 wp14">
+  <w:p>
+    <w:pPr>
+      <w:pStyle w:val="Header"/>
+      <w:keepNext w:val="0"/>
+      <w:pageBreakBefore w:val="0"/>
+      <w:widowControl/>
+      <w:spacing w:before="0" w:after="0" w:line="240" w:lineRule="auto"/>
+      <w:ind w:firstLine="0"/>
+      <w:jc w:val="center"/>
+    </w:pPr>
+    <w:r>
+      <w:drawing>
+        <wp:inline xmlns:a="http://schemas.openxmlformats.org/drawingml/2006/main" xmlns:pic="http://schemas.openxmlformats.org/drawingml/2006/picture">
+          <wp:extent cx="1982880" cy="486000"/>
+          <wp:docPr id="1" name="Picture 1"/>
+          <wp:cNvGraphicFramePr>
+            <a:graphicFrameLocks noChangeAspect="1"/>
+          </wp:cNvGraphicFramePr>
+          <a:graphic>
+            <a:graphicData uri="http://schemas.openxmlformats.org/drawingml/2006/picture">
+              <pic:pic>
+                <pic:nvPicPr>
+                  <pic:cNvPr id="0" name="pua_logo_official.png"/>
+                  <pic:cNvPicPr/>
+                </pic:nvPicPr>
+                <pic:blipFill>
+                  <a:blip r:embed="rId1"/>
+                  <a:stretch>
+                    <a:fillRect/>
+                  </a:stretch>
+                </pic:blipFill>
+                <pic:spPr>
+                  <a:xfrm>
+                    <a:off x="0" y="0"/>
+                    <a:ext cx="1982880" cy="486000"/>
+                  </a:xfrm>
+                  <a:prstGeom prst="rect"/>
+                </pic:spPr>
+              </pic:pic>
+            </a:graphicData>
+          </a:graphic>
+        </wp:inline>
+      </w:drawing>
+    </w:r>
+  </w:p>
+  <w:p>
+    <w:pPr>
+      <w:keepNext w:val="0"/>
+      <w:pageBreakBefore w:val="0"/>
+      <w:widowControl/>
+      <w:spacing w:before="20" w:after="0" w:line="240" w:lineRule="auto"/>
+      <w:ind w:firstLine="0"/>
+      <w:jc w:val="center"/>
+      <w:pBdr>
+        <w:bottom w:val="single" w:sz="8" w:space="3" w:color="1B3A6B"/>
+      </w:pBdr>
+    </w:pPr>
+    <w:r>
+      <w:rPr>
+        <w:rFonts w:ascii="Times New Roman" w:hAnsi="Times New Roman" w:eastAsia="Times New Roman"/>
+        <w:b w:val="0"/>
+        <w:i/>
+        <w:color w:val="000000"/>
+        <w:sz w:val="18"/>
+      </w:rPr>
+      <w:t>Faculty of Dentistry — Pharos University in Alexandria</w:t>
+    </w:r>
+  </w:p>
+</w:hdr>
+</file>
+
+<file path=word/header7.xml><?xml version="1.0" encoding="utf-8"?>
+<w:hdr xmlns:m="http://schemas.openxmlformats.org/officeDocument/2006/math" xmlns:mc="http://schemas.openxmlformats.org/markup-compatibility/2006" xmlns:mo="http://schemas.microsoft.com/office/mac/office/2008/main" xmlns:mv="urn:schemas-microsoft-com:mac:vml" xmlns:o="urn:schemas-microsoft-com:office:office" xmlns:r="http://schemas.openxmlformats.org/officeDocument/2006/relationships" xmlns:v="urn:schemas-microsoft-com:vml" xmlns:w10="urn:schemas-microsoft-com:office:word" xmlns:w14="http://schemas.microsoft.com/office/word/2010/wordml" xmlns:w="http://schemas.openxmlformats.org/wordprocessingml/2006/main" xmlns:wne="http://schemas.microsoft.com/office/word/2006/wordml" xmlns:wp14="http://schemas.microsoft.com/office/word/2010/wordprocessingDrawing" xmlns:wp="http://schemas.openxmlformats.org/drawingml/2006/wordprocessingDrawing" xmlns:wpc="http://schemas.microsoft.com/office/word/2010/wordprocessingCanvas" xmlns:wpg="http://schemas.microsoft.com/office/word/2010/wordprocessingGroup" xmlns:wpi="http://schemas.microsoft.com/office/word/2010/wordprocessingInk" xmlns:wps="http://schemas.microsoft.com/office/word/2010/wordprocessingShape" mc:Ignorable="w14 wp14">
+  <w:p>
+    <w:pPr>
+      <w:pStyle w:val="Header"/>
+      <w:keepNext w:val="0"/>
+      <w:pageBreakBefore w:val="0"/>
+      <w:widowControl/>
+      <w:spacing w:before="0" w:after="0" w:line="240" w:lineRule="auto"/>
+      <w:ind w:firstLine="0"/>
+      <w:jc w:val="center"/>
+    </w:pPr>
+    <w:r>
+      <w:drawing>
+        <wp:inline xmlns:a="http://schemas.openxmlformats.org/drawingml/2006/main" xmlns:pic="http://schemas.openxmlformats.org/drawingml/2006/picture">
+          <wp:extent cx="1982880" cy="486000"/>
+          <wp:docPr id="1" name="Picture 1"/>
+          <wp:cNvGraphicFramePr>
+            <a:graphicFrameLocks noChangeAspect="1"/>
+          </wp:cNvGraphicFramePr>
+          <a:graphic>
+            <a:graphicData uri="http://schemas.openxmlformats.org/drawingml/2006/picture">
+              <pic:pic>
+                <pic:nvPicPr>
+                  <pic:cNvPr id="0" name="pua_logo_official.png"/>
+                  <pic:cNvPicPr/>
+                </pic:nvPicPr>
+                <pic:blipFill>
+                  <a:blip r:embed="rId1"/>
+                  <a:stretch>
+                    <a:fillRect/>
+                  </a:stretch>
+                </pic:blipFill>
+                <pic:spPr>
+                  <a:xfrm>
+                    <a:off x="0" y="0"/>
+                    <a:ext cx="1982880" cy="486000"/>
+                  </a:xfrm>
+                  <a:prstGeom prst="rect"/>
+                </pic:spPr>
+              </pic:pic>
+            </a:graphicData>
+          </a:graphic>
+        </wp:inline>
+      </w:drawing>
+    </w:r>
+  </w:p>
+  <w:p>
+    <w:pPr>
+      <w:keepNext w:val="0"/>
+      <w:pageBreakBefore w:val="0"/>
+      <w:widowControl/>
+      <w:spacing w:before="20" w:after="0" w:line="240" w:lineRule="auto"/>
+      <w:ind w:firstLine="0"/>
+      <w:jc w:val="center"/>
+      <w:pBdr>
+        <w:bottom w:val="single" w:sz="8" w:space="3" w:color="1B3A6B"/>
+      </w:pBdr>
+    </w:pPr>
+    <w:r>
+      <w:rPr>
+        <w:rFonts w:ascii="Times New Roman" w:hAnsi="Times New Roman" w:eastAsia="Times New Roman"/>
+        <w:b w:val="0"/>
+        <w:i/>
+        <w:color w:val="000000"/>
+        <w:sz w:val="18"/>
+      </w:rPr>
+      <w:t>Faculty of Dentistry — Pharos University in Alexandria</w:t>
+    </w:r>
+  </w:p>
+</w:hdr>
+</file>
+
+<file path=word/header8.xml><?xml version="1.0" encoding="utf-8"?>
+<w:hdr xmlns:m="http://schemas.openxmlformats.org/officeDocument/2006/math" xmlns:mc="http://schemas.openxmlformats.org/markup-compatibility/2006" xmlns:mo="http://schemas.microsoft.com/office/mac/office/2008/main" xmlns:mv="urn:schemas-microsoft-com:mac:vml" xmlns:o="urn:schemas-microsoft-com:office:office" xmlns:r="http://schemas.openxmlformats.org/officeDocument/2006/relationships" xmlns:v="urn:schemas-microsoft-com:vml" xmlns:w10="urn:schemas-microsoft-com:office:word" xmlns:w14="http://schemas.microsoft.com/office/word/2010/wordml" xmlns:w="http://schemas.openxmlformats.org/wordprocessingml/2006/main" xmlns:wne="http://schemas.microsoft.com/office/word/2006/wordml" xmlns:wp14="http://schemas.microsoft.com/office/word/2010/wordprocessingDrawing" xmlns:wp="http://schemas.openxmlformats.org/drawingml/2006/wordprocessingDrawing" xmlns:wpc="http://schemas.microsoft.com/office/word/2010/wordprocessingCanvas" xmlns:wpg="http://schemas.microsoft.com/office/word/2010/wordprocessingGroup" xmlns:wpi="http://schemas.microsoft.com/office/word/2010/wordprocessingInk" xmlns:wps="http://schemas.microsoft.com/office/word/2010/wordprocessingShape" mc:Ignorable="w14 wp14">
+  <w:p>
+    <w:pPr>
+      <w:pStyle w:val="Header"/>
+      <w:keepNext w:val="0"/>
+      <w:pageBreakBefore w:val="0"/>
+      <w:widowControl/>
+      <w:spacing w:before="0" w:after="0" w:line="240" w:lineRule="auto"/>
+      <w:ind w:firstLine="0"/>
+      <w:jc w:val="center"/>
+    </w:pPr>
+    <w:r>
+      <w:drawing>
+        <wp:inline xmlns:a="http://schemas.openxmlformats.org/drawingml/2006/main" xmlns:pic="http://schemas.openxmlformats.org/drawingml/2006/picture">
+          <wp:extent cx="1982880" cy="486000"/>
+          <wp:docPr id="1" name="Picture 1"/>
+          <wp:cNvGraphicFramePr>
+            <a:graphicFrameLocks noChangeAspect="1"/>
+          </wp:cNvGraphicFramePr>
+          <a:graphic>
+            <a:graphicData uri="http://schemas.openxmlformats.org/drawingml/2006/picture">
+              <pic:pic>
+                <pic:nvPicPr>
+                  <pic:cNvPr id="0" name="pua_logo_official.png"/>
+                  <pic:cNvPicPr/>
+                </pic:nvPicPr>
+                <pic:blipFill>
+                  <a:blip r:embed="rId1"/>
+                  <a:stretch>
+                    <a:fillRect/>
+                  </a:stretch>
+                </pic:blipFill>
+                <pic:spPr>
+                  <a:xfrm>
+                    <a:off x="0" y="0"/>
+                    <a:ext cx="1982880" cy="486000"/>
+                  </a:xfrm>
+                  <a:prstGeom prst="rect"/>
+                </pic:spPr>
+              </pic:pic>
+            </a:graphicData>
+          </a:graphic>
+        </wp:inline>
+      </w:drawing>
+    </w:r>
+  </w:p>
+  <w:p>
+    <w:pPr>
+      <w:keepNext w:val="0"/>
+      <w:pageBreakBefore w:val="0"/>
+      <w:widowControl/>
+      <w:spacing w:before="20" w:after="0" w:line="240" w:lineRule="auto"/>
+      <w:ind w:firstLine="0"/>
+      <w:jc w:val="center"/>
+      <w:pBdr>
+        <w:bottom w:val="single" w:sz="8" w:space="3" w:color="1B3A6B"/>
+      </w:pBdr>
+    </w:pPr>
+    <w:r>
+      <w:rPr>
+        <w:rFonts w:ascii="Times New Roman" w:hAnsi="Times New Roman" w:eastAsia="Times New Roman"/>
+        <w:b w:val="0"/>
+        <w:i/>
+        <w:color w:val="000000"/>
+        <w:sz w:val="18"/>
+      </w:rPr>
+      <w:t>Faculty of Dentistry — Pharos University in Alexandria</w:t>
+    </w:r>
+  </w:p>
+</w:hdr>
+</file>
+
+<file path=word/header9.xml><?xml version="1.0" encoding="utf-8"?>
+<w:hdr xmlns:m="http://schemas.openxmlformats.org/officeDocument/2006/math" xmlns:mc="http://schemas.openxmlformats.org/markup-compatibility/2006" xmlns:mo="http://schemas.microsoft.com/office/mac/office/2008/main" xmlns:mv="urn:schemas-microsoft-com:mac:vml" xmlns:o="urn:schemas-microsoft-com:office:office" xmlns:r="http://schemas.openxmlformats.org/officeDocument/2006/relationships" xmlns:v="urn:schemas-microsoft-com:vml" xmlns:w10="urn:schemas-microsoft-com:office:word" xmlns:w14="http://schemas.microsoft.com/office/word/2010/wordml" xmlns:w="http://schemas.openxmlformats.org/wordprocessingml/2006/main" xmlns:wne="http://schemas.microsoft.com/office/word/2006/wordml" xmlns:wp14="http://schemas.microsoft.com/office/word/2010/wordprocessingDrawing" xmlns:wp="http://schemas.openxmlformats.org/drawingml/2006/wordprocessingDrawing" xmlns:wpc="http://schemas.microsoft.com/office/word/2010/wordprocessingCanvas" xmlns:wpg="http://schemas.microsoft.com/office/word/2010/wordprocessingGroup" xmlns:wpi="http://schemas.microsoft.com/office/word/2010/wordprocessingInk" xmlns:wps="http://schemas.microsoft.com/office/word/2010/wordprocessingShape" mc:Ignorable="w14 wp14">
+  <w:p>
+    <w:pPr>
+      <w:pStyle w:val="Header"/>
+      <w:keepNext w:val="0"/>
+      <w:pageBreakBefore w:val="0"/>
+      <w:widowControl/>
+      <w:spacing w:before="0" w:after="0" w:line="240" w:lineRule="auto"/>
+      <w:ind w:firstLine="0"/>
+      <w:jc w:val="center"/>
+    </w:pPr>
+    <w:r>
+      <w:drawing>
+        <wp:inline xmlns:a="http://schemas.openxmlformats.org/drawingml/2006/main" xmlns:pic="http://schemas.openxmlformats.org/drawingml/2006/picture">
+          <wp:extent cx="1982880" cy="486000"/>
+          <wp:docPr id="1" name="Picture 1"/>
+          <wp:cNvGraphicFramePr>
+            <a:graphicFrameLocks noChangeAspect="1"/>
+          </wp:cNvGraphicFramePr>
+          <a:graphic>
+            <a:graphicData uri="http://schemas.openxmlformats.org/drawingml/2006/picture">
+              <pic:pic>
+                <pic:nvPicPr>
+                  <pic:cNvPr id="0" name="pua_logo_official.png"/>
+                  <pic:cNvPicPr/>
+                </pic:nvPicPr>
+                <pic:blipFill>
+                  <a:blip r:embed="rId1"/>
+                  <a:stretch>
+                    <a:fillRect/>
+                  </a:stretch>
+                </pic:blipFill>
+                <pic:spPr>
+                  <a:xfrm>
+                    <a:off x="0" y="0"/>
+                    <a:ext cx="1982880" cy="486000"/>
+                  </a:xfrm>
+                  <a:prstGeom prst="rect"/>
+                </pic:spPr>
+              </pic:pic>
+            </a:graphicData>
+          </a:graphic>
+        </wp:inline>
+      </w:drawing>
+    </w:r>
+  </w:p>
+  <w:p>
+    <w:pPr>
+      <w:keepNext w:val="0"/>
+      <w:pageBreakBefore w:val="0"/>
+      <w:widowControl/>
+      <w:spacing w:before="20" w:after="0" w:line="240" w:lineRule="auto"/>
+      <w:ind w:firstLine="0"/>
+      <w:jc w:val="center"/>
+      <w:pBdr>
+        <w:bottom w:val="single" w:sz="8" w:space="3" w:color="1B3A6B"/>
+      </w:pBdr>
+    </w:pPr>
+    <w:r>
+      <w:rPr>
+        <w:rFonts w:ascii="Times New Roman" w:hAnsi="Times New Roman" w:eastAsia="Times New Roman"/>
+        <w:b w:val="0"/>
+        <w:i/>
+        <w:color w:val="000000"/>
+        <w:sz w:val="18"/>
+      </w:rPr>
+      <w:t>Faculty of Dentistry — Pharos University in Alexandria</w:t>
+    </w:r>
+  </w:p>
+</w:hdr>
 </file>
 
 <file path=word/numbering.xml><?xml version="1.0" encoding="utf-8"?>

</xml_diff>